<commit_message>
Address BMJ editorial checks: name guarantor, add [dataset] prefix to Reference 9, and remove embedded figures
</commit_message>
<xml_diff>
--- a/manuscript/Manuscript_Marked.docx
+++ b/manuscript/Manuscript_Marked.docx
@@ -64,25 +64,7 @@
           <w:b/>
           <w:color w:val="000000"/>
         </w:rPr>
-        <w:t xml:space="preserve">, Mst. </w:t>
-      </w:r>
-      <w:proofErr w:type="spellStart"/>
-      <w:r>
-        <w:rPr>
-          <w:rFonts w:ascii="Times New Roman" w:hAnsi="Times New Roman" w:cs="Times New Roman"/>
-          <w:b/>
-          <w:color w:val="000000"/>
-        </w:rPr>
-        <w:t>Jakia</w:t>
-      </w:r>
-      <w:proofErr w:type="spellEnd"/>
-      <w:r>
-        <w:rPr>
-          <w:rFonts w:ascii="Times New Roman" w:hAnsi="Times New Roman" w:cs="Times New Roman"/>
-          <w:b/>
-          <w:color w:val="000000"/>
-        </w:rPr>
-        <w:t xml:space="preserve"> Afrin</w:t>
+        <w:t>, Mst. Jakia Afrin</w:t>
       </w:r>
       <w:r>
         <w:rPr>
@@ -116,25 +98,7 @@
           <w:b/>
           <w:color w:val="000000"/>
         </w:rPr>
-        <w:t xml:space="preserve">, Md. </w:t>
-      </w:r>
-      <w:proofErr w:type="spellStart"/>
-      <w:r>
-        <w:rPr>
-          <w:rFonts w:ascii="Times New Roman" w:hAnsi="Times New Roman" w:cs="Times New Roman"/>
-          <w:b/>
-          <w:color w:val="000000"/>
-        </w:rPr>
-        <w:t>Lotifur</w:t>
-      </w:r>
-      <w:proofErr w:type="spellEnd"/>
-      <w:r>
-        <w:rPr>
-          <w:rFonts w:ascii="Times New Roman" w:hAnsi="Times New Roman" w:cs="Times New Roman"/>
-          <w:b/>
-          <w:color w:val="000000"/>
-        </w:rPr>
-        <w:t xml:space="preserve"> Rohman</w:t>
+        <w:t>, Md. Lotifur Rohman</w:t>
       </w:r>
       <w:r>
         <w:rPr>
@@ -151,25 +115,7 @@
           <w:b/>
           <w:color w:val="000000"/>
         </w:rPr>
-        <w:t xml:space="preserve">, Md. </w:t>
-      </w:r>
-      <w:proofErr w:type="spellStart"/>
-      <w:r>
-        <w:rPr>
-          <w:rFonts w:ascii="Times New Roman" w:hAnsi="Times New Roman" w:cs="Times New Roman"/>
-          <w:b/>
-          <w:color w:val="000000"/>
-        </w:rPr>
-        <w:t>Mahamudul</w:t>
-      </w:r>
-      <w:proofErr w:type="spellEnd"/>
-      <w:r>
-        <w:rPr>
-          <w:rFonts w:ascii="Times New Roman" w:hAnsi="Times New Roman" w:cs="Times New Roman"/>
-          <w:b/>
-          <w:color w:val="000000"/>
-        </w:rPr>
-        <w:t xml:space="preserve"> Islam</w:t>
+        <w:t>, Md. Mahamudul Islam</w:t>
       </w:r>
       <w:r>
         <w:rPr>
@@ -186,25 +132,7 @@
           <w:b/>
           <w:color w:val="000000"/>
         </w:rPr>
-        <w:t xml:space="preserve">, </w:t>
-      </w:r>
-      <w:proofErr w:type="spellStart"/>
-      <w:r>
-        <w:rPr>
-          <w:rFonts w:ascii="Times New Roman" w:hAnsi="Times New Roman" w:cs="Times New Roman"/>
-          <w:b/>
-          <w:color w:val="000000"/>
-        </w:rPr>
-        <w:t>Sheli</w:t>
-      </w:r>
-      <w:proofErr w:type="spellEnd"/>
-      <w:r>
-        <w:rPr>
-          <w:rFonts w:ascii="Times New Roman" w:hAnsi="Times New Roman" w:cs="Times New Roman"/>
-          <w:b/>
-          <w:color w:val="000000"/>
-        </w:rPr>
-        <w:t xml:space="preserve"> Shikdar</w:t>
+        <w:t>, Sheli Shikdar</w:t>
       </w:r>
       <w:r>
         <w:rPr>
@@ -297,39 +225,7 @@
           <w:rFonts w:ascii="Times New Roman" w:hAnsi="Times New Roman" w:cs="Times New Roman"/>
           <w:color w:val="002060"/>
         </w:rPr>
-        <w:t xml:space="preserve">Methods: We </w:t>
-      </w:r>
-      <w:proofErr w:type="spellStart"/>
-      <w:r>
-        <w:rPr>
-          <w:rFonts w:ascii="Times New Roman" w:hAnsi="Times New Roman" w:cs="Times New Roman"/>
-          <w:color w:val="002060"/>
-        </w:rPr>
-        <w:t>analyzed</w:t>
-      </w:r>
-      <w:proofErr w:type="spellEnd"/>
-      <w:r>
-        <w:rPr>
-          <w:rFonts w:ascii="Times New Roman" w:hAnsi="Times New Roman" w:cs="Times New Roman"/>
-          <w:color w:val="002060"/>
-        </w:rPr>
-        <w:t xml:space="preserve"> cross-sectional data from 4,087 children aged 0–59 months nested within 3,474 households across 670 community clusters. </w:t>
-      </w:r>
-      <w:proofErr w:type="gramStart"/>
-      <w:r>
-        <w:rPr>
-          <w:rFonts w:ascii="Times New Roman" w:hAnsi="Times New Roman" w:cs="Times New Roman"/>
-          <w:color w:val="002060"/>
-        </w:rPr>
-        <w:t>Nutritional status was defined by WHO Child Growth Standards</w:t>
-      </w:r>
-      <w:proofErr w:type="gramEnd"/>
-      <w:r>
-        <w:rPr>
-          <w:rFonts w:ascii="Times New Roman" w:hAnsi="Times New Roman" w:cs="Times New Roman"/>
-          <w:color w:val="002060"/>
-        </w:rPr>
-        <w:t>. Two-level random-intercept logistic regression models estimated adjusted odds ratios (AORs) and 95% confidence intervals (CIs) while accounting for community clustering.</w:t>
+        <w:t>Methods: We analyzed cross-sectional data from 4,087 children aged 0–59 months nested within 3,474 households across 670 community clusters. Nutritional status was defined by WHO Child Growth Standards. Two-level random-intercept logistic regression models estimated adjusted odds ratios (AORs) and 95% confidence intervals (CIs) while accounting for community clustering.</w:t>
       </w:r>
     </w:p>
     <w:p>
@@ -345,23 +241,7 @@
           <w:rFonts w:ascii="Times New Roman" w:hAnsi="Times New Roman" w:cs="Times New Roman"/>
           <w:color w:val="002060"/>
         </w:rPr>
-        <w:t xml:space="preserve">Results: Survey-weighted national prevalence of stunting, wasting, and underweight was 23.28% (95% CI: 21.98–24.57), 11.16% (95% CI: 10.20–12.13), and 22.19% (95% CI: 20.92–23.46), respectively. Compared with infants (0–11 months), children aged 12–23 months had over twofold higher odds of stunting (AOR: 2.38; 95% CI: 1.85–3.06) and elevated underweight odds (AOR: 1.60; 95% CI: 1.23–2.07), but age was </w:t>
-      </w:r>
-      <w:proofErr w:type="spellStart"/>
-      <w:r>
-        <w:rPr>
-          <w:rFonts w:ascii="Times New Roman" w:hAnsi="Times New Roman" w:cs="Times New Roman"/>
-          <w:color w:val="002060"/>
-        </w:rPr>
-        <w:t>unassociated</w:t>
-      </w:r>
-      <w:proofErr w:type="spellEnd"/>
-      <w:r>
-        <w:rPr>
-          <w:rFonts w:ascii="Times New Roman" w:hAnsi="Times New Roman" w:cs="Times New Roman"/>
-          <w:color w:val="002060"/>
-        </w:rPr>
-        <w:t xml:space="preserve"> with wasting. Maternal higher education was strongly protective across all outcomes, reducing stunting (AOR: 0.38; 95% CI: 0.26–0.56) and underweight (AOR: 0.37; 95% CI: 0.25–0.53). Household wealth was protective against stunting (rich AOR: 0.64; 95% CI: 0.46–0.89) and underweight (rich AOR: 0.66; 95% CI: 0.47–0.93). High parity (≥4 births) was associated with wasting (AOR: 3.27; 95% CI: 0.91–11.70). Significant community clustering was observed for stunting (ICC: 1.19%, MOR: 1.21; p &lt; 0.001) and underweight (ICC: 1.09%, MOR: 1.20; p &lt; 0.001), but was negligible for wasting (ICC: 0%).</w:t>
+        <w:t>Results: Survey-weighted national prevalence of stunting, wasting, and underweight was 23.28% (95% CI: 21.98–24.57), 11.16% (95% CI: 10.20–12.13), and 22.19% (95% CI: 20.92–23.46), respectively. Compared with infants (0–11 months), children aged 12–23 months had over twofold higher odds of stunting (AOR: 2.38; 95% CI: 1.85–3.06) and elevated underweight odds (AOR: 1.60; 95% CI: 1.23–2.07), but age was unassociated with wasting. Maternal higher education was strongly protective across all outcomes, reducing stunting (AOR: 0.38; 95% CI: 0.26–0.56) and underweight (AOR: 0.37; 95% CI: 0.25–0.53). Household wealth was protective against stunting (rich AOR: 0.64; 95% CI: 0.46–0.89) and underweight (rich AOR: 0.66; 95% CI: 0.47–0.93). High parity (≥4 births) was associated with wasting (AOR: 3.27; 95% CI: 0.91–11.70). Significant community clustering was observed for stunting (ICC: 1.19%, MOR: 1.21; p &lt; 0.001) and underweight (ICC: 1.09%, MOR: 1.20; p &lt; 0.001), but was negligible for wasting (ICC: 0%).</w:t>
       </w:r>
     </w:p>
     <w:p>
@@ -377,23 +257,7 @@
           <w:rFonts w:ascii="Times New Roman" w:hAnsi="Times New Roman" w:cs="Times New Roman"/>
           <w:color w:val="002060"/>
         </w:rPr>
-        <w:t xml:space="preserve">Conclusions: Chronic stunting and underweight operate through cumulative deprivations—including weaning transitions (12–23 months), maternal education, wealth, and community disparities. Conversely, </w:t>
-      </w:r>
-      <w:proofErr w:type="gramStart"/>
-      <w:r>
-        <w:rPr>
-          <w:rFonts w:ascii="Times New Roman" w:hAnsi="Times New Roman" w:cs="Times New Roman"/>
-          <w:color w:val="002060"/>
-        </w:rPr>
-        <w:t>acute wasting is driven by proximal maternal and household pressures</w:t>
-      </w:r>
-      <w:proofErr w:type="gramEnd"/>
-      <w:r>
-        <w:rPr>
-          <w:rFonts w:ascii="Times New Roman" w:hAnsi="Times New Roman" w:cs="Times New Roman"/>
-          <w:color w:val="002060"/>
-        </w:rPr>
-        <w:t>. Interventions must integrate infant feeding support during the first 1,000 days with investments in female education and poverty reduction.</w:t>
+        <w:t>Conclusions: Chronic stunting and underweight operate through cumulative deprivations—including weaning transitions (12–23 months), maternal education, wealth, and community disparities. Conversely, acute wasting is driven by proximal maternal and household pressures. Interventions must integrate infant feeding support during the first 1,000 days with investments in female education and poverty reduction.</w:t>
       </w:r>
     </w:p>
     <w:p>
@@ -418,23 +282,7 @@
           <w:rFonts w:ascii="Times New Roman" w:hAnsi="Times New Roman" w:cs="Times New Roman"/>
           <w:color w:val="000000"/>
         </w:rPr>
-        <w:t xml:space="preserve">Keywords: Child undernutrition; </w:t>
-      </w:r>
-      <w:proofErr w:type="gramStart"/>
-      <w:r>
-        <w:rPr>
-          <w:rFonts w:ascii="Times New Roman" w:hAnsi="Times New Roman" w:cs="Times New Roman"/>
-          <w:color w:val="000000"/>
-        </w:rPr>
-        <w:t>Multilevel</w:t>
-      </w:r>
-      <w:proofErr w:type="gramEnd"/>
-      <w:r>
-        <w:rPr>
-          <w:rFonts w:ascii="Times New Roman" w:hAnsi="Times New Roman" w:cs="Times New Roman"/>
-          <w:color w:val="000000"/>
-        </w:rPr>
-        <w:t xml:space="preserve"> analysis; Regional disparity; Maternal education; Socioeconomic inequality; Bangladesh.</w:t>
+        <w:t>Keywords: Child undernutrition; Multilevel analysis; Regional disparity; Maternal education; Socioeconomic inequality; Bangladesh.</w:t>
       </w:r>
     </w:p>
     <w:p>
@@ -483,19 +331,8 @@
           <w:color w:val="002060"/>
           <w:lang w:val="en-US"/>
         </w:rPr>
-        <w:t xml:space="preserve">What is already known on this </w:t>
+        <w:t>What is already known on this topic</w:t>
       </w:r>
-      <w:proofErr w:type="gramStart"/>
-      <w:r>
-        <w:rPr>
-          <w:rFonts w:ascii="Times New Roman" w:hAnsi="Times New Roman" w:cs="Times New Roman"/>
-          <w:b/>
-          <w:color w:val="002060"/>
-          <w:lang w:val="en-US"/>
-        </w:rPr>
-        <w:t>topic</w:t>
-      </w:r>
-      <w:proofErr w:type="gramEnd"/>
     </w:p>
     <w:p>
       <w:pPr>
@@ -576,39 +413,7 @@
           <w:rFonts w:ascii="Times New Roman" w:hAnsi="Times New Roman" w:cs="Times New Roman"/>
           <w:color w:val="002060"/>
         </w:rPr>
-        <w:t xml:space="preserve">Using BDHS 2022 data with two-level hierarchical </w:t>
-      </w:r>
-      <w:proofErr w:type="spellStart"/>
-      <w:r>
-        <w:rPr>
-          <w:rFonts w:ascii="Times New Roman" w:hAnsi="Times New Roman" w:cs="Times New Roman"/>
-          <w:color w:val="002060"/>
-        </w:rPr>
-        <w:t>modeling</w:t>
-      </w:r>
-      <w:proofErr w:type="spellEnd"/>
-      <w:r>
-        <w:rPr>
-          <w:rFonts w:ascii="Times New Roman" w:hAnsi="Times New Roman" w:cs="Times New Roman"/>
-          <w:color w:val="002060"/>
-        </w:rPr>
-        <w:t xml:space="preserve">, we demonstrate that chronic stunting surges during the 12–23 month weaning window (AOR: 2.38) and is shaped by significant community contextual clustering, whereas acute wasting is </w:t>
-      </w:r>
-      <w:proofErr w:type="spellStart"/>
-      <w:r>
-        <w:rPr>
-          <w:rFonts w:ascii="Times New Roman" w:hAnsi="Times New Roman" w:cs="Times New Roman"/>
-          <w:color w:val="002060"/>
-        </w:rPr>
-        <w:t>unassociated</w:t>
-      </w:r>
-      <w:proofErr w:type="spellEnd"/>
-      <w:r>
-        <w:rPr>
-          <w:rFonts w:ascii="Times New Roman" w:hAnsi="Times New Roman" w:cs="Times New Roman"/>
-          <w:color w:val="002060"/>
-        </w:rPr>
-        <w:t xml:space="preserve"> with age and operates primarily through immediate maternal parity and household conditions without community clustering.</w:t>
+        <w:t>Using BDHS 2022 data with two-level hierarchical modeling, we demonstrate that chronic stunting surges during the 12–23 month weaning window (AOR: 2.38) and is shaped by significant community contextual clustering, whereas acute wasting is unassociated with age and operates primarily through immediate maternal parity and household conditions without community clustering.</w:t>
       </w:r>
     </w:p>
     <w:p>
@@ -671,23 +476,7 @@
           <w:rFonts w:ascii="Times New Roman" w:hAnsi="Times New Roman" w:cs="Times New Roman"/>
           <w:color w:val="002060"/>
         </w:rPr>
-        <w:t xml:space="preserve">Policy interventions must pair nutrition-specific infant feeding support during the first 1,000 days with broader nutrition-sensitive investments in female education, poverty reduction, and geographically targeted community healthcare in high-burden divisions such as </w:t>
-      </w:r>
-      <w:proofErr w:type="spellStart"/>
-      <w:r>
-        <w:rPr>
-          <w:rFonts w:ascii="Times New Roman" w:hAnsi="Times New Roman" w:cs="Times New Roman"/>
-          <w:color w:val="002060"/>
-        </w:rPr>
-        <w:t>Mymensingh</w:t>
-      </w:r>
-      <w:proofErr w:type="spellEnd"/>
-      <w:r>
-        <w:rPr>
-          <w:rFonts w:ascii="Times New Roman" w:hAnsi="Times New Roman" w:cs="Times New Roman"/>
-          <w:color w:val="002060"/>
-        </w:rPr>
-        <w:t>.</w:t>
+        <w:t>Policy interventions must pair nutrition-specific infant feeding support during the first 1,000 days with broader nutrition-sensitive investments in female education, poverty reduction, and geographically targeted community healthcare in high-burden divisions such as Mymensingh.</w:t>
       </w:r>
     </w:p>
     <w:p>
@@ -729,23 +518,7 @@
           <w:rFonts w:ascii="Times New Roman" w:hAnsi="Times New Roman" w:cs="Times New Roman"/>
           <w:color w:val="002060"/>
         </w:rPr>
-        <w:t>Child undernutrition remains one of the most persistent public health and developmental challenges globally, disproportionately affecting low- and middle-income countries (LMICs). Despite substantial progress in child survival and healthcare coverage over recent decades, undernutrition continues to contribute significantly to childhood morbidity, mortality, impaired cognitive development, poor educational attainment, and reduced economic productivity across the life course [1]. According to joint estimates published by the World Health Organization (WHO), the United Nations Children’s Fund (UNICEF), and the World Bank Group, approximately 149.2 million children under five years of age were stunted and 45.4 million were wasted globally in 2024, highlighting the continuing burden of nutritional deprivation among vulnerable populations [1</w:t>
-      </w:r>
-      <w:proofErr w:type="gramStart"/>
-      <w:r>
-        <w:rPr>
-          <w:rFonts w:ascii="Times New Roman" w:hAnsi="Times New Roman" w:cs="Times New Roman"/>
-          <w:color w:val="002060"/>
-        </w:rPr>
-        <w:t>,2</w:t>
-      </w:r>
-      <w:proofErr w:type="gramEnd"/>
-      <w:r>
-        <w:rPr>
-          <w:rFonts w:ascii="Times New Roman" w:hAnsi="Times New Roman" w:cs="Times New Roman"/>
-          <w:color w:val="002060"/>
-        </w:rPr>
-        <w:t>]. Childhood undernutrition, therefore, remains central to achieving Sustainable Development Goal (SDG) 2.2, which aims to end all forms of malnutrition by 2030, as well as SDG 3, which focuses on ensuring healthy lives and promoting well-being for all ages [3,4].</w:t>
+        <w:t>Child undernutrition remains one of the most persistent public health and developmental challenges globally, disproportionately affecting low- and middle-income countries (LMICs). Despite substantial progress in child survival and healthcare coverage over recent decades, undernutrition continues to contribute significantly to childhood morbidity, mortality, impaired cognitive development, poor educational attainment, and reduced economic productivity across the life course [1]. According to joint estimates published by the World Health Organization (WHO), the United Nations Children’s Fund (UNICEF), and the World Bank Group, approximately 149.2 million children under five years of age were stunted and 45.4 million were wasted globally in 2024, highlighting the continuing burden of nutritional deprivation among vulnerable populations [1,2]. Childhood undernutrition, therefore, remains central to achieving Sustainable Development Goal (SDG) 2.2, which aims to end all forms of malnutrition by 2030, as well as SDG 3, which focuses on ensuring healthy lives and promoting well-being for all ages [3,4].</w:t>
       </w:r>
     </w:p>
     <w:p>
@@ -769,23 +542,7 @@
           <w:color w:val="002060"/>
         </w:rPr>
         <w:lastRenderedPageBreak/>
-        <w:t>for-age Z-score &lt; −2 standard deviations) [5</w:t>
-      </w:r>
-      <w:proofErr w:type="gramStart"/>
-      <w:r>
-        <w:rPr>
-          <w:rFonts w:ascii="Times New Roman" w:hAnsi="Times New Roman" w:cs="Times New Roman"/>
-          <w:color w:val="002060"/>
-        </w:rPr>
-        <w:t>,6</w:t>
-      </w:r>
-      <w:proofErr w:type="gramEnd"/>
-      <w:r>
-        <w:rPr>
-          <w:rFonts w:ascii="Times New Roman" w:hAnsi="Times New Roman" w:cs="Times New Roman"/>
-          <w:color w:val="002060"/>
-        </w:rPr>
-        <w:t xml:space="preserve">]. </w:t>
+        <w:t xml:space="preserve">for-age Z-score &lt; −2 standard deviations) [5,6]. </w:t>
       </w:r>
       <w:r>
         <w:rPr>
@@ -815,80 +572,7 @@
           <w:rFonts w:ascii="Times New Roman" w:hAnsi="Times New Roman" w:cs="Times New Roman"/>
           <w:color w:val="002060"/>
         </w:rPr>
-        <w:t>Bangladesh has achieved notable improvements in maternal and child health over the past three decades through expanded immunization and primary healthcare delivery [8]. Successive Bangladesh Demographic and Health Surveys (BDHS) from 1996–97 to 2022 demonstrate substantial reductions in chronic undernutrition: stunting declined from 60% to 24%, and underweight decreased from 52% to 22% (Figure 1) [9]. In contrast, acute wasting showed smaller fluctuations and remained relatively persistent, decreasing from 21% in 1996–97 to 11% in 2022 after hovering near 20% in 1999–2000 [9]. According to BDHS 2022, approximately one-quarter of Bangladeshi children under five remain stunted, and nutritional deficits remain concentrated among socioeconomically disadvantaged groups [8</w:t>
-      </w:r>
-      <w:proofErr w:type="gramStart"/>
-      <w:r>
-        <w:rPr>
-          <w:rFonts w:ascii="Times New Roman" w:hAnsi="Times New Roman" w:cs="Times New Roman"/>
-          <w:color w:val="002060"/>
-        </w:rPr>
-        <w:t>,9</w:t>
-      </w:r>
-      <w:proofErr w:type="gramEnd"/>
-      <w:r>
-        <w:rPr>
-          <w:rFonts w:ascii="Times New Roman" w:hAnsi="Times New Roman" w:cs="Times New Roman"/>
-          <w:color w:val="002060"/>
-        </w:rPr>
-        <w:t>]. This persistent burden of wasting alongside enduring regional disparities highlights that nutritional inequality remains a critical public health concern in Bangladesh [10–14].</w:t>
-      </w:r>
-    </w:p>
-    <w:p>
-      <w:pPr>
-        <w:spacing w:after="0"/>
-        <w:jc w:val="center"/>
-        <w:rPr>
-          <w:rFonts w:ascii="Times New Roman" w:hAnsi="Times New Roman" w:cs="Times New Roman"/>
-        </w:rPr>
-      </w:pPr>
-      <w:r>
-        <w:rPr>
-          <w:rFonts w:ascii="Times New Roman" w:hAnsi="Times New Roman" w:cs="Times New Roman"/>
-          <w:noProof/>
-          <w:lang w:val="en-US"/>
-        </w:rPr>
-        <w:drawing>
-          <wp:inline distT="0" distB="0" distL="0" distR="0">
-            <wp:extent cx="4264660" cy="2644032"/>
-            <wp:effectExtent l="0" t="0" r="2540" b="4445"/>
-            <wp:docPr id="8" name="Picture 8"/>
-            <wp:cNvGraphicFramePr>
-              <a:graphicFrameLocks xmlns:a="http://schemas.openxmlformats.org/drawingml/2006/main" noChangeAspect="1"/>
-            </wp:cNvGraphicFramePr>
-            <a:graphic xmlns:a="http://schemas.openxmlformats.org/drawingml/2006/main">
-              <a:graphicData uri="http://schemas.openxmlformats.org/drawingml/2006/picture">
-                <pic:pic xmlns:pic="http://schemas.openxmlformats.org/drawingml/2006/picture">
-                  <pic:nvPicPr>
-                    <pic:cNvPr id="8" name="Figure_1_Trend_Undernutrition_BDHS_LinePlot_n.png"/>
-                    <pic:cNvPicPr/>
-                  </pic:nvPicPr>
-                  <pic:blipFill>
-                    <a:blip r:embed="rId6" cstate="print">
-                      <a:extLst>
-                        <a:ext uri="{28A0092B-C50C-407E-A947-70E740481C1C}">
-                          <a14:useLocalDpi xmlns:a14="http://schemas.microsoft.com/office/drawing/2010/main" val="0"/>
-                        </a:ext>
-                      </a:extLst>
-                    </a:blip>
-                    <a:stretch>
-                      <a:fillRect/>
-                    </a:stretch>
-                  </pic:blipFill>
-                  <pic:spPr>
-                    <a:xfrm>
-                      <a:off x="0" y="0"/>
-                      <a:ext cx="4267201" cy="2645607"/>
-                    </a:xfrm>
-                    <a:prstGeom prst="rect">
-                      <a:avLst/>
-                    </a:prstGeom>
-                  </pic:spPr>
-                </pic:pic>
-              </a:graphicData>
-            </a:graphic>
-          </wp:inline>
-        </w:drawing>
+        <w:t>Bangladesh has achieved notable improvements in maternal and child health over the past three decades through expanded immunization and primary healthcare delivery [8]. Successive Bangladesh Demographic and Health Surveys (BDHS) from 1996–97 to 2022 demonstrate substantial reductions in chronic undernutrition: stunting declined from 60% to 24%, and underweight decreased from 52% to 22% (Figure 1) [9]. In contrast, acute wasting showed smaller fluctuations and remained relatively persistent, decreasing from 21% in 1996–97 to 11% in 2022 after hovering near 20% in 1999–2000 [9]. According to BDHS 2022, approximately one-quarter of Bangladeshi children under five remain stunted, and nutritional deficits remain concentrated among socioeconomically disadvantaged groups [8,9]. This persistent burden of wasting alongside enduring regional disparities highlights that nutritional inequality remains a critical public health concern in Bangladesh [10–14].</w:t>
       </w:r>
     </w:p>
     <w:p>
@@ -925,46 +609,14 @@
           <w:color w:val="000000"/>
         </w:rPr>
         <w:lastRenderedPageBreak/>
-        <w:t>Maternal education has emerged as one of the most consistent predictors of improved child nutritional outcomes in LMICs [10</w:t>
-      </w:r>
-      <w:proofErr w:type="gramStart"/>
-      <w:r>
-        <w:rPr>
-          <w:rFonts w:ascii="Times New Roman" w:hAnsi="Times New Roman" w:cs="Times New Roman"/>
-          <w:color w:val="000000"/>
-        </w:rPr>
-        <w:t>,12,14</w:t>
-      </w:r>
-      <w:proofErr w:type="gramEnd"/>
-      <w:r>
-        <w:rPr>
-          <w:rFonts w:ascii="Times New Roman" w:hAnsi="Times New Roman" w:cs="Times New Roman"/>
-          <w:color w:val="000000"/>
-        </w:rPr>
-        <w:t xml:space="preserve">]. </w:t>
+        <w:t xml:space="preserve">Maternal education has emerged as one of the most consistent predictors of improved child nutritional outcomes in LMICs [10,12,14]. </w:t>
       </w:r>
       <w:r>
         <w:rPr>
           <w:rFonts w:ascii="Times New Roman" w:hAnsi="Times New Roman" w:cs="Times New Roman"/>
           <w:color w:val="002060"/>
         </w:rPr>
-        <w:t>Educated mothers are generally more likely to adopt appropriate infant feeding practices, utilize healthcare services, maintain hygienic household environments, and recognize early signs of childhood illness [15]. Similarly, household socioeconomic resources influence dietary adequacy, access to healthcare, and living conditions, collectively shaping child health and nutrition [11</w:t>
-      </w:r>
-      <w:proofErr w:type="gramStart"/>
-      <w:r>
-        <w:rPr>
-          <w:rFonts w:ascii="Times New Roman" w:hAnsi="Times New Roman" w:cs="Times New Roman"/>
-          <w:color w:val="002060"/>
-        </w:rPr>
-        <w:t>,16,17</w:t>
-      </w:r>
-      <w:proofErr w:type="gramEnd"/>
-      <w:r>
-        <w:rPr>
-          <w:rFonts w:ascii="Times New Roman" w:hAnsi="Times New Roman" w:cs="Times New Roman"/>
-          <w:color w:val="002060"/>
-        </w:rPr>
-        <w:t xml:space="preserve">]. </w:t>
+        <w:t xml:space="preserve">Educated mothers are generally more likely to adopt appropriate infant feeding practices, utilize healthcare services, maintain hygienic household environments, and recognize early signs of childhood illness [15]. Similarly, household socioeconomic resources influence dietary adequacy, access to healthcare, and living conditions, collectively shaping child health and nutrition [11,16,17]. </w:t>
       </w:r>
       <w:r>
         <w:rPr>
@@ -989,110 +641,14 @@
           <w:rFonts w:ascii="Times New Roman" w:hAnsi="Times New Roman" w:cs="Times New Roman"/>
           <w:color w:val="000000"/>
         </w:rPr>
-        <w:t xml:space="preserve">Importantly, childhood undernutrition </w:t>
-      </w:r>
-      <w:proofErr w:type="gramStart"/>
-      <w:r>
-        <w:rPr>
-          <w:rFonts w:ascii="Times New Roman" w:hAnsi="Times New Roman" w:cs="Times New Roman"/>
-          <w:color w:val="000000"/>
-        </w:rPr>
-        <w:t>is not determined</w:t>
-      </w:r>
-      <w:proofErr w:type="gramEnd"/>
-      <w:r>
-        <w:rPr>
-          <w:rFonts w:ascii="Times New Roman" w:hAnsi="Times New Roman" w:cs="Times New Roman"/>
-          <w:color w:val="000000"/>
-        </w:rPr>
-        <w:t xml:space="preserve"> solely by individual or household characteristics but also by contextual and community-level influences. Demographic and Health Survey (DHS) data possess an inherently hierarchical structure in which children </w:t>
-      </w:r>
-      <w:proofErr w:type="gramStart"/>
-      <w:r>
-        <w:rPr>
-          <w:rFonts w:ascii="Times New Roman" w:hAnsi="Times New Roman" w:cs="Times New Roman"/>
-          <w:color w:val="000000"/>
-        </w:rPr>
-        <w:t>are nested</w:t>
-      </w:r>
-      <w:proofErr w:type="gramEnd"/>
-      <w:r>
-        <w:rPr>
-          <w:rFonts w:ascii="Times New Roman" w:hAnsi="Times New Roman" w:cs="Times New Roman"/>
-          <w:color w:val="000000"/>
-        </w:rPr>
-        <w:t xml:space="preserve"> within households, and households are nested within communities or clusters [18]. </w:t>
+        <w:t xml:space="preserve">Importantly, childhood undernutrition is not determined solely by individual or household characteristics but also by contextual and community-level influences. Demographic and Health Survey (DHS) data possess an inherently hierarchical structure in which children are nested within households, and households are nested within communities or clusters [18]. </w:t>
       </w:r>
       <w:r>
         <w:rPr>
           <w:rFonts w:ascii="Times New Roman" w:hAnsi="Times New Roman" w:cs="Times New Roman"/>
           <w:color w:val="002060"/>
         </w:rPr>
-        <w:t>Conventional single-level regression approaches may therefore underestimate standard errors and fail to adequately account for contextual heterogeneity [18</w:t>
-      </w:r>
-      <w:proofErr w:type="gramStart"/>
-      <w:r>
-        <w:rPr>
-          <w:rFonts w:ascii="Times New Roman" w:hAnsi="Times New Roman" w:cs="Times New Roman"/>
-          <w:color w:val="002060"/>
-        </w:rPr>
-        <w:t>,19</w:t>
-      </w:r>
-      <w:proofErr w:type="gramEnd"/>
-      <w:r>
-        <w:rPr>
-          <w:rFonts w:ascii="Times New Roman" w:hAnsi="Times New Roman" w:cs="Times New Roman"/>
-          <w:color w:val="002060"/>
-        </w:rPr>
-        <w:t xml:space="preserve">]. Multilevel </w:t>
-      </w:r>
-      <w:proofErr w:type="spellStart"/>
-      <w:r>
-        <w:rPr>
-          <w:rFonts w:ascii="Times New Roman" w:hAnsi="Times New Roman" w:cs="Times New Roman"/>
-          <w:color w:val="002060"/>
-        </w:rPr>
-        <w:t>modeling</w:t>
-      </w:r>
-      <w:proofErr w:type="spellEnd"/>
-      <w:r>
-        <w:rPr>
-          <w:rFonts w:ascii="Times New Roman" w:hAnsi="Times New Roman" w:cs="Times New Roman"/>
-          <w:color w:val="002060"/>
-        </w:rPr>
-        <w:t xml:space="preserve"> approaches are particularly appropriate for </w:t>
-      </w:r>
-      <w:proofErr w:type="spellStart"/>
-      <w:r>
-        <w:rPr>
-          <w:rFonts w:ascii="Times New Roman" w:hAnsi="Times New Roman" w:cs="Times New Roman"/>
-          <w:color w:val="002060"/>
-        </w:rPr>
-        <w:t>analyzing</w:t>
-      </w:r>
-      <w:proofErr w:type="spellEnd"/>
-      <w:r>
-        <w:rPr>
-          <w:rFonts w:ascii="Times New Roman" w:hAnsi="Times New Roman" w:cs="Times New Roman"/>
-          <w:color w:val="002060"/>
-        </w:rPr>
-        <w:t xml:space="preserve"> DHS data because they simultaneously estimate individual- and community-level influences while accounting for clustering effects and residual contextual variability [18–21]. Previous multilevel studies conducted in Bangladesh and other LMICs have demonstrated that community-level socioeconomic conditions and regional disparities contribute substantially to childhood nutritional outcomes beyond individual household characteristics [12</w:t>
-      </w:r>
-      <w:proofErr w:type="gramStart"/>
-      <w:r>
-        <w:rPr>
-          <w:rFonts w:ascii="Times New Roman" w:hAnsi="Times New Roman" w:cs="Times New Roman"/>
-          <w:color w:val="002060"/>
-        </w:rPr>
-        <w:t>,20</w:t>
-      </w:r>
-      <w:proofErr w:type="gramEnd"/>
-      <w:r>
-        <w:rPr>
-          <w:rFonts w:ascii="Times New Roman" w:hAnsi="Times New Roman" w:cs="Times New Roman"/>
-          <w:color w:val="002060"/>
-        </w:rPr>
-        <w:t>].</w:t>
+        <w:t>Conventional single-level regression approaches may therefore underestimate standard errors and fail to adequately account for contextual heterogeneity [18,19]. Multilevel modeling approaches are particularly appropriate for analyzing DHS data because they simultaneously estimate individual- and community-level influences while accounting for clustering effects and residual contextual variability [18–21]. Previous multilevel studies conducted in Bangladesh and other LMICs have demonstrated that community-level socioeconomic conditions and regional disparities contribute substantially to childhood nutritional outcomes beyond individual household characteristics [12,20].</w:t>
       </w:r>
     </w:p>
     <w:p>
@@ -1110,78 +666,14 @@
           <w:rFonts w:ascii="Times New Roman" w:hAnsi="Times New Roman" w:cs="Times New Roman"/>
           <w:color w:val="000000"/>
         </w:rPr>
-        <w:t>Although several studies have examined childhood undernutrition in Bangladesh using earlier DHS dataset [20</w:t>
-      </w:r>
-      <w:proofErr w:type="gramStart"/>
-      <w:r>
-        <w:rPr>
-          <w:rFonts w:ascii="Times New Roman" w:hAnsi="Times New Roman" w:cs="Times New Roman"/>
-          <w:color w:val="000000"/>
-        </w:rPr>
-        <w:t>,22</w:t>
-      </w:r>
-      <w:proofErr w:type="gramEnd"/>
-      <w:r>
-        <w:rPr>
-          <w:rFonts w:ascii="Times New Roman" w:hAnsi="Times New Roman" w:cs="Times New Roman"/>
-          <w:color w:val="000000"/>
-        </w:rPr>
-        <w:t xml:space="preserve">–24], important gaps remain in the current literature. First, relatively limited evidence has utilized the most recent BDHS 2022 data </w:t>
-      </w:r>
-      <w:proofErr w:type="gramStart"/>
-      <w:r>
-        <w:rPr>
-          <w:rFonts w:ascii="Times New Roman" w:hAnsi="Times New Roman" w:cs="Times New Roman"/>
-          <w:color w:val="000000"/>
-        </w:rPr>
-        <w:t>to simultaneously examine</w:t>
-      </w:r>
-      <w:proofErr w:type="gramEnd"/>
-      <w:r>
-        <w:rPr>
-          <w:rFonts w:ascii="Times New Roman" w:hAnsi="Times New Roman" w:cs="Times New Roman"/>
-          <w:color w:val="000000"/>
-        </w:rPr>
-        <w:t xml:space="preserve"> stunting, wasting, and underweight within a unified multilevel analytical framework. </w:t>
+        <w:t xml:space="preserve">Although several studies have examined childhood undernutrition in Bangladesh using earlier DHS dataset [20,22–24], important gaps remain in the current literature. First, relatively limited evidence has utilized the most recent BDHS 2022 data to simultaneously examine stunting, wasting, and underweight within a unified multilevel analytical framework. </w:t>
       </w:r>
       <w:r>
         <w:rPr>
           <w:rFonts w:ascii="Times New Roman" w:hAnsi="Times New Roman" w:cs="Times New Roman"/>
           <w:color w:val="002060"/>
         </w:rPr>
-        <w:t xml:space="preserve">Recent BDHS 2022 studies have either relied on single-level logistic regressions without decomposing hierarchical clustering (e.g., </w:t>
-      </w:r>
-      <w:proofErr w:type="spellStart"/>
-      <w:r>
-        <w:rPr>
-          <w:rFonts w:ascii="Times New Roman" w:hAnsi="Times New Roman" w:cs="Times New Roman"/>
-          <w:color w:val="002060"/>
-        </w:rPr>
-        <w:t>Tamanna</w:t>
-      </w:r>
-      <w:proofErr w:type="spellEnd"/>
-      <w:r>
-        <w:rPr>
-          <w:rFonts w:ascii="Times New Roman" w:hAnsi="Times New Roman" w:cs="Times New Roman"/>
-          <w:color w:val="002060"/>
-        </w:rPr>
-        <w:t xml:space="preserve"> et al., 2025 [25]) or focused primarily on spatial hotspot analysis via Bayesian methods (e.g., Rashid et al., 2026 [26]) without detailing variance decomposition across domestic infrastructure and the critical weaning transition within a unified frequentist framework. Second, many previous studies did not incorporate child age alongside birth order and fertility variables into multilevel equations. Third, persistent regional and socioeconomic inequalities in childhood nutritional outcomes warrant updated evidence to guide geographically targeted nutrition interventions and policy responses in Bangladesh [23</w:t>
-      </w:r>
-      <w:proofErr w:type="gramStart"/>
-      <w:r>
-        <w:rPr>
-          <w:rFonts w:ascii="Times New Roman" w:hAnsi="Times New Roman" w:cs="Times New Roman"/>
-          <w:color w:val="002060"/>
-        </w:rPr>
-        <w:t>,24</w:t>
-      </w:r>
-      <w:proofErr w:type="gramEnd"/>
-      <w:r>
-        <w:rPr>
-          <w:rFonts w:ascii="Times New Roman" w:hAnsi="Times New Roman" w:cs="Times New Roman"/>
-          <w:color w:val="002060"/>
-        </w:rPr>
-        <w:t>].</w:t>
+        <w:t>Recent BDHS 2022 studies have either relied on single-level logistic regressions without decomposing hierarchical clustering (e.g., Tamanna et al., 2025 [25]) or focused primarily on spatial hotspot analysis via Bayesian methods (e.g., Rashid et al., 2026 [26]) without detailing variance decomposition across domestic infrastructure and the critical weaning transition within a unified frequentist framework. Second, many previous studies did not incorporate child age alongside birth order and fertility variables into multilevel equations. Third, persistent regional and socioeconomic inequalities in childhood nutritional outcomes warrant updated evidence to guide geographically targeted nutrition interventions and policy responses in Bangladesh [23,24].</w:t>
       </w:r>
     </w:p>
     <w:p>
@@ -1286,39 +778,7 @@
           <w:rFonts w:ascii="Times New Roman" w:hAnsi="Times New Roman" w:cs="Times New Roman"/>
           <w:color w:val="000000"/>
         </w:rPr>
-        <w:t xml:space="preserve">This study utilized secondary data from the 2022 Bangladesh Demographic and Health Survey (BDHS 2022), a nationally representative cross-sectional household survey conducted under the global Demographic and Health Survey (DHS) Program. The </w:t>
-      </w:r>
-      <w:proofErr w:type="gramStart"/>
-      <w:r>
-        <w:rPr>
-          <w:rFonts w:ascii="Times New Roman" w:hAnsi="Times New Roman" w:cs="Times New Roman"/>
-          <w:color w:val="000000"/>
-        </w:rPr>
-        <w:t>survey was implemented by the National Institute of Population Research and Training (NIPORT), Bangladesh</w:t>
-      </w:r>
-      <w:proofErr w:type="gramEnd"/>
-      <w:r>
-        <w:rPr>
-          <w:rFonts w:ascii="Times New Roman" w:hAnsi="Times New Roman" w:cs="Times New Roman"/>
-          <w:color w:val="000000"/>
-        </w:rPr>
-        <w:t xml:space="preserve">, in collaboration with ICF International [9]. The BDHS 2022 employed a two-stage stratified cluster sampling design based on the national population </w:t>
-      </w:r>
-      <w:proofErr w:type="gramStart"/>
-      <w:r>
-        <w:rPr>
-          <w:rFonts w:ascii="Times New Roman" w:hAnsi="Times New Roman" w:cs="Times New Roman"/>
-          <w:color w:val="000000"/>
-        </w:rPr>
-        <w:t>census sampling</w:t>
-      </w:r>
-      <w:proofErr w:type="gramEnd"/>
-      <w:r>
-        <w:rPr>
-          <w:rFonts w:ascii="Times New Roman" w:hAnsi="Times New Roman" w:cs="Times New Roman"/>
-          <w:color w:val="000000"/>
-        </w:rPr>
-        <w:t xml:space="preserve"> frame. </w:t>
+        <w:t xml:space="preserve">This study utilized secondary data from the 2022 Bangladesh Demographic and Health Survey (BDHS 2022), a nationally representative cross-sectional household survey conducted under the global Demographic and Health Survey (DHS) Program. The survey was implemented by the National Institute of Population Research and Training (NIPORT), Bangladesh, in collaboration with ICF International [9]. The BDHS 2022 employed a two-stage stratified cluster sampling design based on the national population census sampling frame. </w:t>
       </w:r>
       <w:r>
         <w:rPr>
@@ -1337,145 +797,12 @@
           <w:lang w:val="en-US"/>
         </w:rPr>
       </w:pPr>
-      <w:proofErr w:type="gramStart"/>
       <w:r>
         <w:rPr>
           <w:rFonts w:ascii="Times New Roman" w:hAnsi="Times New Roman" w:cs="Times New Roman"/>
           <w:color w:val="002060"/>
         </w:rPr>
-        <w:t>A total of 8,784</w:t>
-      </w:r>
-      <w:proofErr w:type="gramEnd"/>
-      <w:r>
-        <w:rPr>
-          <w:rFonts w:ascii="Times New Roman" w:hAnsi="Times New Roman" w:cs="Times New Roman"/>
-          <w:color w:val="002060"/>
-        </w:rPr>
-        <w:t xml:space="preserve"> live births occurred to interviewed women during the five years preceding the survey. In accordance with standardized DHS measurement procedures, anthropometric measurements (height and weight) </w:t>
-      </w:r>
-      <w:proofErr w:type="gramStart"/>
-      <w:r>
-        <w:rPr>
-          <w:rFonts w:ascii="Times New Roman" w:hAnsi="Times New Roman" w:cs="Times New Roman"/>
-          <w:color w:val="002060"/>
-        </w:rPr>
-        <w:t>were obtained</w:t>
-      </w:r>
-      <w:proofErr w:type="gramEnd"/>
-      <w:r>
-        <w:rPr>
-          <w:rFonts w:ascii="Times New Roman" w:hAnsi="Times New Roman" w:cs="Times New Roman"/>
-          <w:color w:val="002060"/>
-        </w:rPr>
-        <w:t xml:space="preserve"> from eligible children under five years of age [27]. In accordance with STROBE reporting guidelines [28], the participant selection flow </w:t>
-      </w:r>
-      <w:proofErr w:type="gramStart"/>
-      <w:r>
-        <w:rPr>
-          <w:rFonts w:ascii="Times New Roman" w:hAnsi="Times New Roman" w:cs="Times New Roman"/>
-          <w:color w:val="002060"/>
-        </w:rPr>
-        <w:t>is illustrated</w:t>
-      </w:r>
-      <w:proofErr w:type="gramEnd"/>
-      <w:r>
-        <w:rPr>
-          <w:rFonts w:ascii="Times New Roman" w:hAnsi="Times New Roman" w:cs="Times New Roman"/>
-          <w:color w:val="002060"/>
-        </w:rPr>
-        <w:t xml:space="preserve"> in Figure 2 (see Supplementary File 1 for the completed STROBE cross-sectional checklist). We excluded deceased children (n = 276; B5 = 0) and children who were absent or not subsampled for anthropometric examination (n = 4,421). All anthropometric measurements were verified against WHO biological plausibility criteria (|HAZ| ≤ 6, |WHZ| ≤ 5, |WAZ| ≤ 5); no records had flagged or implausible values. Complete covariate records </w:t>
-      </w:r>
-      <w:proofErr w:type="gramStart"/>
-      <w:r>
-        <w:rPr>
-          <w:rFonts w:ascii="Times New Roman" w:hAnsi="Times New Roman" w:cs="Times New Roman"/>
-          <w:color w:val="002060"/>
-        </w:rPr>
-        <w:t>were verified</w:t>
-      </w:r>
-      <w:proofErr w:type="gramEnd"/>
-      <w:r>
-        <w:rPr>
-          <w:rFonts w:ascii="Times New Roman" w:hAnsi="Times New Roman" w:cs="Times New Roman"/>
-          <w:color w:val="002060"/>
-        </w:rPr>
-        <w:t xml:space="preserve"> for all measured children, yielding a final analytical sample of 4,087 children aged 0–59 months nested within 3,474 households across 670 community clusters (Figure 2). Complete-case analysis </w:t>
-      </w:r>
-      <w:proofErr w:type="gramStart"/>
-      <w:r>
-        <w:rPr>
-          <w:rFonts w:ascii="Times New Roman" w:hAnsi="Times New Roman" w:cs="Times New Roman"/>
-          <w:color w:val="002060"/>
-        </w:rPr>
-        <w:t>was considered</w:t>
-      </w:r>
-      <w:proofErr w:type="gramEnd"/>
-      <w:r>
-        <w:rPr>
-          <w:rFonts w:ascii="Times New Roman" w:hAnsi="Times New Roman" w:cs="Times New Roman"/>
-          <w:color w:val="002060"/>
-        </w:rPr>
-        <w:t xml:space="preserve"> robust because anthropometric data collection followed a randomized subsampling design, minimizing systematic selection bias [27].</w:t>
-      </w:r>
-    </w:p>
-    <w:p>
-      <w:pPr>
-        <w:spacing w:after="0"/>
-        <w:jc w:val="center"/>
-        <w:rPr>
-          <w:rFonts w:ascii="Times New Roman" w:hAnsi="Times New Roman" w:cs="Times New Roman"/>
-          <w:bCs/>
-          <w:lang w:val="en-US"/>
-        </w:rPr>
-      </w:pPr>
-      <w:r>
-        <w:rPr>
-          <w:rFonts w:ascii="Times New Roman" w:hAnsi="Times New Roman" w:cs="Times New Roman"/>
-          <w:noProof/>
-          <w:lang w:val="en-US"/>
-        </w:rPr>
-        <w:lastRenderedPageBreak/>
-        <w:drawing>
-          <wp:inline distT="0" distB="0" distL="0" distR="0" wp14:anchorId="02111FE5" wp14:editId="660155E7">
-            <wp:extent cx="3708544" cy="3178810"/>
-            <wp:effectExtent l="0" t="0" r="0" b="0"/>
-            <wp:docPr id="7" name="Picture 7"/>
-            <wp:cNvGraphicFramePr>
-              <a:graphicFrameLocks xmlns:a="http://schemas.openxmlformats.org/drawingml/2006/main" noChangeAspect="1"/>
-            </wp:cNvGraphicFramePr>
-            <a:graphic xmlns:a="http://schemas.openxmlformats.org/drawingml/2006/main">
-              <a:graphicData uri="http://schemas.openxmlformats.org/drawingml/2006/picture">
-                <pic:pic xmlns:pic="http://schemas.openxmlformats.org/drawingml/2006/picture">
-                  <pic:nvPicPr>
-                    <pic:cNvPr id="7" name="Figure_2_Sample_Selection_Flowchart.png"/>
-                    <pic:cNvPicPr/>
-                  </pic:nvPicPr>
-                  <pic:blipFill>
-                    <a:blip r:embed="rId7" cstate="print">
-                      <a:extLst>
-                        <a:ext uri="{28A0092B-C50C-407E-A947-70E740481C1C}">
-                          <a14:useLocalDpi xmlns:a14="http://schemas.microsoft.com/office/drawing/2010/main" val="0"/>
-                        </a:ext>
-                      </a:extLst>
-                    </a:blip>
-                    <a:stretch>
-                      <a:fillRect/>
-                    </a:stretch>
-                  </pic:blipFill>
-                  <pic:spPr>
-                    <a:xfrm>
-                      <a:off x="0" y="0"/>
-                      <a:ext cx="3717737" cy="3186690"/>
-                    </a:xfrm>
-                    <a:prstGeom prst="rect">
-                      <a:avLst/>
-                    </a:prstGeom>
-                  </pic:spPr>
-                </pic:pic>
-              </a:graphicData>
-            </a:graphic>
-          </wp:inline>
-        </w:drawing>
+        <w:t>A total of 8,784 live births occurred to interviewed women during the five years preceding the survey. In accordance with standardized DHS measurement procedures, anthropometric measurements (height and weight) were obtained from eligible children under five years of age [27]. In accordance with STROBE reporting guidelines [28], the participant selection flow is illustrated in Figure 2 (see Supplementary File 1 for the completed STROBE cross-sectional checklist). We excluded deceased children (n = 276; B5 = 0) and children who were absent or not subsampled for anthropometric examination (n = 4,421). All anthropometric measurements were verified against WHO biological plausibility criteria (|HAZ| ≤ 6, |WHZ| ≤ 5, |WAZ| ≤ 5); no records had flagged or implausible values. Complete covariate records were verified for all measured children, yielding a final analytical sample of 4,087 children aged 0–59 months nested within 3,474 households across 670 community clusters (Figure 2). Complete-case analysis was considered robust because anthropometric data collection followed a randomized subsampling design, minimizing systematic selection bias [27].</w:t>
       </w:r>
     </w:p>
     <w:p>
@@ -1512,27 +839,7 @@
           <w:color w:val="000000"/>
           <w:lang w:val="en-US"/>
         </w:rPr>
-        <w:t xml:space="preserve">Ethical </w:t>
-      </w:r>
-      <w:proofErr w:type="gramStart"/>
-      <w:r>
-        <w:rPr>
-          <w:rFonts w:ascii="Times New Roman" w:hAnsi="Times New Roman" w:cs="Times New Roman"/>
-          <w:b/>
-          <w:color w:val="000000"/>
-          <w:lang w:val="en-US"/>
-        </w:rPr>
-        <w:t>Considerations and Sex</w:t>
-      </w:r>
-      <w:proofErr w:type="gramEnd"/>
-      <w:r>
-        <w:rPr>
-          <w:rFonts w:ascii="Times New Roman" w:hAnsi="Times New Roman" w:cs="Times New Roman"/>
-          <w:b/>
-          <w:color w:val="000000"/>
-          <w:lang w:val="en-US"/>
-        </w:rPr>
-        <w:t xml:space="preserve"> and Gender Reporting</w:t>
+        <w:t>Ethical Considerations and Sex and Gender Reporting</w:t>
       </w:r>
     </w:p>
     <w:p>
@@ -1549,55 +856,7 @@
           <w:rFonts w:ascii="Times New Roman" w:hAnsi="Times New Roman" w:cs="Times New Roman"/>
           <w:color w:val="002060"/>
         </w:rPr>
-        <w:t xml:space="preserve">This study </w:t>
-      </w:r>
-      <w:proofErr w:type="gramStart"/>
-      <w:r>
-        <w:rPr>
-          <w:rFonts w:ascii="Times New Roman" w:hAnsi="Times New Roman" w:cs="Times New Roman"/>
-          <w:color w:val="002060"/>
-        </w:rPr>
-        <w:t>was based</w:t>
-      </w:r>
-      <w:proofErr w:type="gramEnd"/>
-      <w:r>
-        <w:rPr>
-          <w:rFonts w:ascii="Times New Roman" w:hAnsi="Times New Roman" w:cs="Times New Roman"/>
-          <w:color w:val="002060"/>
-        </w:rPr>
-        <w:t xml:space="preserve"> on secondary analysis of publicly available, de-identified data from the 2022 Bangladesh Demographic and Health Survey. The survey protocol </w:t>
-      </w:r>
-      <w:proofErr w:type="gramStart"/>
-      <w:r>
-        <w:rPr>
-          <w:rFonts w:ascii="Times New Roman" w:hAnsi="Times New Roman" w:cs="Times New Roman"/>
-          <w:color w:val="002060"/>
-        </w:rPr>
-        <w:t>was reviewed and approved by the Institutional Review Board of ICF and the National Institute of Population Research and Training (NIPORT) Review Committee, Dhaka, Bangladesh</w:t>
-      </w:r>
-      <w:proofErr w:type="gramEnd"/>
-      <w:r>
-        <w:rPr>
-          <w:rFonts w:ascii="Times New Roman" w:hAnsi="Times New Roman" w:cs="Times New Roman"/>
-          <w:color w:val="002060"/>
-        </w:rPr>
-        <w:t xml:space="preserve">. Informed verbal consent </w:t>
-      </w:r>
-      <w:proofErr w:type="gramStart"/>
-      <w:r>
-        <w:rPr>
-          <w:rFonts w:ascii="Times New Roman" w:hAnsi="Times New Roman" w:cs="Times New Roman"/>
-          <w:color w:val="002060"/>
-        </w:rPr>
-        <w:t>was obtained</w:t>
-      </w:r>
-      <w:proofErr w:type="gramEnd"/>
-      <w:r>
-        <w:rPr>
-          <w:rFonts w:ascii="Times New Roman" w:hAnsi="Times New Roman" w:cs="Times New Roman"/>
-          <w:color w:val="002060"/>
-        </w:rPr>
-        <w:t xml:space="preserve"> from adult participants and parents/guardians of eligible children prior to interview and anthropometric examination. All procedures conformed to the principles embodied in the Declaration of Helsinki. In accordance with the Sex and Gender Equity in Research (SAGER) guidelines, child sex was recorded biologically as male or female based on physical observation and maternal report at survey, and all descriptive, bivariate, and multivariable analyses disaggregated and evaluated biological sex.</w:t>
+        <w:t>This study was based on secondary analysis of publicly available, de-identified data from the 2022 Bangladesh Demographic and Health Survey. The survey protocol was reviewed and approved by the Institutional Review Board of ICF and the National Institute of Population Research and Training (NIPORT) Review Committee, Dhaka, Bangladesh. Informed verbal consent was obtained from adult participants and parents/guardians of eligible children prior to interview and anthropometric examination. All procedures conformed to the principles embodied in the Declaration of Helsinki. In accordance with the Sex and Gender Equity in Research (SAGER) guidelines, child sex was recorded biologically as male or female based on physical observation and maternal report at survey, and all descriptive, bivariate, and multivariable analyses disaggregated and evaluated biological sex.</w:t>
       </w:r>
     </w:p>
     <w:p>
@@ -1630,23 +889,7 @@
           <w:rFonts w:ascii="Times New Roman" w:hAnsi="Times New Roman" w:cs="Times New Roman"/>
           <w:color w:val="000000"/>
         </w:rPr>
-        <w:t>The primary outcome variables were three indicators of childhood undernutrition based on the WHO Child Growth Standards [1</w:t>
-      </w:r>
-      <w:proofErr w:type="gramStart"/>
-      <w:r>
-        <w:rPr>
-          <w:rFonts w:ascii="Times New Roman" w:hAnsi="Times New Roman" w:cs="Times New Roman"/>
-          <w:color w:val="000000"/>
-        </w:rPr>
-        <w:t>,5</w:t>
-      </w:r>
-      <w:proofErr w:type="gramEnd"/>
-      <w:r>
-        <w:rPr>
-          <w:rFonts w:ascii="Times New Roman" w:hAnsi="Times New Roman" w:cs="Times New Roman"/>
-          <w:color w:val="000000"/>
-        </w:rPr>
-        <w:t>]:</w:t>
+        <w:t>The primary outcome variables were three indicators of childhood undernutrition based on the WHO Child Growth Standards [1,5]:</w:t>
       </w:r>
     </w:p>
     <w:p>
@@ -1662,23 +905,7 @@
           <w:rFonts w:ascii="Times New Roman" w:hAnsi="Times New Roman" w:cs="Times New Roman"/>
           <w:color w:val="002060"/>
         </w:rPr>
-        <w:t>• Stunting: height-for-age Z-score (HAZ) &lt; −2.00 SD (</w:t>
-      </w:r>
-      <w:proofErr w:type="gramStart"/>
-      <w:r>
-        <w:rPr>
-          <w:rFonts w:ascii="Times New Roman" w:hAnsi="Times New Roman" w:cs="Times New Roman"/>
-          <w:color w:val="002060"/>
-        </w:rPr>
-        <w:t>1</w:t>
-      </w:r>
-      <w:proofErr w:type="gramEnd"/>
-      <w:r>
-        <w:rPr>
-          <w:rFonts w:ascii="Times New Roman" w:hAnsi="Times New Roman" w:cs="Times New Roman"/>
-          <w:color w:val="002060"/>
-        </w:rPr>
-        <w:t xml:space="preserve"> = Stunted, 0 = Non-stunted).</w:t>
+        <w:t>• Stunting: height-for-age Z-score (HAZ) &lt; −2.00 SD (1 = Stunted, 0 = Non-stunted).</w:t>
       </w:r>
     </w:p>
     <w:p>
@@ -1694,23 +921,7 @@
           <w:rFonts w:ascii="Times New Roman" w:hAnsi="Times New Roman" w:cs="Times New Roman"/>
           <w:color w:val="002060"/>
         </w:rPr>
-        <w:t>• Wasting: weight-for-height Z-score (WHZ) &lt; −2.00 SD (</w:t>
-      </w:r>
-      <w:proofErr w:type="gramStart"/>
-      <w:r>
-        <w:rPr>
-          <w:rFonts w:ascii="Times New Roman" w:hAnsi="Times New Roman" w:cs="Times New Roman"/>
-          <w:color w:val="002060"/>
-        </w:rPr>
-        <w:t>1</w:t>
-      </w:r>
-      <w:proofErr w:type="gramEnd"/>
-      <w:r>
-        <w:rPr>
-          <w:rFonts w:ascii="Times New Roman" w:hAnsi="Times New Roman" w:cs="Times New Roman"/>
-          <w:color w:val="002060"/>
-        </w:rPr>
-        <w:t xml:space="preserve"> = Wasted, 0 = Non-wasted).</w:t>
+        <w:t>• Wasting: weight-for-height Z-score (WHZ) &lt; −2.00 SD (1 = Wasted, 0 = Non-wasted).</w:t>
       </w:r>
     </w:p>
     <w:p>
@@ -1726,23 +937,7 @@
           <w:rFonts w:ascii="Times New Roman" w:hAnsi="Times New Roman" w:cs="Times New Roman"/>
           <w:color w:val="002060"/>
         </w:rPr>
-        <w:t>• Underweight: weight-for-age Z-score (WAZ) &lt; −2.00 SD (</w:t>
-      </w:r>
-      <w:proofErr w:type="gramStart"/>
-      <w:r>
-        <w:rPr>
-          <w:rFonts w:ascii="Times New Roman" w:hAnsi="Times New Roman" w:cs="Times New Roman"/>
-          <w:color w:val="002060"/>
-        </w:rPr>
-        <w:t>1</w:t>
-      </w:r>
-      <w:proofErr w:type="gramEnd"/>
-      <w:r>
-        <w:rPr>
-          <w:rFonts w:ascii="Times New Roman" w:hAnsi="Times New Roman" w:cs="Times New Roman"/>
-          <w:color w:val="002060"/>
-        </w:rPr>
-        <w:t xml:space="preserve"> = Underweight, 0 = Non-underweight).</w:t>
+        <w:t>• Underweight: weight-for-age Z-score (WAZ) &lt; −2.00 SD (1 = Underweight, 0 = Non-underweight).</w:t>
       </w:r>
     </w:p>
     <w:p>
@@ -1804,37 +999,12 @@
           <w:lang w:val="en-US"/>
         </w:rPr>
       </w:pPr>
-      <w:proofErr w:type="gramStart"/>
       <w:r>
         <w:rPr>
           <w:rFonts w:ascii="Times New Roman" w:hAnsi="Times New Roman" w:cs="Times New Roman"/>
           <w:color w:val="000000"/>
         </w:rPr>
-        <w:t>Selection of explanatory variables was guided by the UNICEF conceptual framework for child malnutrition [7], previous DHS-based nutritional studies, and data availability within BDHS 2022</w:t>
-      </w:r>
-      <w:proofErr w:type="gramEnd"/>
-      <w:r>
-        <w:rPr>
-          <w:rFonts w:ascii="Times New Roman" w:hAnsi="Times New Roman" w:cs="Times New Roman"/>
-          <w:color w:val="000000"/>
-        </w:rPr>
-        <w:t xml:space="preserve">. Variables </w:t>
-      </w:r>
-      <w:proofErr w:type="gramStart"/>
-      <w:r>
-        <w:rPr>
-          <w:rFonts w:ascii="Times New Roman" w:hAnsi="Times New Roman" w:cs="Times New Roman"/>
-          <w:color w:val="000000"/>
-        </w:rPr>
-        <w:t>were categorized</w:t>
-      </w:r>
-      <w:proofErr w:type="gramEnd"/>
-      <w:r>
-        <w:rPr>
-          <w:rFonts w:ascii="Times New Roman" w:hAnsi="Times New Roman" w:cs="Times New Roman"/>
-          <w:color w:val="000000"/>
-        </w:rPr>
-        <w:t xml:space="preserve"> into child-, maternal-, household-, and community-level factors. </w:t>
+        <w:t xml:space="preserve">Selection of explanatory variables was guided by the UNICEF conceptual framework for child malnutrition [7], previous DHS-based nutritional studies, and data availability within BDHS 2022. Variables were categorized into child-, maternal-, household-, and community-level factors. </w:t>
       </w:r>
       <w:r>
         <w:rPr>
@@ -1860,85 +1030,12 @@
           <w:lang w:val="en-US"/>
         </w:rPr>
       </w:pPr>
-      <w:proofErr w:type="gramStart"/>
       <w:r>
         <w:rPr>
           <w:rFonts w:ascii="Times New Roman" w:hAnsi="Times New Roman" w:cs="Times New Roman"/>
           <w:color w:val="002060"/>
         </w:rPr>
-        <w:t>Household-level variables encompassed household wealth index (poor, middle, rich, constructed via principal component analysis of household assets), source of drinking water (unimproved vs. improved according to WHO/UNICEF Joint Monitoring Programme guidelines), toilet facility type (unimproved vs. improved), electricity in the household (no, yes), owning a television (no, yes), owning a refrigerator (no, yes), owning a bicycle (no, yes), floor material (unimproved vs. improved), and wall material (unimproved vs. improved).</w:t>
-      </w:r>
-      <w:proofErr w:type="gramEnd"/>
-      <w:r>
-        <w:rPr>
-          <w:rFonts w:ascii="Times New Roman" w:hAnsi="Times New Roman" w:cs="Times New Roman"/>
-          <w:color w:val="002060"/>
-        </w:rPr>
-        <w:t xml:space="preserve"> </w:t>
-      </w:r>
-      <w:proofErr w:type="gramStart"/>
-      <w:r>
-        <w:rPr>
-          <w:rFonts w:ascii="Times New Roman" w:hAnsi="Times New Roman" w:cs="Times New Roman"/>
-          <w:color w:val="002060"/>
-        </w:rPr>
-        <w:t>The simultaneous inclusion of fertility variables (birth order, children ever born, living children) and wealth index alongside individual household assets was substantively justified: birth order reflects biological birth rank; children ever born reflects cumulative maternal reproductive physiological strain; living children reflects current household dependency and care competition; and specific assets (refrigerator, sanitation, wall material) capture direct hygienic and preservation infrastructure beyond broad monetary quintiles.</w:t>
-      </w:r>
-      <w:proofErr w:type="gramEnd"/>
-      <w:r>
-        <w:rPr>
-          <w:rFonts w:ascii="Times New Roman" w:hAnsi="Times New Roman" w:cs="Times New Roman"/>
-          <w:color w:val="002060"/>
-        </w:rPr>
-        <w:t xml:space="preserve"> Generalized Variance Inflation Factor (GVIF) diagnostics (Supplementary Table S4) confirmed that multicollinearity was absent across all socioeconomic, environmental, and geographic covariates (all adjusted GVIF values &lt; 1.66; Wealth Index </w:t>
-      </w:r>
-      <w:proofErr w:type="spellStart"/>
-      <w:r>
-        <w:rPr>
-          <w:rFonts w:ascii="Times New Roman" w:hAnsi="Times New Roman" w:cs="Times New Roman"/>
-          <w:color w:val="002060"/>
-        </w:rPr>
-        <w:t>GVIF_adjusted</w:t>
-      </w:r>
-      <w:proofErr w:type="spellEnd"/>
-      <w:r>
-        <w:rPr>
-          <w:rFonts w:ascii="Times New Roman" w:hAnsi="Times New Roman" w:cs="Times New Roman"/>
-          <w:color w:val="002060"/>
-        </w:rPr>
-        <w:t xml:space="preserve"> = 1.392). Moderate collinearity was observed specifically among the interrelated fertility variables (Children Ever Born [adjusted GVIF = 3.887], Living Children [adjusted GVIF = 2.997], and Birth Order [adjusted GVIF = 2.403]), reflecting the 96.6% empirical concordance between cumulative births and surviving children in the BDHS 2022 sample. While these variables </w:t>
-      </w:r>
-      <w:proofErr w:type="gramStart"/>
-      <w:r>
-        <w:rPr>
-          <w:rFonts w:ascii="Times New Roman" w:hAnsi="Times New Roman" w:cs="Times New Roman"/>
-          <w:color w:val="002060"/>
-        </w:rPr>
-        <w:t>were simultaneously retained</w:t>
-      </w:r>
-      <w:proofErr w:type="gramEnd"/>
-      <w:r>
-        <w:rPr>
-          <w:rFonts w:ascii="Times New Roman" w:hAnsi="Times New Roman" w:cs="Times New Roman"/>
-          <w:color w:val="002060"/>
-        </w:rPr>
-        <w:t xml:space="preserve"> in primary models to theoretically distinguish cumulative reproductive history from active household dependency, their collinearity widens standard errors for fertility estimates. Sensitivity analyses excluding living children reduced GVIF for children ever born to 5.47 without altering any other model estimates. Administrative division (8 divisions) and place of residence (urban, rural) </w:t>
-      </w:r>
-      <w:proofErr w:type="gramStart"/>
-      <w:r>
-        <w:rPr>
-          <w:rFonts w:ascii="Times New Roman" w:hAnsi="Times New Roman" w:cs="Times New Roman"/>
-          <w:color w:val="002060"/>
-        </w:rPr>
-        <w:t>were considered</w:t>
-      </w:r>
-      <w:proofErr w:type="gramEnd"/>
-      <w:r>
-        <w:rPr>
-          <w:rFonts w:ascii="Times New Roman" w:hAnsi="Times New Roman" w:cs="Times New Roman"/>
-          <w:color w:val="002060"/>
-        </w:rPr>
-        <w:t xml:space="preserve"> community-level variables.</w:t>
+        <w:t>Household-level variables encompassed household wealth index (poor, middle, rich, constructed via principal component analysis of household assets), source of drinking water (unimproved vs. improved according to WHO/UNICEF Joint Monitoring Programme guidelines), toilet facility type (unimproved vs. improved), electricity in the household (no, yes), owning a television (no, yes), owning a refrigerator (no, yes), owning a bicycle (no, yes), floor material (unimproved vs. improved), and wall material (unimproved vs. improved). The simultaneous inclusion of fertility variables (birth order, children ever born, living children) and wealth index alongside individual household assets was substantively justified: birth order reflects biological birth rank; children ever born reflects cumulative maternal reproductive physiological strain; living children reflects current household dependency and care competition; and specific assets (refrigerator, sanitation, wall material) capture direct hygienic and preservation infrastructure beyond broad monetary quintiles. Generalized Variance Inflation Factor (GVIF) diagnostics (Supplementary Table S4) confirmed that multicollinearity was absent across all socioeconomic, environmental, and geographic covariates (all adjusted GVIF values &lt; 1.66; Wealth Index GVIF_adjusted = 1.392). Moderate collinearity was observed specifically among the interrelated fertility variables (Children Ever Born [adjusted GVIF = 3.887], Living Children [adjusted GVIF = 2.997], and Birth Order [adjusted GVIF = 2.403]), reflecting the 96.6% empirical concordance between cumulative births and surviving children in the BDHS 2022 sample. While these variables were simultaneously retained in primary models to theoretically distinguish cumulative reproductive history from active household dependency, their collinearity widens standard errors for fertility estimates. Sensitivity analyses excluding living children reduced GVIF for children ever born to 5.47 without altering any other model estimates. Administrative division (8 divisions) and place of residence (urban, rural) were considered community-level variables.</w:t>
       </w:r>
     </w:p>
     <w:p>
@@ -1971,23 +1068,7 @@
           <w:rFonts w:ascii="Times New Roman" w:hAnsi="Times New Roman" w:cs="Times New Roman"/>
           <w:color w:val="000000"/>
         </w:rPr>
-        <w:t xml:space="preserve">Descriptive statistics </w:t>
-      </w:r>
-      <w:proofErr w:type="gramStart"/>
-      <w:r>
-        <w:rPr>
-          <w:rFonts w:ascii="Times New Roman" w:hAnsi="Times New Roman" w:cs="Times New Roman"/>
-          <w:color w:val="000000"/>
-        </w:rPr>
-        <w:t>were used</w:t>
-      </w:r>
-      <w:proofErr w:type="gramEnd"/>
-      <w:r>
-        <w:rPr>
-          <w:rFonts w:ascii="Times New Roman" w:hAnsi="Times New Roman" w:cs="Times New Roman"/>
-          <w:color w:val="000000"/>
-        </w:rPr>
-        <w:t xml:space="preserve"> to summarize the characteristics of the study population and estimate the prevalence of stunting, wasting, and underweight [29]. </w:t>
+        <w:t xml:space="preserve">Descriptive statistics were used to summarize the characteristics of the study population and estimate the prevalence of stunting, wasting, and underweight [29]. </w:t>
       </w:r>
       <w:r>
         <w:rPr>
@@ -2002,48 +1083,14 @@
           <w:color w:val="002060"/>
         </w:rPr>
         <w:lastRenderedPageBreak/>
-        <w:t>[30]; test statistics, degrees of freedom (</w:t>
-      </w:r>
-      <w:proofErr w:type="spellStart"/>
-      <w:proofErr w:type="gramStart"/>
-      <w:r>
-        <w:rPr>
-          <w:rFonts w:ascii="Times New Roman" w:hAnsi="Times New Roman" w:cs="Times New Roman"/>
-          <w:color w:val="002060"/>
-        </w:rPr>
-        <w:t>df</w:t>
-      </w:r>
-      <w:proofErr w:type="spellEnd"/>
-      <w:proofErr w:type="gramEnd"/>
-      <w:r>
-        <w:rPr>
-          <w:rFonts w:ascii="Times New Roman" w:hAnsi="Times New Roman" w:cs="Times New Roman"/>
-          <w:color w:val="002060"/>
-        </w:rPr>
-        <w:t xml:space="preserve">), and exact p-values were reported. </w:t>
+        <w:t xml:space="preserve">[30]; test statistics, degrees of freedom (df), and exact p-values were reported. </w:t>
       </w:r>
       <w:r>
         <w:rPr>
           <w:rFonts w:ascii="Times New Roman" w:hAnsi="Times New Roman" w:cs="Times New Roman"/>
           <w:color w:val="000000"/>
         </w:rPr>
-        <w:t xml:space="preserve">Sampling weights provided in the DHS dataset </w:t>
-      </w:r>
-      <w:proofErr w:type="gramStart"/>
-      <w:r>
-        <w:rPr>
-          <w:rFonts w:ascii="Times New Roman" w:hAnsi="Times New Roman" w:cs="Times New Roman"/>
-          <w:color w:val="000000"/>
-        </w:rPr>
-        <w:t>were incorporated</w:t>
-      </w:r>
-      <w:proofErr w:type="gramEnd"/>
-      <w:r>
-        <w:rPr>
-          <w:rFonts w:ascii="Times New Roman" w:hAnsi="Times New Roman" w:cs="Times New Roman"/>
-          <w:color w:val="000000"/>
-        </w:rPr>
-        <w:t xml:space="preserve"> into descriptive analyses to account for unequal selection probabilities and non-response, thereby ensuring nationally representative estimates. </w:t>
+        <w:t xml:space="preserve">Sampling weights provided in the DHS dataset were incorporated into descriptive analyses to account for unequal selection probabilities and non-response, thereby ensuring nationally representative estimates. </w:t>
       </w:r>
       <w:r>
         <w:rPr>
@@ -2082,71 +1129,7 @@
           <w:rFonts w:ascii="Times New Roman" w:hAnsi="Times New Roman" w:cs="Times New Roman"/>
           <w:color w:val="002060"/>
         </w:rPr>
-        <w:t xml:space="preserve">Because DHS data </w:t>
-      </w:r>
-      <w:proofErr w:type="gramStart"/>
-      <w:r>
-        <w:rPr>
-          <w:rFonts w:ascii="Times New Roman" w:hAnsi="Times New Roman" w:cs="Times New Roman"/>
-          <w:color w:val="002060"/>
-        </w:rPr>
-        <w:t>are hierarchically structured</w:t>
-      </w:r>
-      <w:proofErr w:type="gramEnd"/>
-      <w:r>
-        <w:rPr>
-          <w:rFonts w:ascii="Times New Roman" w:hAnsi="Times New Roman" w:cs="Times New Roman"/>
-          <w:color w:val="002060"/>
-        </w:rPr>
-        <w:t xml:space="preserve"> with children clustered within primary sampling units, observations within the same community are not independent. In the analytical sample, 84.3% of households contained only a single eligible child (</w:t>
-      </w:r>
-      <w:proofErr w:type="gramStart"/>
-      <w:r>
-        <w:rPr>
-          <w:rFonts w:ascii="Times New Roman" w:hAnsi="Times New Roman" w:cs="Times New Roman"/>
-          <w:color w:val="002060"/>
-        </w:rPr>
-        <w:t>mean:</w:t>
-      </w:r>
-      <w:proofErr w:type="gramEnd"/>
-      <w:r>
-        <w:rPr>
-          <w:rFonts w:ascii="Times New Roman" w:hAnsi="Times New Roman" w:cs="Times New Roman"/>
-          <w:color w:val="002060"/>
-        </w:rPr>
-        <w:t xml:space="preserve"> 1.18 children per household), which caused a three-level model to exhibit singular household variance. Consequently, a two-level random-intercept multilevel logistic regression model was fitted, with individual children (Level 1, </w:t>
-      </w:r>
-      <w:proofErr w:type="spellStart"/>
-      <w:r>
-        <w:rPr>
-          <w:rFonts w:ascii="Times New Roman" w:hAnsi="Times New Roman" w:cs="Times New Roman"/>
-          <w:color w:val="002060"/>
-        </w:rPr>
-        <w:t>i</w:t>
-      </w:r>
-      <w:proofErr w:type="spellEnd"/>
-      <w:r>
-        <w:rPr>
-          <w:rFonts w:ascii="Times New Roman" w:hAnsi="Times New Roman" w:cs="Times New Roman"/>
-          <w:color w:val="002060"/>
-        </w:rPr>
-        <w:t>) nested within community clusters (Level 2, j) across 670 clusters [18</w:t>
-      </w:r>
-      <w:proofErr w:type="gramStart"/>
-      <w:r>
-        <w:rPr>
-          <w:rFonts w:ascii="Times New Roman" w:hAnsi="Times New Roman" w:cs="Times New Roman"/>
-          <w:color w:val="002060"/>
-        </w:rPr>
-        <w:t>,21,34</w:t>
-      </w:r>
-      <w:proofErr w:type="gramEnd"/>
-      <w:r>
-        <w:rPr>
-          <w:rFonts w:ascii="Times New Roman" w:hAnsi="Times New Roman" w:cs="Times New Roman"/>
-          <w:color w:val="002060"/>
-        </w:rPr>
-        <w:t>]:</w:t>
+        <w:t>Because DHS data are hierarchically structured with children clustered within primary sampling units, observations within the same community are not independent. In the analytical sample, 84.3% of households contained only a single eligible child (mean: 1.18 children per household), which caused a three-level model to exhibit singular household variance. Consequently, a two-level random-intercept multilevel logistic regression model was fitted, with individual children (Level 1, i) nested within community clusters (Level 2, j) across 670 clusters [18,21,34]:</w:t>
       </w:r>
     </w:p>
     <w:p>
@@ -2543,7 +1526,6 @@
           <w:color w:val="002060"/>
         </w:rPr>
       </w:pPr>
-      <w:proofErr w:type="gramStart"/>
       <w:r>
         <w:rPr>
           <w:rFonts w:ascii="Times New Roman" w:hAnsi="Times New Roman" w:cs="Times New Roman"/>
@@ -2551,17 +1533,7 @@
           <w:color w:val="002060"/>
           <w:lang w:val="en-US"/>
         </w:rPr>
-        <w:t>where</w:t>
-      </w:r>
-      <w:proofErr w:type="gramEnd"/>
-      <w:r>
-        <w:rPr>
-          <w:rFonts w:ascii="Times New Roman" w:hAnsi="Times New Roman" w:cs="Times New Roman"/>
-          <w:bCs/>
-          <w:color w:val="002060"/>
-          <w:lang w:val="en-US"/>
-        </w:rPr>
-        <w:t xml:space="preserve"> </w:t>
+        <w:t xml:space="preserve">where </w:t>
       </w:r>
       <m:oMath>
         <m:sSub>
@@ -2604,17 +1576,7 @@
           <w:color w:val="002060"/>
           <w:lang w:val="en-US"/>
         </w:rPr>
-        <w:t xml:space="preserve"> is the probability that the </w:t>
-      </w:r>
-      <w:proofErr w:type="spellStart"/>
-      <w:r>
-        <w:rPr>
-          <w:rFonts w:ascii="Times New Roman" w:hAnsi="Times New Roman" w:cs="Times New Roman"/>
-          <w:bCs/>
-          <w:color w:val="002060"/>
-          <w:lang w:val="en-US"/>
-        </w:rPr>
-        <w:t>i</w:t>
+        <w:t xml:space="preserve"> is the probability that the i</w:t>
       </w:r>
       <w:r>
         <w:rPr>
@@ -2626,7 +1588,6 @@
         </w:rPr>
         <w:t>th</w:t>
       </w:r>
-      <w:proofErr w:type="spellEnd"/>
       <w:r>
         <w:rPr>
           <w:rFonts w:ascii="Times New Roman" w:hAnsi="Times New Roman" w:cs="Times New Roman"/>
@@ -2634,17 +1595,7 @@
           <w:color w:val="002060"/>
           <w:lang w:val="en-US"/>
         </w:rPr>
-        <w:t xml:space="preserve"> child in the </w:t>
-      </w:r>
-      <w:proofErr w:type="spellStart"/>
-      <w:r>
-        <w:rPr>
-          <w:rFonts w:ascii="Times New Roman" w:hAnsi="Times New Roman" w:cs="Times New Roman"/>
-          <w:bCs/>
-          <w:color w:val="002060"/>
-          <w:lang w:val="en-US"/>
-        </w:rPr>
-        <w:t>j</w:t>
+        <w:t xml:space="preserve"> child in the j</w:t>
       </w:r>
       <w:r>
         <w:rPr>
@@ -2656,7 +1607,6 @@
         </w:rPr>
         <w:t>th</w:t>
       </w:r>
-      <w:proofErr w:type="spellEnd"/>
       <w:r>
         <w:rPr>
           <w:rFonts w:ascii="Times New Roman" w:hAnsi="Times New Roman" w:cs="Times New Roman"/>
@@ -2832,27 +1782,7 @@
           <w:color w:val="002060"/>
           <w:lang w:val="en-US"/>
         </w:rPr>
-        <w:t xml:space="preserve"> is the cluster-level random effect r</w:t>
-      </w:r>
-      <w:proofErr w:type="spellStart"/>
-      <w:r>
-        <w:rPr>
-          <w:rFonts w:ascii="Times New Roman" w:hAnsi="Times New Roman" w:cs="Times New Roman"/>
-          <w:bCs/>
-          <w:color w:val="002060"/>
-          <w:lang w:val="en-US"/>
-        </w:rPr>
-        <w:t>epresenting</w:t>
-      </w:r>
-      <w:proofErr w:type="spellEnd"/>
-      <w:r>
-        <w:rPr>
-          <w:rFonts w:ascii="Times New Roman" w:hAnsi="Times New Roman" w:cs="Times New Roman"/>
-          <w:bCs/>
-          <w:color w:val="002060"/>
-          <w:lang w:val="en-US"/>
-        </w:rPr>
-        <w:t xml:space="preserve"> unobserved community contextual variation</w:t>
+        <w:t xml:space="preserve"> is the cluster-level random effect representing unobserved community contextual variation</w:t>
       </w:r>
       <w:r>
         <w:rPr>
@@ -2866,151 +1796,14 @@
           <w:rFonts w:ascii="Times New Roman" w:hAnsi="Times New Roman" w:cs="Times New Roman"/>
           <w:color w:val="000000"/>
         </w:rPr>
-        <w:t xml:space="preserve">Four sequential models </w:t>
-      </w:r>
-      <w:proofErr w:type="gramStart"/>
-      <w:r>
-        <w:rPr>
-          <w:rFonts w:ascii="Times New Roman" w:hAnsi="Times New Roman" w:cs="Times New Roman"/>
-          <w:color w:val="000000"/>
-        </w:rPr>
-        <w:t>were estimated</w:t>
-      </w:r>
-      <w:proofErr w:type="gramEnd"/>
-      <w:r>
-        <w:rPr>
-          <w:rFonts w:ascii="Times New Roman" w:hAnsi="Times New Roman" w:cs="Times New Roman"/>
-          <w:color w:val="000000"/>
-        </w:rPr>
-        <w:t xml:space="preserve">: Model 0 (Null model without predictors), Model I (Individual-level child and maternal variables), Model II (Individual + household variables), and Model III (Individual + household + community variables). Adjusted odds ratios (AORs) with 95% confidence intervals (CIs) </w:t>
-      </w:r>
-      <w:proofErr w:type="gramStart"/>
-      <w:r>
-        <w:rPr>
-          <w:rFonts w:ascii="Times New Roman" w:hAnsi="Times New Roman" w:cs="Times New Roman"/>
-          <w:color w:val="000000"/>
-        </w:rPr>
-        <w:t>were reported</w:t>
-      </w:r>
-      <w:proofErr w:type="gramEnd"/>
-      <w:r>
-        <w:rPr>
-          <w:rFonts w:ascii="Times New Roman" w:hAnsi="Times New Roman" w:cs="Times New Roman"/>
-          <w:color w:val="000000"/>
-        </w:rPr>
-        <w:t xml:space="preserve">. Model fit </w:t>
-      </w:r>
-      <w:proofErr w:type="gramStart"/>
-      <w:r>
-        <w:rPr>
-          <w:rFonts w:ascii="Times New Roman" w:hAnsi="Times New Roman" w:cs="Times New Roman"/>
-          <w:color w:val="000000"/>
-        </w:rPr>
-        <w:t>was assessed</w:t>
-      </w:r>
-      <w:proofErr w:type="gramEnd"/>
-      <w:r>
-        <w:rPr>
-          <w:rFonts w:ascii="Times New Roman" w:hAnsi="Times New Roman" w:cs="Times New Roman"/>
-          <w:color w:val="000000"/>
-        </w:rPr>
-        <w:t xml:space="preserve"> using </w:t>
-      </w:r>
-      <w:proofErr w:type="spellStart"/>
-      <w:r>
-        <w:rPr>
-          <w:rFonts w:ascii="Times New Roman" w:hAnsi="Times New Roman" w:cs="Times New Roman"/>
-          <w:color w:val="000000"/>
-        </w:rPr>
-        <w:t>Akaike</w:t>
-      </w:r>
-      <w:proofErr w:type="spellEnd"/>
-      <w:r>
-        <w:rPr>
-          <w:rFonts w:ascii="Times New Roman" w:hAnsi="Times New Roman" w:cs="Times New Roman"/>
-          <w:color w:val="000000"/>
-        </w:rPr>
-        <w:t xml:space="preserve"> Information Criterion (AIC), Bayesian Information Criterion (BIC), and Log-Likelihood (</w:t>
-      </w:r>
-      <w:proofErr w:type="spellStart"/>
-      <w:r>
-        <w:rPr>
-          <w:rFonts w:ascii="Times New Roman" w:hAnsi="Times New Roman" w:cs="Times New Roman"/>
-          <w:color w:val="000000"/>
-        </w:rPr>
-        <w:t>LogLik</w:t>
-      </w:r>
-      <w:proofErr w:type="spellEnd"/>
-      <w:r>
-        <w:rPr>
-          <w:rFonts w:ascii="Times New Roman" w:hAnsi="Times New Roman" w:cs="Times New Roman"/>
-          <w:color w:val="000000"/>
-        </w:rPr>
-        <w:t xml:space="preserve">). </w:t>
+        <w:t xml:space="preserve">Four sequential models were estimated: Model 0 (Null model without predictors), Model I (Individual-level child and maternal variables), Model II (Individual + household variables), and Model III (Individual + household + community variables). Adjusted odds ratios (AORs) with 95% confidence intervals (CIs) were reported. Model fit was assessed using Akaike Information Criterion (AIC), Bayesian Information Criterion (BIC), and Log-Likelihood (LogLik). </w:t>
       </w:r>
       <w:r>
         <w:rPr>
           <w:rFonts w:ascii="Times New Roman" w:hAnsi="Times New Roman" w:cs="Times New Roman"/>
           <w:color w:val="002060"/>
         </w:rPr>
-        <w:t xml:space="preserve">Model III </w:t>
-      </w:r>
-      <w:proofErr w:type="gramStart"/>
-      <w:r>
-        <w:rPr>
-          <w:rFonts w:ascii="Times New Roman" w:hAnsi="Times New Roman" w:cs="Times New Roman"/>
-          <w:color w:val="002060"/>
-        </w:rPr>
-        <w:t>was retained</w:t>
-      </w:r>
-      <w:proofErr w:type="gramEnd"/>
-      <w:r>
-        <w:rPr>
-          <w:rFonts w:ascii="Times New Roman" w:hAnsi="Times New Roman" w:cs="Times New Roman"/>
-          <w:color w:val="002060"/>
-        </w:rPr>
-        <w:t xml:space="preserve"> as the primary analytical model because it provided the most comprehensive assessment by simultaneously evaluating geographic division and residence effects while controlling for proximal determinants. Measures of variation included cluster </w:t>
-      </w:r>
-      <w:proofErr w:type="gramStart"/>
-      <w:r>
-        <w:rPr>
-          <w:rFonts w:ascii="Times New Roman" w:hAnsi="Times New Roman" w:cs="Times New Roman"/>
-          <w:color w:val="002060"/>
-        </w:rPr>
-        <w:t xml:space="preserve">variance  </w:t>
-      </w:r>
-      <w:proofErr w:type="spellStart"/>
-      <w:r>
-        <w:rPr>
-          <w:rFonts w:ascii="Times New Roman" w:hAnsi="Times New Roman" w:cs="Times New Roman"/>
-          <w:color w:val="002060"/>
-        </w:rPr>
-        <w:t>intraclass</w:t>
-      </w:r>
-      <w:proofErr w:type="spellEnd"/>
-      <w:proofErr w:type="gramEnd"/>
-      <w:r>
-        <w:rPr>
-          <w:rFonts w:ascii="Times New Roman" w:hAnsi="Times New Roman" w:cs="Times New Roman"/>
-          <w:color w:val="002060"/>
-        </w:rPr>
-        <w:t xml:space="preserve"> correlation coefficient, and the Median Odds Ratio, which translates between-cluster variance onto the odds ratio scale [18]. Likelihood Ratio Tests (LRT) </w:t>
-      </w:r>
-      <w:proofErr w:type="gramStart"/>
-      <w:r>
-        <w:rPr>
-          <w:rFonts w:ascii="Times New Roman" w:hAnsi="Times New Roman" w:cs="Times New Roman"/>
-          <w:color w:val="002060"/>
-        </w:rPr>
-        <w:t>were conducted</w:t>
-      </w:r>
-      <w:proofErr w:type="gramEnd"/>
-      <w:r>
-        <w:rPr>
-          <w:rFonts w:ascii="Times New Roman" w:hAnsi="Times New Roman" w:cs="Times New Roman"/>
-          <w:color w:val="002060"/>
-        </w:rPr>
-        <w:t xml:space="preserve"> comparing random-intercept models to single-level logistic models to confirm significant community clustering.</w:t>
+        <w:t>Model III was retained as the primary analytical model because it provided the most comprehensive assessment by simultaneously evaluating geographic division and residence effects while controlling for proximal determinants. Measures of variation included cluster variance  intraclass correlation coefficient, and the Median Odds Ratio, which translates between-cluster variance onto the odds ratio scale [18]. Likelihood Ratio Tests (LRT) were conducted comparing random-intercept models to single-level logistic models to confirm significant community clustering.</w:t>
       </w:r>
     </w:p>
     <w:p>
@@ -3067,21 +1860,12 @@
           <w:lang w:val="en-US"/>
         </w:rPr>
       </w:pPr>
-      <w:proofErr w:type="gramStart"/>
       <w:r>
         <w:rPr>
           <w:rFonts w:ascii="Times New Roman" w:hAnsi="Times New Roman" w:cs="Times New Roman"/>
           <w:color w:val="002060"/>
         </w:rPr>
-        <w:t>A total of 4,087</w:t>
-      </w:r>
-      <w:proofErr w:type="gramEnd"/>
-      <w:r>
-        <w:rPr>
-          <w:rFonts w:ascii="Times New Roman" w:hAnsi="Times New Roman" w:cs="Times New Roman"/>
-          <w:color w:val="002060"/>
-        </w:rPr>
-        <w:t xml:space="preserve"> children under five years of age were included in the analysis. In the unweighted analytical sample, 966 children (23.64%) were stunted, 487 (11.92%) were wasted, and 928 (22.71%) were underweight. Accounting for survey sampling weights, the national population prevalence was </w:t>
+        <w:t xml:space="preserve">A total of 4,087 children under five years of age were included in the analysis. In the unweighted analytical sample, 966 children (23.64%) were stunted, 487 (11.92%) were wasted, and 928 (22.71%) were underweight. Accounting for survey sampling weights, the national population prevalence was </w:t>
       </w:r>
       <w:r>
         <w:rPr>
@@ -3106,152 +1890,14 @@
           <w:rFonts w:ascii="Times New Roman" w:hAnsi="Times New Roman" w:cs="Times New Roman"/>
           <w:color w:val="000000"/>
         </w:rPr>
-        <w:t xml:space="preserve">Substantial socioeconomic and geographic disparities in childhood nutritional outcomes </w:t>
-      </w:r>
-      <w:proofErr w:type="gramStart"/>
-      <w:r>
-        <w:rPr>
-          <w:rFonts w:ascii="Times New Roman" w:hAnsi="Times New Roman" w:cs="Times New Roman"/>
-          <w:color w:val="000000"/>
-        </w:rPr>
-        <w:t>were observed</w:t>
-      </w:r>
-      <w:proofErr w:type="gramEnd"/>
-      <w:r>
-        <w:rPr>
-          <w:rFonts w:ascii="Times New Roman" w:hAnsi="Times New Roman" w:cs="Times New Roman"/>
-          <w:color w:val="000000"/>
-        </w:rPr>
-        <w:t xml:space="preserve"> across the study population (Table 1 and Figure 3). </w:t>
+        <w:t xml:space="preserve">Substantial socioeconomic and geographic disparities in childhood nutritional outcomes were observed across the study population (Table 1 and Figure 3). </w:t>
       </w:r>
       <w:r>
         <w:rPr>
           <w:rFonts w:ascii="Times New Roman" w:hAnsi="Times New Roman" w:cs="Times New Roman"/>
           <w:color w:val="002060"/>
         </w:rPr>
-        <w:t xml:space="preserve">Marked age-specific gradients were apparent: stunting prevalence rose from 14.24% among infants aged 0–11 months to 28.17% in children aged 12–23 months, remaining high across older cohorts (27.49% at 24–35 months, 24.92% at 36–47 months, and 22.85% at 48–59 months). Underweight increased progressively with age, reaching 27.41% among children aged 48–59 months. In contrast, acute wasting showed smaller variations across age groups (9.43% to 12.57%). The burden of undernutrition was disproportionately concentrated among children from socioeconomically disadvantaged households and among </w:t>
-      </w:r>
-      <w:proofErr w:type="gramStart"/>
-      <w:r>
-        <w:rPr>
-          <w:rFonts w:ascii="Times New Roman" w:hAnsi="Times New Roman" w:cs="Times New Roman"/>
-          <w:color w:val="002060"/>
-        </w:rPr>
-        <w:t>children</w:t>
-      </w:r>
-      <w:proofErr w:type="gramEnd"/>
-      <w:r>
-        <w:rPr>
-          <w:rFonts w:ascii="Times New Roman" w:hAnsi="Times New Roman" w:cs="Times New Roman"/>
-          <w:color w:val="002060"/>
-        </w:rPr>
-        <w:t xml:space="preserve"> whose mothers had no formal education. Children born to mothers without formal education exhibited markedly higher prevalence of stunting (39.89%), wasting (21.76%), and underweight (43.21%) compared with children whose mothers attained higher education (13.69%, 10.28%, and 13.17%, respectively). Similarly, children from poor households experienced substantially higher levels of stunting (30.58%) and underweight (29.19%) than those from rich households (16.32% and 15.06%). Across administrative divisions (Figure 3), stunting and underweight were highest in </w:t>
-      </w:r>
-      <w:proofErr w:type="spellStart"/>
-      <w:r>
-        <w:rPr>
-          <w:rFonts w:ascii="Times New Roman" w:hAnsi="Times New Roman" w:cs="Times New Roman"/>
-          <w:color w:val="002060"/>
-        </w:rPr>
-        <w:t>Mymensingh</w:t>
-      </w:r>
-      <w:proofErr w:type="spellEnd"/>
-      <w:r>
-        <w:rPr>
-          <w:rFonts w:ascii="Times New Roman" w:hAnsi="Times New Roman" w:cs="Times New Roman"/>
-          <w:color w:val="002060"/>
-        </w:rPr>
-        <w:t xml:space="preserve"> (32.94% and 30.70%) and </w:t>
-      </w:r>
-      <w:proofErr w:type="spellStart"/>
-      <w:r>
-        <w:rPr>
-          <w:rFonts w:ascii="Times New Roman" w:hAnsi="Times New Roman" w:cs="Times New Roman"/>
-          <w:color w:val="002060"/>
-        </w:rPr>
-        <w:t>Rajshahi</w:t>
-      </w:r>
-      <w:proofErr w:type="spellEnd"/>
-      <w:r>
-        <w:rPr>
-          <w:rFonts w:ascii="Times New Roman" w:hAnsi="Times New Roman" w:cs="Times New Roman"/>
-          <w:color w:val="002060"/>
-        </w:rPr>
-        <w:t xml:space="preserve"> (27.53% and 26.06%), while wasting was highest in Barisal (14.43%) and </w:t>
-      </w:r>
-      <w:proofErr w:type="spellStart"/>
-      <w:r>
-        <w:rPr>
-          <w:rFonts w:ascii="Times New Roman" w:hAnsi="Times New Roman" w:cs="Times New Roman"/>
-          <w:color w:val="002060"/>
-        </w:rPr>
-        <w:t>Rajshahi</w:t>
-      </w:r>
-      <w:proofErr w:type="spellEnd"/>
-      <w:r>
-        <w:rPr>
-          <w:rFonts w:ascii="Times New Roman" w:hAnsi="Times New Roman" w:cs="Times New Roman"/>
-          <w:color w:val="002060"/>
-        </w:rPr>
-        <w:t xml:space="preserve"> (13.58%).</w:t>
-      </w:r>
-    </w:p>
-    <w:p>
-      <w:pPr>
-        <w:spacing w:after="0"/>
-        <w:jc w:val="center"/>
-        <w:rPr>
-          <w:rFonts w:ascii="Times New Roman" w:hAnsi="Times New Roman" w:cs="Times New Roman"/>
-          <w:lang w:val="en-US"/>
-        </w:rPr>
-      </w:pPr>
-      <w:r>
-        <w:rPr>
-          <w:rFonts w:ascii="Times New Roman" w:hAnsi="Times New Roman" w:cs="Times New Roman"/>
-          <w:noProof/>
-          <w:lang w:val="en-US"/>
-        </w:rPr>
-        <w:drawing>
-          <wp:inline distT="0" distB="0" distL="0" distR="0">
-            <wp:extent cx="5026660" cy="2970552"/>
-            <wp:effectExtent l="0" t="0" r="2540" b="1270"/>
-            <wp:docPr id="3" name="Picture 3"/>
-            <wp:cNvGraphicFramePr>
-              <a:graphicFrameLocks xmlns:a="http://schemas.openxmlformats.org/drawingml/2006/main" noChangeAspect="1"/>
-            </wp:cNvGraphicFramePr>
-            <a:graphic xmlns:a="http://schemas.openxmlformats.org/drawingml/2006/main">
-              <a:graphicData uri="http://schemas.openxmlformats.org/drawingml/2006/picture">
-                <pic:pic xmlns:pic="http://schemas.openxmlformats.org/drawingml/2006/picture">
-                  <pic:nvPicPr>
-                    <pic:cNvPr id="3" name="Figure_3_Prevalence by Region_BDHS_n.png"/>
-                    <pic:cNvPicPr/>
-                  </pic:nvPicPr>
-                  <pic:blipFill>
-                    <a:blip r:embed="rId8" cstate="print">
-                      <a:extLst>
-                        <a:ext uri="{28A0092B-C50C-407E-A947-70E740481C1C}">
-                          <a14:useLocalDpi xmlns:a14="http://schemas.microsoft.com/office/drawing/2010/main" val="0"/>
-                        </a:ext>
-                      </a:extLst>
-                    </a:blip>
-                    <a:stretch>
-                      <a:fillRect/>
-                    </a:stretch>
-                  </pic:blipFill>
-                  <pic:spPr>
-                    <a:xfrm>
-                      <a:off x="0" y="0"/>
-                      <a:ext cx="5029450" cy="2972201"/>
-                    </a:xfrm>
-                    <a:prstGeom prst="rect">
-                      <a:avLst/>
-                    </a:prstGeom>
-                  </pic:spPr>
-                </pic:pic>
-              </a:graphicData>
-            </a:graphic>
-          </wp:inline>
-        </w:drawing>
+        <w:t>Marked age-specific gradients were apparent: stunting prevalence rose from 14.24% among infants aged 0–11 months to 28.17% in children aged 12–23 months, remaining high across older cohorts (27.49% at 24–35 months, 24.92% at 36–47 months, and 22.85% at 48–59 months). Underweight increased progressively with age, reaching 27.41% among children aged 48–59 months. In contrast, acute wasting showed smaller variations across age groups (9.43% to 12.57%). The burden of undernutrition was disproportionately concentrated among children from socioeconomically disadvantaged households and among children whose mothers had no formal education. Children born to mothers without formal education exhibited markedly higher prevalence of stunting (39.89%), wasting (21.76%), and underweight (43.21%) compared with children whose mothers attained higher education (13.69%, 10.28%, and 13.17%, respectively). Similarly, children from poor households experienced substantially higher levels of stunting (30.58%) and underweight (29.19%) than those from rich households (16.32% and 15.06%). Across administrative divisions (Figure 3), stunting and underweight were highest in Mymensingh (32.94% and 30.70%) and Rajshahi (27.53% and 26.06%), while wasting was highest in Barisal (14.43%) and Rajshahi (13.58%).</w:t>
       </w:r>
     </w:p>
     <w:p>
@@ -18181,7 +16827,6 @@
                 <w:lang w:val="en-US"/>
               </w:rPr>
             </w:pPr>
-            <w:proofErr w:type="spellStart"/>
             <w:r>
               <w:rPr>
                 <w:rFonts w:ascii="Times New Roman" w:eastAsia="MS Mincho" w:hAnsi="Times New Roman" w:cs="Times New Roman"/>
@@ -18192,7 +16837,6 @@
               </w:rPr>
               <w:t>Rajshahi</w:t>
             </w:r>
-            <w:proofErr w:type="spellEnd"/>
           </w:p>
         </w:tc>
         <w:tc>
@@ -18969,7 +17613,6 @@
                 <w:lang w:val="en-US"/>
               </w:rPr>
             </w:pPr>
-            <w:proofErr w:type="spellStart"/>
             <w:r>
               <w:rPr>
                 <w:rFonts w:ascii="Times New Roman" w:eastAsia="MS Mincho" w:hAnsi="Times New Roman" w:cs="Times New Roman"/>
@@ -18980,7 +17623,6 @@
               </w:rPr>
               <w:t>Mymensingh</w:t>
             </w:r>
-            <w:proofErr w:type="spellEnd"/>
           </w:p>
         </w:tc>
         <w:tc>
@@ -19761,73 +18403,7 @@
           <w:rFonts w:ascii="Times New Roman" w:hAnsi="Times New Roman" w:cs="Times New Roman"/>
           <w:color w:val="002060"/>
         </w:rPr>
-        <w:t xml:space="preserve">Pearson’s chi-square tests </w:t>
-      </w:r>
-      <w:proofErr w:type="gramStart"/>
-      <w:r>
-        <w:rPr>
-          <w:rFonts w:ascii="Times New Roman" w:hAnsi="Times New Roman" w:cs="Times New Roman"/>
-          <w:color w:val="002060"/>
-        </w:rPr>
-        <w:t>were performed</w:t>
-      </w:r>
-      <w:proofErr w:type="gramEnd"/>
-      <w:r>
-        <w:rPr>
-          <w:rFonts w:ascii="Times New Roman" w:hAnsi="Times New Roman" w:cs="Times New Roman"/>
-          <w:color w:val="002060"/>
-        </w:rPr>
-        <w:t xml:space="preserve"> to examine the association between background characteristics and the three anthropometric indicators (Table 2). Child age was strongly associated with stunting (chi2 = 59.69, </w:t>
-      </w:r>
-      <w:proofErr w:type="spellStart"/>
-      <w:proofErr w:type="gramStart"/>
-      <w:r>
-        <w:rPr>
-          <w:rFonts w:ascii="Times New Roman" w:hAnsi="Times New Roman" w:cs="Times New Roman"/>
-          <w:color w:val="002060"/>
-        </w:rPr>
-        <w:t>df</w:t>
-      </w:r>
-      <w:proofErr w:type="spellEnd"/>
-      <w:proofErr w:type="gramEnd"/>
-      <w:r>
-        <w:rPr>
-          <w:rFonts w:ascii="Times New Roman" w:hAnsi="Times New Roman" w:cs="Times New Roman"/>
-          <w:color w:val="002060"/>
-        </w:rPr>
-        <w:t xml:space="preserve"> = 4, p &lt; 0.001) and underweight (chi2 = 55.80, </w:t>
-      </w:r>
-      <w:proofErr w:type="spellStart"/>
-      <w:r>
-        <w:rPr>
-          <w:rFonts w:ascii="Times New Roman" w:hAnsi="Times New Roman" w:cs="Times New Roman"/>
-          <w:color w:val="002060"/>
-        </w:rPr>
-        <w:t>df</w:t>
-      </w:r>
-      <w:proofErr w:type="spellEnd"/>
-      <w:r>
-        <w:rPr>
-          <w:rFonts w:ascii="Times New Roman" w:hAnsi="Times New Roman" w:cs="Times New Roman"/>
-          <w:color w:val="002060"/>
-        </w:rPr>
-        <w:t xml:space="preserve"> = 4, p &lt; 0.001), but not wasting (chi2 = 8.03, </w:t>
-      </w:r>
-      <w:proofErr w:type="spellStart"/>
-      <w:r>
-        <w:rPr>
-          <w:rFonts w:ascii="Times New Roman" w:hAnsi="Times New Roman" w:cs="Times New Roman"/>
-          <w:color w:val="002060"/>
-        </w:rPr>
-        <w:t>df</w:t>
-      </w:r>
-      <w:proofErr w:type="spellEnd"/>
-      <w:r>
-        <w:rPr>
-          <w:rFonts w:ascii="Times New Roman" w:hAnsi="Times New Roman" w:cs="Times New Roman"/>
-          <w:color w:val="002060"/>
-        </w:rPr>
-        <w:t xml:space="preserve"> = 4, p = 0.090). Child sex was not significantly associated with any nutritional outcome. Child stunting was significantly associated with birth order, maternal education, children ever born, living children, wealth index, toilet facility, television and refrigerator ownership, floor material, and administrative division at p &lt; 0.001. For wasting, maternal education was significantly associated at p &lt; 0.001, maternal age at p = 0.005, children ever born at p = 0.034, wealth index at p = 0.039, refrigerator ownership at p = 0.033, and wall material at p = 0.019. Water source, toilet facility, electricity access, television, bicycle, floor material, roof material, and residence were not significantly associated with wasting (p &gt; 0.05). Underweight was significantly associated with birth order, maternal age, maternal education, children ever born, living children, wealth index, toilet facility, TV, refrigerator, floor material, and administrative division at p &lt; 0.001.</w:t>
+        <w:t>Pearson’s chi-square tests were performed to examine the association between background characteristics and the three anthropometric indicators (Table 2). Child age was strongly associated with stunting (chi2 = 59.69, df = 4, p &lt; 0.001) and underweight (chi2 = 55.80, df = 4, p &lt; 0.001), but not wasting (chi2 = 8.03, df = 4, p = 0.090). Child sex was not significantly associated with any nutritional outcome. Child stunting was significantly associated with birth order, maternal education, children ever born, living children, wealth index, toilet facility, television and refrigerator ownership, floor material, and administrative division at p &lt; 0.001. For wasting, maternal education was significantly associated at p &lt; 0.001, maternal age at p = 0.005, children ever born at p = 0.034, wealth index at p = 0.039, refrigerator ownership at p = 0.033, and wall material at p = 0.019. Water source, toilet facility, electricity access, television, bicycle, floor material, roof material, and residence were not significantly associated with wasting (p &gt; 0.05). Underweight was significantly associated with birth order, maternal age, maternal education, children ever born, living children, wealth index, toilet facility, TV, refrigerator, floor material, and administrative division at p &lt; 0.001.</w:t>
       </w:r>
     </w:p>
     <w:p>
@@ -19973,7 +18549,6 @@
                 <w:lang w:val="en-US"/>
               </w:rPr>
             </w:pPr>
-            <w:proofErr w:type="spellStart"/>
             <w:r>
               <w:rPr>
                 <w:rFonts w:ascii="Times New Roman" w:eastAsia="MS Mincho" w:hAnsi="Times New Roman" w:cs="Times New Roman"/>
@@ -19985,7 +18560,6 @@
               </w:rPr>
               <w:t>df</w:t>
             </w:r>
-            <w:proofErr w:type="spellEnd"/>
           </w:p>
         </w:tc>
         <w:tc>
@@ -20092,7 +18666,6 @@
                 <w:lang w:val="en-US"/>
               </w:rPr>
             </w:pPr>
-            <w:proofErr w:type="spellStart"/>
             <w:r>
               <w:rPr>
                 <w:rFonts w:ascii="Times New Roman" w:eastAsia="MS Mincho" w:hAnsi="Times New Roman" w:cs="Times New Roman"/>
@@ -20104,7 +18677,6 @@
               </w:rPr>
               <w:t>df</w:t>
             </w:r>
-            <w:proofErr w:type="spellEnd"/>
           </w:p>
         </w:tc>
         <w:tc>
@@ -20211,7 +18783,6 @@
                 <w:lang w:val="en-US"/>
               </w:rPr>
             </w:pPr>
-            <w:proofErr w:type="spellStart"/>
             <w:r>
               <w:rPr>
                 <w:rFonts w:ascii="Times New Roman" w:eastAsia="MS Mincho" w:hAnsi="Times New Roman" w:cs="Times New Roman"/>
@@ -20223,7 +18794,6 @@
               </w:rPr>
               <w:t>df</w:t>
             </w:r>
-            <w:proofErr w:type="spellEnd"/>
           </w:p>
         </w:tc>
         <w:tc>
@@ -27221,11 +25791,21 @@
     <w:p>
       <w:pPr>
         <w:spacing w:after="0"/>
-        <w:jc w:val="center"/>
         <w:rPr>
           <w:rFonts w:ascii="Times New Roman" w:hAnsi="Times New Roman" w:cs="Times New Roman"/>
         </w:rPr>
       </w:pPr>
+      <w:r>
+        <w:rPr>
+          <w:rFonts w:ascii="Times New Roman" w:hAnsi="Times New Roman" w:cs="Times New Roman"/>
+          <w:i/>
+          <w:sz w:val="20"/>
+          <w:szCs w:val="20"/>
+        </w:rPr>
+        <w:t>Note: *, ** and *** indicate significance at &lt; 0.05, &lt; 0.01, and &lt; 0.001 respectively.</w:t>
+      </w:r>
+      <w:bookmarkStart w:id="0" w:name="_GoBack"/>
+      <w:bookmarkEnd w:id="0"/>
     </w:p>
     <w:p>
       <w:pPr>
@@ -27260,23 +25840,7 @@
           <w:rFonts w:ascii="Times New Roman" w:hAnsi="Times New Roman" w:cs="Times New Roman"/>
           <w:color w:val="002060"/>
         </w:rPr>
-        <w:t xml:space="preserve">Multilevel logistic regression models </w:t>
-      </w:r>
-      <w:proofErr w:type="gramStart"/>
-      <w:r>
-        <w:rPr>
-          <w:rFonts w:ascii="Times New Roman" w:hAnsi="Times New Roman" w:cs="Times New Roman"/>
-          <w:color w:val="002060"/>
-        </w:rPr>
-        <w:t>were estimated</w:t>
-      </w:r>
-      <w:proofErr w:type="gramEnd"/>
-      <w:r>
-        <w:rPr>
-          <w:rFonts w:ascii="Times New Roman" w:hAnsi="Times New Roman" w:cs="Times New Roman"/>
-          <w:color w:val="002060"/>
-        </w:rPr>
-        <w:t xml:space="preserve"> separately for stunting, wasting, and underweight (Table 3 and Supplementary Tables S1–S3). </w:t>
+        <w:t xml:space="preserve">Multilevel logistic regression models were estimated separately for stunting, wasting, and underweight (Table 3 and Supplementary Tables S1–S3). </w:t>
       </w:r>
       <w:r>
         <w:rPr>
@@ -27290,39 +25854,7 @@
           <w:rFonts w:ascii="Times New Roman" w:hAnsi="Times New Roman" w:cs="Times New Roman"/>
           <w:color w:val="002060"/>
         </w:rPr>
-        <w:t xml:space="preserve">The ICC for stunting declined from 5.68% (MOR: 1.53; LRT chi2 = 29.83, p &lt; 0.001) in the null model to 1.21% (MOR: 1.22; LRT chi2 = 20.35, p &lt; 0.001) in the fully adjusted model (Model III), while the ICC for underweight decreased from 4.47% (MOR: 1.45; LRT chi2 = 22.44, p &lt; 0.001) to 0.91% (MOR: 1.18; LRT chi2 = 14.88, p &lt; 0.001). Sequential reductions in cluster variance indicated that 79.8% of between-community variation in stunting </w:t>
-      </w:r>
-      <w:proofErr w:type="gramStart"/>
-      <w:r>
-        <w:rPr>
-          <w:rFonts w:ascii="Times New Roman" w:hAnsi="Times New Roman" w:cs="Times New Roman"/>
-          <w:color w:val="002060"/>
-        </w:rPr>
-        <w:t>was explained</w:t>
-      </w:r>
-      <w:proofErr w:type="gramEnd"/>
-      <w:r>
-        <w:rPr>
-          <w:rFonts w:ascii="Times New Roman" w:hAnsi="Times New Roman" w:cs="Times New Roman"/>
-          <w:color w:val="002060"/>
-        </w:rPr>
-        <w:t xml:space="preserve"> by included child, maternal, and household characteristics. In contrast, wasting models showed limited baseline contextual clustering (null ICC: 1.48%, MOR: 1.25), which declined to near zero in the fully adjusted model (sigma_u^2 = 0.000, ICC &lt; </w:t>
-      </w:r>
-      <w:proofErr w:type="gramStart"/>
-      <w:r>
-        <w:rPr>
-          <w:rFonts w:ascii="Times New Roman" w:hAnsi="Times New Roman" w:cs="Times New Roman"/>
-          <w:color w:val="002060"/>
-        </w:rPr>
-        <w:t>0.01%</w:t>
-      </w:r>
-      <w:proofErr w:type="gramEnd"/>
-      <w:r>
-        <w:rPr>
-          <w:rFonts w:ascii="Times New Roman" w:hAnsi="Times New Roman" w:cs="Times New Roman"/>
-          <w:color w:val="002060"/>
-        </w:rPr>
-        <w:t>), indicating that acute malnutrition is driven predominantly by immediate household- or child-level conditions rather than stable community context.</w:t>
+        <w:t>The ICC for stunting declined from 5.68% (MOR: 1.53; LRT chi2 = 29.83, p &lt; 0.001) in the null model to 1.21% (MOR: 1.22; LRT chi2 = 20.35, p &lt; 0.001) in the fully adjusted model (Model III), while the ICC for underweight decreased from 4.47% (MOR: 1.45; LRT chi2 = 22.44, p &lt; 0.001) to 0.91% (MOR: 1.18; LRT chi2 = 14.88, p &lt; 0.001). Sequential reductions in cluster variance indicated that 79.8% of between-community variation in stunting was explained by included child, maternal, and household characteristics. In contrast, wasting models showed limited baseline contextual clustering (null ICC: 1.48%, MOR: 1.25), which declined to near zero in the fully adjusted model (sigma_u^2 = 0.000, ICC &lt; 0.01%), indicating that acute malnutrition is driven predominantly by immediate household- or child-level conditions rather than stable community context.</w:t>
       </w:r>
     </w:p>
     <w:p>
@@ -27405,62 +25937,14 @@
           <w:rFonts w:ascii="Times New Roman" w:hAnsi="Times New Roman" w:cs="Times New Roman"/>
           <w:color w:val="002060"/>
         </w:rPr>
-        <w:t xml:space="preserve">In the fully adjusted multilevel model (Table 3 and Supplementary Table S1), child age emerged as a potent predictor of stunting. </w:t>
-      </w:r>
-      <w:proofErr w:type="gramStart"/>
-      <w:r>
-        <w:rPr>
-          <w:rFonts w:ascii="Times New Roman" w:hAnsi="Times New Roman" w:cs="Times New Roman"/>
-          <w:color w:val="002060"/>
-        </w:rPr>
-        <w:t>Compared with infants aged 0–11 months, children aged 12–23 months had more than twofold higher odds of stunting (AOR: 2.38; 95% CI: 1.85–3.06, p &lt; 0.001), with elevated odds persisting at 24–35 months (AOR: 2.25; 95% CI: 1.75–2.90, p &lt; 0.001), 36–47 months (AOR: 1.87; 95% CI: 1.44–2.43, p &lt; 0.001), and 48–59 months (AOR: 1.69; 95% CI: 1.29–2.22, p &lt; 0.001).</w:t>
-      </w:r>
-      <w:proofErr w:type="gramEnd"/>
-      <w:r>
-        <w:rPr>
-          <w:rFonts w:ascii="Times New Roman" w:hAnsi="Times New Roman" w:cs="Times New Roman"/>
-          <w:color w:val="002060"/>
-        </w:rPr>
-        <w:t xml:space="preserve"> Maternal education exhibited a clear dose-response protective relationship: compared with children of mothers with no formal education, children of mothers with primary (AOR: 0.70; 95% CI: 0.51–0.94, p = 0.019), secondary (AOR: 0.58; 95% CI: 0.43–0.78, p &lt; 0.001), and higher education (AOR: 0.38; 95% CI: 0.26–0.56, p &lt; 0.001) had significantly lower odds of stunting. Children from rich households had 36% lower odds of stunting than those from poor households (AOR: 0.64; 95% CI: 0.46–0.89, p = 0.009). Children residing in </w:t>
-      </w:r>
-      <w:proofErr w:type="spellStart"/>
-      <w:r>
-        <w:rPr>
-          <w:rFonts w:ascii="Times New Roman" w:hAnsi="Times New Roman" w:cs="Times New Roman"/>
-          <w:color w:val="002060"/>
-        </w:rPr>
-        <w:t>Mymensingh</w:t>
-      </w:r>
-      <w:proofErr w:type="spellEnd"/>
-      <w:r>
-        <w:rPr>
-          <w:rFonts w:ascii="Times New Roman" w:hAnsi="Times New Roman" w:cs="Times New Roman"/>
-          <w:color w:val="002060"/>
-        </w:rPr>
-        <w:t xml:space="preserve"> division demonstrated elevated odds of stunting relative to Barisal (AOR: 1.36; 95% CI: 1.00–1.86, p = 0.049). </w:t>
+        <w:t xml:space="preserve">In the fully adjusted multilevel model (Table 3 and Supplementary Table S1), child age emerged as a potent predictor of stunting. Compared with infants aged 0–11 months, children aged 12–23 months had more than twofold higher odds of stunting (AOR: 2.38; 95% CI: 1.85–3.06, p &lt; 0.001), with elevated odds persisting at 24–35 months (AOR: 2.25; 95% CI: 1.75–2.90, p &lt; 0.001), 36–47 months (AOR: 1.87; 95% CI: 1.44–2.43, p &lt; 0.001), and 48–59 months (AOR: 1.69; 95% CI: 1.29–2.22, p &lt; 0.001). Maternal education exhibited a clear dose-response protective relationship: compared with children of mothers with no formal education, children of mothers with primary (AOR: 0.70; 95% CI: 0.51–0.94, p = 0.019), secondary (AOR: 0.58; 95% CI: 0.43–0.78, p &lt; 0.001), and higher education (AOR: 0.38; 95% CI: 0.26–0.56, p &lt; 0.001) had significantly lower odds of stunting. Children from rich households had 36% lower odds of stunting than those from poor households (AOR: 0.64; 95% CI: 0.46–0.89, p = 0.009). Children residing in Mymensingh division demonstrated elevated odds of stunting relative to Barisal (AOR: 1.36; 95% CI: 1.00–1.86, p = 0.049). </w:t>
       </w:r>
       <w:r>
         <w:rPr>
           <w:rFonts w:ascii="Times New Roman" w:hAnsi="Times New Roman" w:cs="Times New Roman"/>
           <w:color w:val="000000"/>
         </w:rPr>
-        <w:t xml:space="preserve">Birth order, maternal age, currently pregnant, sanitation, and place of residence were </w:t>
-      </w:r>
-      <w:proofErr w:type="gramStart"/>
-      <w:r>
-        <w:rPr>
-          <w:rFonts w:ascii="Times New Roman" w:hAnsi="Times New Roman" w:cs="Times New Roman"/>
-          <w:color w:val="000000"/>
-        </w:rPr>
-        <w:t>not independently</w:t>
-      </w:r>
-      <w:proofErr w:type="gramEnd"/>
-      <w:r>
-        <w:rPr>
-          <w:rFonts w:ascii="Times New Roman" w:hAnsi="Times New Roman" w:cs="Times New Roman"/>
-          <w:color w:val="000000"/>
-        </w:rPr>
-        <w:t xml:space="preserve"> associated with stunting.</w:t>
+        <w:t>Birth order, maternal age, currently pregnant, sanitation, and place of residence were not independently associated with stunting.</w:t>
       </w:r>
     </w:p>
     <w:p>
@@ -36106,7 +34590,6 @@
                 <w:lang w:val="en-US"/>
               </w:rPr>
             </w:pPr>
-            <w:proofErr w:type="spellStart"/>
             <w:r>
               <w:rPr>
                 <w:rFonts w:ascii="Times New Roman" w:eastAsia="MS Mincho" w:hAnsi="Times New Roman" w:cs="Times New Roman"/>
@@ -36117,7 +34600,6 @@
               </w:rPr>
               <w:t>Rajshahi</w:t>
             </w:r>
-            <w:proofErr w:type="spellEnd"/>
           </w:p>
         </w:tc>
         <w:tc>
@@ -36637,7 +35119,6 @@
                 <w:lang w:val="en-US"/>
               </w:rPr>
             </w:pPr>
-            <w:proofErr w:type="spellStart"/>
             <w:r>
               <w:rPr>
                 <w:rFonts w:ascii="Times New Roman" w:eastAsia="MS Mincho" w:hAnsi="Times New Roman" w:cs="Times New Roman"/>
@@ -36648,7 +35129,6 @@
               </w:rPr>
               <w:t>Mymensingh</w:t>
             </w:r>
-            <w:proofErr w:type="spellEnd"/>
           </w:p>
         </w:tc>
         <w:tc>
@@ -38467,6 +36947,15 @@
           <w:rFonts w:ascii="Times New Roman" w:hAnsi="Times New Roman" w:cs="Times New Roman"/>
         </w:rPr>
       </w:pPr>
+      <w:r>
+        <w:rPr>
+          <w:rFonts w:ascii="Times New Roman" w:hAnsi="Times New Roman" w:cs="Times New Roman"/>
+          <w:i/>
+          <w:sz w:val="20"/>
+          <w:szCs w:val="20"/>
+        </w:rPr>
+        <w:t>Note: *, ** and *** indicate significance at &lt; 0.05, &lt; 0.01, and &lt; 0.001 respectively.</w:t>
+      </w:r>
     </w:p>
     <w:p>
       <w:pPr>
@@ -38476,7 +36965,7 @@
           <w:bCs/>
         </w:rPr>
       </w:pPr>
-      <w:bookmarkStart w:id="0" w:name="_Hlk232554340"/>
+      <w:bookmarkStart w:id="1" w:name="_Hlk232554340"/>
       <w:r>
         <w:rPr>
           <w:rFonts w:ascii="Times New Roman" w:eastAsia="SimSun" w:hAnsi="Times New Roman" w:cs="Times New Roman"/>
@@ -38509,55 +36998,7 @@
           <w:rFonts w:ascii="Times New Roman" w:hAnsi="Times New Roman" w:cs="Times New Roman"/>
           <w:color w:val="002060"/>
         </w:rPr>
-        <w:t xml:space="preserve">As children were clustered within communities, the two-level multilevel </w:t>
-      </w:r>
-      <w:proofErr w:type="spellStart"/>
-      <w:r>
-        <w:rPr>
-          <w:rFonts w:ascii="Times New Roman" w:hAnsi="Times New Roman" w:cs="Times New Roman"/>
-          <w:color w:val="002060"/>
-        </w:rPr>
-        <w:t>modeling</w:t>
-      </w:r>
-      <w:proofErr w:type="spellEnd"/>
-      <w:r>
-        <w:rPr>
-          <w:rFonts w:ascii="Times New Roman" w:hAnsi="Times New Roman" w:cs="Times New Roman"/>
-          <w:color w:val="002060"/>
-        </w:rPr>
-        <w:t xml:space="preserve"> framework appropriately accounted for clustering effects and contextual heterogeneity that may not be adequately addressed using conventional single-level regression approaches [18,20,34]. The improved model fit observed across adjusted models supports the suitability of multilevel </w:t>
-      </w:r>
-      <w:proofErr w:type="spellStart"/>
-      <w:r>
-        <w:rPr>
-          <w:rFonts w:ascii="Times New Roman" w:hAnsi="Times New Roman" w:cs="Times New Roman"/>
-          <w:color w:val="002060"/>
-        </w:rPr>
-        <w:t>modeling</w:t>
-      </w:r>
-      <w:proofErr w:type="spellEnd"/>
-      <w:r>
-        <w:rPr>
-          <w:rFonts w:ascii="Times New Roman" w:hAnsi="Times New Roman" w:cs="Times New Roman"/>
-          <w:color w:val="002060"/>
-        </w:rPr>
-        <w:t xml:space="preserve"> for </w:t>
-      </w:r>
-      <w:proofErr w:type="spellStart"/>
-      <w:r>
-        <w:rPr>
-          <w:rFonts w:ascii="Times New Roman" w:hAnsi="Times New Roman" w:cs="Times New Roman"/>
-          <w:color w:val="002060"/>
-        </w:rPr>
-        <w:t>analyzing</w:t>
-      </w:r>
-      <w:proofErr w:type="spellEnd"/>
-      <w:r>
-        <w:rPr>
-          <w:rFonts w:ascii="Times New Roman" w:hAnsi="Times New Roman" w:cs="Times New Roman"/>
-          <w:color w:val="002060"/>
-        </w:rPr>
-        <w:t xml:space="preserve"> hierarchical DHS data structures. The findings demonstrate that childhood undernutrition in Bangladesh remains strongly patterned by child age, maternal education, household socioeconomic status, and contextual disparities. Chronic forms of undernutrition, particularly stunting and underweight, continue to represent a greater public health burden than acute malnutrition.</w:t>
+        <w:t>As children were clustered within communities, the two-level multilevel modeling framework appropriately accounted for clustering effects and contextual heterogeneity that may not be adequately addressed using conventional single-level regression approaches [18,20,34]. The improved model fit observed across adjusted models supports the suitability of multilevel modeling for analyzing hierarchical DHS data structures. The findings demonstrate that childhood undernutrition in Bangladesh remains strongly patterned by child age, maternal education, household socioeconomic status, and contextual disparities. Chronic forms of undernutrition, particularly stunting and underweight, continue to represent a greater public health burden than acute malnutrition.</w:t>
       </w:r>
     </w:p>
     <w:p>
@@ -38575,39 +37016,7 @@
           <w:rFonts w:ascii="Times New Roman" w:hAnsi="Times New Roman" w:cs="Times New Roman"/>
           <w:color w:val="002060"/>
         </w:rPr>
-        <w:t xml:space="preserve">A primary finding of this study is the critical role of child age in shaping chronic undernutrition. Incorporating child age into the multilevel models resolved a critical omission in earlier analyses and resulted in a marked improvement in model fit (Delta AIC </w:t>
-      </w:r>
-      <w:proofErr w:type="spellStart"/>
-      <w:r>
-        <w:rPr>
-          <w:rFonts w:ascii="Times New Roman" w:hAnsi="Times New Roman" w:cs="Times New Roman"/>
-          <w:color w:val="002060"/>
-        </w:rPr>
-        <w:t>approx</w:t>
-      </w:r>
-      <w:proofErr w:type="spellEnd"/>
-      <w:r>
-        <w:rPr>
-          <w:rFonts w:ascii="Times New Roman" w:hAnsi="Times New Roman" w:cs="Times New Roman"/>
-          <w:color w:val="002060"/>
-        </w:rPr>
-        <w:t xml:space="preserve"> 49 points for stunting). We observed a dramatic twofold increase in the odds of stunting among children aged 12–23 months (AOR: 2.38) and 24–35 months (AOR: 2.25) relative to infants under 12 months. This finding is epidemiologically plausible and aligns with the critical 'first 1,000 days' window [6</w:t>
-      </w:r>
-      <w:proofErr w:type="gramStart"/>
-      <w:r>
-        <w:rPr>
-          <w:rFonts w:ascii="Times New Roman" w:hAnsi="Times New Roman" w:cs="Times New Roman"/>
-          <w:color w:val="002060"/>
-        </w:rPr>
-        <w:t>,14</w:t>
-      </w:r>
-      <w:proofErr w:type="gramEnd"/>
-      <w:r>
-        <w:rPr>
-          <w:rFonts w:ascii="Times New Roman" w:hAnsi="Times New Roman" w:cs="Times New Roman"/>
-          <w:color w:val="002060"/>
-        </w:rPr>
-        <w:t xml:space="preserve">]. During infancy (0–11 months), predominant breastfeeding and maternal antibodies provide physiological protection against nutritional deficits and environmental pathogens. However, the transitional window between 12 and 23 months coincides with the introduction of complementary foods, which in resource-constrained Bangladeshi </w:t>
+        <w:t xml:space="preserve">A primary finding of this study is the critical role of child age in shaping chronic undernutrition. Incorporating child age into the multilevel models resolved a critical omission in earlier analyses and resulted in a marked improvement in model fit (Delta AIC approx 49 points for stunting). We observed a dramatic twofold increase in the odds of stunting among children aged 12–23 months (AOR: 2.38) and 24–35 months (AOR: 2.25) relative to infants under 12 months. This finding is epidemiologically plausible and aligns with the critical 'first 1,000 days' window [6,14]. During infancy (0–11 months), predominant breastfeeding and maternal antibodies provide physiological protection against nutritional deficits and environmental pathogens. However, the transitional window between 12 and 23 months coincides with the introduction of complementary foods, which in resource-constrained Bangladeshi </w:t>
       </w:r>
       <w:r>
         <w:rPr>
@@ -38615,55 +37024,7 @@
           <w:color w:val="002060"/>
         </w:rPr>
         <w:lastRenderedPageBreak/>
-        <w:t>households are frequently inadequate in micronutrient density and dietary diversity [14]. Furthermore, increased child mobility during this period elevates exposure to unhygienic environments, predisposing toddlers to subclinical environmental enteric dysfunction and recurrent diarrheal illness [11</w:t>
-      </w:r>
-      <w:proofErr w:type="gramStart"/>
-      <w:r>
-        <w:rPr>
-          <w:rFonts w:ascii="Times New Roman" w:hAnsi="Times New Roman" w:cs="Times New Roman"/>
-          <w:color w:val="002060"/>
-        </w:rPr>
-        <w:t>,14</w:t>
-      </w:r>
-      <w:proofErr w:type="gramEnd"/>
-      <w:r>
-        <w:rPr>
-          <w:rFonts w:ascii="Times New Roman" w:hAnsi="Times New Roman" w:cs="Times New Roman"/>
-          <w:color w:val="002060"/>
-        </w:rPr>
-        <w:t xml:space="preserve">]. Because linear growth faltering is cumulative, chronic stunting </w:t>
-      </w:r>
-      <w:proofErr w:type="gramStart"/>
-      <w:r>
-        <w:rPr>
-          <w:rFonts w:ascii="Times New Roman" w:hAnsi="Times New Roman" w:cs="Times New Roman"/>
-          <w:color w:val="002060"/>
-        </w:rPr>
-        <w:t>becomes firmly established</w:t>
-      </w:r>
-      <w:proofErr w:type="gramEnd"/>
-      <w:r>
-        <w:rPr>
-          <w:rFonts w:ascii="Times New Roman" w:hAnsi="Times New Roman" w:cs="Times New Roman"/>
-          <w:color w:val="002060"/>
-        </w:rPr>
-        <w:t xml:space="preserve"> after infancy. Similarly, underweight odds increased steadily up to 48–59 months (AOR: 2.25). In sharp contrast, child age was not associated with acute wasting, confirming that wasting </w:t>
-      </w:r>
-      <w:proofErr w:type="gramStart"/>
-      <w:r>
-        <w:rPr>
-          <w:rFonts w:ascii="Times New Roman" w:hAnsi="Times New Roman" w:cs="Times New Roman"/>
-          <w:color w:val="002060"/>
-        </w:rPr>
-        <w:t>is driven</w:t>
-      </w:r>
-      <w:proofErr w:type="gramEnd"/>
-      <w:r>
-        <w:rPr>
-          <w:rFonts w:ascii="Times New Roman" w:hAnsi="Times New Roman" w:cs="Times New Roman"/>
-          <w:color w:val="002060"/>
-        </w:rPr>
-        <w:t xml:space="preserve"> by episodic nutritional deprivations or acute morbidity rather than cumulative age-dependent deficits.</w:t>
+        <w:t>households are frequently inadequate in micronutrient density and dietary diversity [14]. Furthermore, increased child mobility during this period elevates exposure to unhygienic environments, predisposing toddlers to subclinical environmental enteric dysfunction and recurrent diarrheal illness [11,14]. Because linear growth faltering is cumulative, chronic stunting becomes firmly established after infancy. Similarly, underweight odds increased steadily up to 48–59 months (AOR: 2.25). In sharp contrast, child age was not associated with acute wasting, confirming that wasting is driven by episodic nutritional deprivations or acute morbidity rather than cumulative age-dependent deficits.</w:t>
       </w:r>
     </w:p>
     <w:p>
@@ -38688,71 +37049,7 @@
           <w:rFonts w:ascii="Times New Roman" w:hAnsi="Times New Roman" w:cs="Times New Roman"/>
           <w:color w:val="002060"/>
         </w:rPr>
-        <w:t xml:space="preserve">A clear educational gradient </w:t>
-      </w:r>
-      <w:proofErr w:type="gramStart"/>
-      <w:r>
-        <w:rPr>
-          <w:rFonts w:ascii="Times New Roman" w:hAnsi="Times New Roman" w:cs="Times New Roman"/>
-          <w:color w:val="002060"/>
-        </w:rPr>
-        <w:t>was observed</w:t>
-      </w:r>
-      <w:proofErr w:type="gramEnd"/>
-      <w:r>
-        <w:rPr>
-          <w:rFonts w:ascii="Times New Roman" w:hAnsi="Times New Roman" w:cs="Times New Roman"/>
-          <w:color w:val="002060"/>
-        </w:rPr>
-        <w:t>, with higher levels of maternal education associated with progressively lower odds of childhood undernutrition. This finding is consistent with previous studies conducted in Bangladesh and other low- and middle-income countries, which have consistently identified maternal education as a key determinant of child health and nutrition [10</w:t>
-      </w:r>
-      <w:proofErr w:type="gramStart"/>
-      <w:r>
-        <w:rPr>
-          <w:rFonts w:ascii="Times New Roman" w:hAnsi="Times New Roman" w:cs="Times New Roman"/>
-          <w:color w:val="002060"/>
-        </w:rPr>
-        <w:t>,12,14,16</w:t>
-      </w:r>
-      <w:proofErr w:type="gramEnd"/>
-      <w:r>
-        <w:rPr>
-          <w:rFonts w:ascii="Times New Roman" w:hAnsi="Times New Roman" w:cs="Times New Roman"/>
-          <w:color w:val="002060"/>
-        </w:rPr>
-        <w:t xml:space="preserve">]. Maternal education may improve childhood nutritional outcomes through multiple interconnected pathways, including enhanced maternal health literacy, improved infant feeding practices, greater healthcare utilization, improved hygiene </w:t>
-      </w:r>
-      <w:proofErr w:type="spellStart"/>
-      <w:r>
-        <w:rPr>
-          <w:rFonts w:ascii="Times New Roman" w:hAnsi="Times New Roman" w:cs="Times New Roman"/>
-          <w:color w:val="002060"/>
-        </w:rPr>
-        <w:t>behaviors</w:t>
-      </w:r>
-      <w:proofErr w:type="spellEnd"/>
-      <w:r>
-        <w:rPr>
-          <w:rFonts w:ascii="Times New Roman" w:hAnsi="Times New Roman" w:cs="Times New Roman"/>
-          <w:color w:val="002060"/>
-        </w:rPr>
-        <w:t>, and increased household decision-making autonomy [6</w:t>
-      </w:r>
-      <w:proofErr w:type="gramStart"/>
-      <w:r>
-        <w:rPr>
-          <w:rFonts w:ascii="Times New Roman" w:hAnsi="Times New Roman" w:cs="Times New Roman"/>
-          <w:color w:val="002060"/>
-        </w:rPr>
-        <w:t>,10,16,35</w:t>
-      </w:r>
-      <w:proofErr w:type="gramEnd"/>
-      <w:r>
-        <w:rPr>
-          <w:rFonts w:ascii="Times New Roman" w:hAnsi="Times New Roman" w:cs="Times New Roman"/>
-          <w:color w:val="002060"/>
-        </w:rPr>
-        <w:t>]. The persistence of this association after adjustment for household socioeconomic characteristics further underscores the independent role of maternal education in shaping child nutritional inequalities.</w:t>
+        <w:t>A clear educational gradient was observed, with higher levels of maternal education associated with progressively lower odds of childhood undernutrition. This finding is consistent with previous studies conducted in Bangladesh and other low- and middle-income countries, which have consistently identified maternal education as a key determinant of child health and nutrition [10,12,14,16]. Maternal education may improve childhood nutritional outcomes through multiple interconnected pathways, including enhanced maternal health literacy, improved infant feeding practices, greater healthcare utilization, improved hygiene behaviors, and increased household decision-making autonomy [6,10,16,35]. The persistence of this association after adjustment for household socioeconomic characteristics further underscores the independent role of maternal education in shaping child nutritional inequalities.</w:t>
       </w:r>
     </w:p>
     <w:p>
@@ -38770,55 +37067,7 @@
           <w:rFonts w:ascii="Times New Roman" w:hAnsi="Times New Roman" w:cs="Times New Roman"/>
           <w:color w:val="002060"/>
         </w:rPr>
-        <w:t>Household socioeconomic conditions also emerged as major determinants of childhood undernutrition. Children from wealthier households experienced significantly lower odds of stunting (AOR: 0.64) and underweight (AOR: 0.66) compared with children from poor households, indicating the persistence of substantial nutritional inequality across socioeconomic groups in Bangladesh. Household economic resources influence dietary diversity, food security, healthcare access, housing quality, and environmental conditions, all of which contribute to child growth and nutritional status [11</w:t>
-      </w:r>
-      <w:proofErr w:type="gramStart"/>
-      <w:r>
-        <w:rPr>
-          <w:rFonts w:ascii="Times New Roman" w:hAnsi="Times New Roman" w:cs="Times New Roman"/>
-          <w:color w:val="002060"/>
-        </w:rPr>
-        <w:t>,16</w:t>
-      </w:r>
-      <w:proofErr w:type="gramEnd"/>
-      <w:r>
-        <w:rPr>
-          <w:rFonts w:ascii="Times New Roman" w:hAnsi="Times New Roman" w:cs="Times New Roman"/>
-          <w:color w:val="002060"/>
-        </w:rPr>
-        <w:t>]. In addition, household refrigerator ownership showed an independent protective association with underweight (AOR: 0.79), potentially reflecting improved household food preservation capacity, food safety, and greater economic stability [11</w:t>
-      </w:r>
-      <w:proofErr w:type="gramStart"/>
-      <w:r>
-        <w:rPr>
-          <w:rFonts w:ascii="Times New Roman" w:hAnsi="Times New Roman" w:cs="Times New Roman"/>
-          <w:color w:val="002060"/>
-        </w:rPr>
-        <w:t>,24</w:t>
-      </w:r>
-      <w:proofErr w:type="gramEnd"/>
-      <w:r>
-        <w:rPr>
-          <w:rFonts w:ascii="Times New Roman" w:hAnsi="Times New Roman" w:cs="Times New Roman"/>
-          <w:color w:val="002060"/>
-        </w:rPr>
-        <w:t>]. These findings are consistent with the broader social determinants of health framework, which emphasizes that childhood nutritional outcomes are closely linked to structural socioeconomic living conditions [11</w:t>
-      </w:r>
-      <w:proofErr w:type="gramStart"/>
-      <w:r>
-        <w:rPr>
-          <w:rFonts w:ascii="Times New Roman" w:hAnsi="Times New Roman" w:cs="Times New Roman"/>
-          <w:color w:val="002060"/>
-        </w:rPr>
-        <w:t>,17</w:t>
-      </w:r>
-      <w:proofErr w:type="gramEnd"/>
-      <w:r>
-        <w:rPr>
-          <w:rFonts w:ascii="Times New Roman" w:hAnsi="Times New Roman" w:cs="Times New Roman"/>
-          <w:color w:val="002060"/>
-        </w:rPr>
-        <w:t>].</w:t>
+        <w:t>Household socioeconomic conditions also emerged as major determinants of childhood undernutrition. Children from wealthier households experienced significantly lower odds of stunting (AOR: 0.64) and underweight (AOR: 0.66) compared with children from poor households, indicating the persistence of substantial nutritional inequality across socioeconomic groups in Bangladesh. Household economic resources influence dietary diversity, food security, healthcare access, housing quality, and environmental conditions, all of which contribute to child growth and nutritional status [11,16]. In addition, household refrigerator ownership showed an independent protective association with underweight (AOR: 0.79), potentially reflecting improved household food preservation capacity, food safety, and greater economic stability [11,24]. These findings are consistent with the broader social determinants of health framework, which emphasizes that childhood nutritional outcomes are closely linked to structural socioeconomic living conditions [11,17].</w:t>
       </w:r>
     </w:p>
     <w:p>
@@ -38844,39 +37093,7 @@
           <w:color w:val="002060"/>
         </w:rPr>
         <w:lastRenderedPageBreak/>
-        <w:t>divided across multiple dependent children [10</w:t>
-      </w:r>
-      <w:proofErr w:type="gramStart"/>
-      <w:r>
-        <w:rPr>
-          <w:rFonts w:ascii="Times New Roman" w:hAnsi="Times New Roman" w:cs="Times New Roman"/>
-          <w:color w:val="002060"/>
-        </w:rPr>
-        <w:t>,15,36</w:t>
-      </w:r>
-      <w:proofErr w:type="gramEnd"/>
-      <w:r>
-        <w:rPr>
-          <w:rFonts w:ascii="Times New Roman" w:hAnsi="Times New Roman" w:cs="Times New Roman"/>
-          <w:color w:val="002060"/>
-        </w:rPr>
-        <w:t>]. Furthermore, improved wall material was protective against wasting (AOR: 0.69), reflecting protection against environmental pathogen exposure and climatic extremes [11</w:t>
-      </w:r>
-      <w:proofErr w:type="gramStart"/>
-      <w:r>
-        <w:rPr>
-          <w:rFonts w:ascii="Times New Roman" w:hAnsi="Times New Roman" w:cs="Times New Roman"/>
-          <w:color w:val="002060"/>
-        </w:rPr>
-        <w:t>,37</w:t>
-      </w:r>
-      <w:proofErr w:type="gramEnd"/>
-      <w:r>
-        <w:rPr>
-          <w:rFonts w:ascii="Times New Roman" w:hAnsi="Times New Roman" w:cs="Times New Roman"/>
-          <w:color w:val="002060"/>
-        </w:rPr>
-        <w:t>].</w:t>
+        <w:t>divided across multiple dependent children [10,15,36]. Furthermore, improved wall material was protective against wasting (AOR: 0.69), reflecting protection against environmental pathogen exposure and climatic extremes [11,37].</w:t>
       </w:r>
     </w:p>
     <w:p>
@@ -38894,103 +37111,7 @@
           <w:rFonts w:ascii="Times New Roman" w:hAnsi="Times New Roman" w:cs="Times New Roman"/>
           <w:color w:val="002060"/>
         </w:rPr>
-        <w:t xml:space="preserve">Although regional disparities in undernutrition were evident descriptively, most regional associations </w:t>
-      </w:r>
-      <w:proofErr w:type="gramStart"/>
-      <w:r>
-        <w:rPr>
-          <w:rFonts w:ascii="Times New Roman" w:hAnsi="Times New Roman" w:cs="Times New Roman"/>
-          <w:color w:val="002060"/>
-        </w:rPr>
-        <w:t>became attenuated</w:t>
-      </w:r>
-      <w:proofErr w:type="gramEnd"/>
-      <w:r>
-        <w:rPr>
-          <w:rFonts w:ascii="Times New Roman" w:hAnsi="Times New Roman" w:cs="Times New Roman"/>
-          <w:color w:val="002060"/>
-        </w:rPr>
-        <w:t xml:space="preserve"> in adjusted analyses. This finding suggests that much of the observed geographic inequality in childhood undernutrition </w:t>
-      </w:r>
-      <w:proofErr w:type="gramStart"/>
-      <w:r>
-        <w:rPr>
-          <w:rFonts w:ascii="Times New Roman" w:hAnsi="Times New Roman" w:cs="Times New Roman"/>
-          <w:color w:val="002060"/>
-        </w:rPr>
-        <w:t>is explained</w:t>
-      </w:r>
-      <w:proofErr w:type="gramEnd"/>
-      <w:r>
-        <w:rPr>
-          <w:rFonts w:ascii="Times New Roman" w:hAnsi="Times New Roman" w:cs="Times New Roman"/>
-          <w:color w:val="002060"/>
-        </w:rPr>
-        <w:t xml:space="preserve"> by differences in household socioeconomic conditions, maternal education, and regional living environments. Nevertheless, children residing in </w:t>
-      </w:r>
-      <w:proofErr w:type="spellStart"/>
-      <w:r>
-        <w:rPr>
-          <w:rFonts w:ascii="Times New Roman" w:hAnsi="Times New Roman" w:cs="Times New Roman"/>
-          <w:color w:val="002060"/>
-        </w:rPr>
-        <w:t>Mymensingh</w:t>
-      </w:r>
-      <w:proofErr w:type="spellEnd"/>
-      <w:r>
-        <w:rPr>
-          <w:rFonts w:ascii="Times New Roman" w:hAnsi="Times New Roman" w:cs="Times New Roman"/>
-          <w:color w:val="002060"/>
-        </w:rPr>
-        <w:t xml:space="preserve"> division continued to exhibit elevated odds of stunting (AOR: 1.36), while children in Dhaka division demonstrated lower odds of wasting (AOR: 0.55). These findings may reflect regional differences in infrastructure, healthcare accessibility, food security, and socioeconomic development [23</w:t>
-      </w:r>
-      <w:proofErr w:type="gramStart"/>
-      <w:r>
-        <w:rPr>
-          <w:rFonts w:ascii="Times New Roman" w:hAnsi="Times New Roman" w:cs="Times New Roman"/>
-          <w:color w:val="002060"/>
-        </w:rPr>
-        <w:t>,24</w:t>
-      </w:r>
-      <w:proofErr w:type="gramEnd"/>
-      <w:r>
-        <w:rPr>
-          <w:rFonts w:ascii="Times New Roman" w:hAnsi="Times New Roman" w:cs="Times New Roman"/>
-          <w:color w:val="002060"/>
-        </w:rPr>
-        <w:t xml:space="preserve">]. The reductions in ICC and MOR values across successive models indicate that 79.8% of between-community variation in stunting </w:t>
-      </w:r>
-      <w:proofErr w:type="gramStart"/>
-      <w:r>
-        <w:rPr>
-          <w:rFonts w:ascii="Times New Roman" w:hAnsi="Times New Roman" w:cs="Times New Roman"/>
-          <w:color w:val="002060"/>
-        </w:rPr>
-        <w:t>was explained</w:t>
-      </w:r>
-      <w:proofErr w:type="gramEnd"/>
-      <w:r>
-        <w:rPr>
-          <w:rFonts w:ascii="Times New Roman" w:hAnsi="Times New Roman" w:cs="Times New Roman"/>
-          <w:color w:val="002060"/>
-        </w:rPr>
-        <w:t xml:space="preserve"> by measured individual and household factors. However, residual contextual clustering remained significant for chronic forms of undernutrition (ICC: 1.21%, MOR: 1.22; LRT p &lt; 0.001), indicating that community-level influences continue to shape child nutritional outcomes beyond household characteristics. In contrast, cluster variance for wasting declined to zero, confirming that acute wasting </w:t>
-      </w:r>
-      <w:proofErr w:type="gramStart"/>
-      <w:r>
-        <w:rPr>
-          <w:rFonts w:ascii="Times New Roman" w:hAnsi="Times New Roman" w:cs="Times New Roman"/>
-          <w:color w:val="002060"/>
-        </w:rPr>
-        <w:t>is driven</w:t>
-      </w:r>
-      <w:proofErr w:type="gramEnd"/>
-      <w:r>
-        <w:rPr>
-          <w:rFonts w:ascii="Times New Roman" w:hAnsi="Times New Roman" w:cs="Times New Roman"/>
-          <w:color w:val="002060"/>
-        </w:rPr>
-        <w:t xml:space="preserve"> by proximal household and child conditions rather than stable community context.</w:t>
+        <w:t>Although regional disparities in undernutrition were evident descriptively, most regional associations became attenuated in adjusted analyses. This finding suggests that much of the observed geographic inequality in childhood undernutrition is explained by differences in household socioeconomic conditions, maternal education, and regional living environments. Nevertheless, children residing in Mymensingh division continued to exhibit elevated odds of stunting (AOR: 1.36), while children in Dhaka division demonstrated lower odds of wasting (AOR: 0.55). These findings may reflect regional differences in infrastructure, healthcare accessibility, food security, and socioeconomic development [23,24]. The reductions in ICC and MOR values across successive models indicate that 79.8% of between-community variation in stunting was explained by measured individual and household factors. However, residual contextual clustering remained significant for chronic forms of undernutrition (ICC: 1.21%, MOR: 1.22; LRT p &lt; 0.001), indicating that community-level influences continue to shape child nutritional outcomes beyond household characteristics. In contrast, cluster variance for wasting declined to zero, confirming that acute wasting is driven by proximal household and child conditions rather than stable community context.</w:t>
       </w:r>
     </w:p>
     <w:p>
@@ -39008,71 +37129,7 @@
           <w:rFonts w:ascii="Times New Roman" w:hAnsi="Times New Roman" w:cs="Times New Roman"/>
           <w:color w:val="002060"/>
         </w:rPr>
-        <w:t xml:space="preserve">Our findings distinguish themselves from and build upon recently published BDHS 2022 studies. </w:t>
-      </w:r>
-      <w:proofErr w:type="spellStart"/>
-      <w:r>
-        <w:rPr>
-          <w:rFonts w:ascii="Times New Roman" w:hAnsi="Times New Roman" w:cs="Times New Roman"/>
-          <w:color w:val="002060"/>
-        </w:rPr>
-        <w:t>Tamanna</w:t>
-      </w:r>
-      <w:proofErr w:type="spellEnd"/>
-      <w:r>
-        <w:rPr>
-          <w:rFonts w:ascii="Times New Roman" w:hAnsi="Times New Roman" w:cs="Times New Roman"/>
-          <w:color w:val="002060"/>
-        </w:rPr>
-        <w:t xml:space="preserve"> et al. (2025) [25] utilized single-level binary logistic regression and focused primarily on stunting determinants, failing to account for survey clustering or contextual community variance. </w:t>
-      </w:r>
-      <w:proofErr w:type="gramStart"/>
-      <w:r>
-        <w:rPr>
-          <w:rFonts w:ascii="Times New Roman" w:hAnsi="Times New Roman" w:cs="Times New Roman"/>
-          <w:color w:val="002060"/>
-        </w:rPr>
-        <w:t xml:space="preserve">Although Rashid et al. (2026) [26] examined spatial distribution and predictors using Bayesian methods, our study provides a distinct contribution by applying a rigorous two-level frequentist hierarchical model to the complete verified sample (N = 4,087), quantifying cluster variance via </w:t>
-      </w:r>
-      <w:proofErr w:type="spellStart"/>
-      <w:r>
-        <w:rPr>
-          <w:rFonts w:ascii="Times New Roman" w:hAnsi="Times New Roman" w:cs="Times New Roman"/>
-          <w:color w:val="002060"/>
-        </w:rPr>
-        <w:t>Intraclass</w:t>
-      </w:r>
-      <w:proofErr w:type="spellEnd"/>
-      <w:r>
-        <w:rPr>
-          <w:rFonts w:ascii="Times New Roman" w:hAnsi="Times New Roman" w:cs="Times New Roman"/>
-          <w:color w:val="002060"/>
-        </w:rPr>
-        <w:t xml:space="preserve"> Correlation Coefficients (ICC) and Median Odds Ratios (MOR), and evaluating specific domestic infrastructure (such as refrigerator ownership and housing materials) alongside the critical 1,000-day weaning transition.</w:t>
-      </w:r>
-      <w:proofErr w:type="gramEnd"/>
-      <w:r>
-        <w:rPr>
-          <w:rFonts w:ascii="Times New Roman" w:hAnsi="Times New Roman" w:cs="Times New Roman"/>
-          <w:color w:val="002060"/>
-        </w:rPr>
-        <w:t xml:space="preserve"> By </w:t>
-      </w:r>
-      <w:proofErr w:type="spellStart"/>
-      <w:r>
-        <w:rPr>
-          <w:rFonts w:ascii="Times New Roman" w:hAnsi="Times New Roman" w:cs="Times New Roman"/>
-          <w:color w:val="002060"/>
-        </w:rPr>
-        <w:t>analyzing</w:t>
-      </w:r>
-      <w:proofErr w:type="spellEnd"/>
-      <w:r>
-        <w:rPr>
-          <w:rFonts w:ascii="Times New Roman" w:hAnsi="Times New Roman" w:cs="Times New Roman"/>
-          <w:color w:val="002060"/>
-        </w:rPr>
-        <w:t xml:space="preserve"> stunting, wasting, and underweight simultaneously in a unified sample of 4,087 children, our study provides a direct comparative assessment that clarifies why chronic undernutrition requires long-term community infrastructure and educational investments, whereas acute wasting necessitates targeted maternal health and family planning support.</w:t>
+        <w:t>Our findings distinguish themselves from and build upon recently published BDHS 2022 studies. Tamanna et al. (2025) [25] utilized single-level binary logistic regression and focused primarily on stunting determinants, failing to account for survey clustering or contextual community variance. Although Rashid et al. (2026) [26] examined spatial distribution and predictors using Bayesian methods, our study provides a distinct contribution by applying a rigorous two-level frequentist hierarchical model to the complete verified sample (N = 4,087), quantifying cluster variance via Intraclass Correlation Coefficients (ICC) and Median Odds Ratios (MOR), and evaluating specific domestic infrastructure (such as refrigerator ownership and housing materials) alongside the critical 1,000-day weaning transition. By analyzing stunting, wasting, and underweight simultaneously in a unified sample of 4,087 children, our study provides a direct comparative assessment that clarifies why chronic undernutrition requires long-term community infrastructure and educational investments, whereas acute wasting necessitates targeted maternal health and family planning support.</w:t>
       </w:r>
     </w:p>
     <w:p>
@@ -39090,39 +37147,7 @@
           <w:rFonts w:ascii="Times New Roman" w:hAnsi="Times New Roman" w:cs="Times New Roman"/>
           <w:color w:val="002060"/>
         </w:rPr>
-        <w:t xml:space="preserve">Several limitations of this study </w:t>
-      </w:r>
-      <w:proofErr w:type="gramStart"/>
-      <w:r>
-        <w:rPr>
-          <w:rFonts w:ascii="Times New Roman" w:hAnsi="Times New Roman" w:cs="Times New Roman"/>
-          <w:color w:val="002060"/>
-        </w:rPr>
-        <w:t>should be acknowledged</w:t>
-      </w:r>
-      <w:proofErr w:type="gramEnd"/>
-      <w:r>
-        <w:rPr>
-          <w:rFonts w:ascii="Times New Roman" w:hAnsi="Times New Roman" w:cs="Times New Roman"/>
-          <w:color w:val="002060"/>
-        </w:rPr>
-        <w:t xml:space="preserve">. First, the cross-sectional nature of BDHS data limits the ability to establish causal relationships between explanatory variables and nutritional outcomes, and all findings </w:t>
-      </w:r>
-      <w:proofErr w:type="gramStart"/>
-      <w:r>
-        <w:rPr>
-          <w:rFonts w:ascii="Times New Roman" w:hAnsi="Times New Roman" w:cs="Times New Roman"/>
-          <w:color w:val="002060"/>
-        </w:rPr>
-        <w:t>should be interpreted</w:t>
-      </w:r>
-      <w:proofErr w:type="gramEnd"/>
-      <w:r>
-        <w:rPr>
-          <w:rFonts w:ascii="Times New Roman" w:hAnsi="Times New Roman" w:cs="Times New Roman"/>
-          <w:color w:val="002060"/>
-        </w:rPr>
-        <w:t xml:space="preserve"> strictly as associations. Second, complete-case exclusion of children lacking anthropometric measurements (due to randomized subsampling or absence) was necessary, although randomized subsampling in DHS minimizes systematic selection bias. Third, multicollinearity among interrelated fertility variables (children ever born, living children, and birth order) reflects their 96.6% empirical agreement, inflating standard errors for these specific </w:t>
+        <w:t xml:space="preserve">Several limitations of this study should be acknowledged. First, the cross-sectional nature of BDHS data limits the ability to establish causal relationships between explanatory variables and nutritional outcomes, and all findings should be interpreted strictly as associations. Second, complete-case exclusion of children lacking anthropometric measurements (due to randomized subsampling or absence) was necessary, although randomized subsampling in DHS minimizes systematic selection bias. Third, multicollinearity among interrelated fertility variables (children ever born, living children, and birth order) reflects their 96.6% empirical agreement, inflating standard errors for these specific </w:t>
       </w:r>
       <w:r>
         <w:rPr>
@@ -39130,26 +37155,10 @@
           <w:color w:val="002060"/>
         </w:rPr>
         <w:lastRenderedPageBreak/>
-        <w:t xml:space="preserve">coefficients; however, sensitivity models confirmed that this collinearity did not bias estimates for maternal education, wealth, child age, or community context. Fourth, some important determinants of childhood nutrition, including dietary diversity, minimum acceptable diet, birth weight, maternal pre-pregnancy nutritional status, and recent subclinical infection, were not included because of data limitations in BDHS. Despite these limitations, the study benefits from the use of recent, nationally representative </w:t>
-      </w:r>
-      <w:proofErr w:type="gramStart"/>
-      <w:r>
-        <w:rPr>
-          <w:rFonts w:ascii="Times New Roman" w:hAnsi="Times New Roman" w:cs="Times New Roman"/>
-          <w:color w:val="002060"/>
-        </w:rPr>
-        <w:t>data,</w:t>
-      </w:r>
-      <w:proofErr w:type="gramEnd"/>
-      <w:r>
-        <w:rPr>
-          <w:rFonts w:ascii="Times New Roman" w:hAnsi="Times New Roman" w:cs="Times New Roman"/>
-          <w:color w:val="002060"/>
-        </w:rPr>
-        <w:t xml:space="preserve"> standardized WHO anthropometric measures, and robust two-level multilevel analytical approaches.</w:t>
+        <w:t>coefficients; however, sensitivity models confirmed that this collinearity did not bias estimates for maternal education, wealth, child age, or community context. Fourth, some important determinants of childhood nutrition, including dietary diversity, minimum acceptable diet, birth weight, maternal pre-pregnancy nutritional status, and recent subclinical infection, were not included because of data limitations in BDHS. Despite these limitations, the study benefits from the use of recent, nationally representative data, standardized WHO anthropometric measures, and robust two-level multilevel analytical approaches.</w:t>
       </w:r>
     </w:p>
-    <w:bookmarkEnd w:id="0"/>
+    <w:bookmarkEnd w:id="1"/>
     <w:p>
       <w:pPr>
         <w:spacing w:after="0"/>
@@ -39192,39 +37201,7 @@
           <w:rFonts w:ascii="Times New Roman" w:hAnsi="Times New Roman" w:cs="Times New Roman"/>
           <w:color w:val="002060"/>
         </w:rPr>
-        <w:t xml:space="preserve">The findings indicate that childhood undernutrition remains a substantial public health challenge, particularly for chronic forms of malnutrition such as stunting and underweight. The study demonstrated that child age, maternal education, and household wealth are the most consistent determinants of childhood undernutrition. Chronic stunting peaks during the critical 12–23 month weaning window, while maternal education and wealth provide powerful protective effects. In contrast, acute wasting is associated with advanced maternal age and high parity, without substantial community clustering. Consequently, reducing the burden of undernutrition will require integrated, </w:t>
-      </w:r>
-      <w:proofErr w:type="spellStart"/>
-      <w:r>
-        <w:rPr>
-          <w:rFonts w:ascii="Times New Roman" w:hAnsi="Times New Roman" w:cs="Times New Roman"/>
-          <w:color w:val="002060"/>
-        </w:rPr>
-        <w:t>multisectoral</w:t>
-      </w:r>
-      <w:proofErr w:type="spellEnd"/>
-      <w:r>
-        <w:rPr>
-          <w:rFonts w:ascii="Times New Roman" w:hAnsi="Times New Roman" w:cs="Times New Roman"/>
-          <w:color w:val="002060"/>
-        </w:rPr>
-        <w:t xml:space="preserve"> approaches that combine nutrition-specific infant feeding support during the first 1,000 days with nutrition-sensitive investments in female education, poverty reduction, and geographically targeted community interventions in high-burden divisions such as </w:t>
-      </w:r>
-      <w:proofErr w:type="spellStart"/>
-      <w:r>
-        <w:rPr>
-          <w:rFonts w:ascii="Times New Roman" w:hAnsi="Times New Roman" w:cs="Times New Roman"/>
-          <w:color w:val="002060"/>
-        </w:rPr>
-        <w:t>Mymensingh</w:t>
-      </w:r>
-      <w:proofErr w:type="spellEnd"/>
-      <w:r>
-        <w:rPr>
-          <w:rFonts w:ascii="Times New Roman" w:hAnsi="Times New Roman" w:cs="Times New Roman"/>
-          <w:color w:val="002060"/>
-        </w:rPr>
-        <w:t>.</w:t>
+        <w:t>The findings indicate that childhood undernutrition remains a substantial public health challenge, particularly for chronic forms of malnutrition such as stunting and underweight. The study demonstrated that child age, maternal education, and household wealth are the most consistent determinants of childhood undernutrition. Chronic stunting peaks during the critical 12–23 month weaning window, while maternal education and wealth provide powerful protective effects. In contrast, acute wasting is associated with advanced maternal age and high parity, without substantial community clustering. Consequently, reducing the burden of undernutrition will require integrated, multisectoral approaches that combine nutrition-specific infant feeding support during the first 1,000 days with nutrition-sensitive investments in female education, poverty reduction, and geographically targeted community interventions in high-burden divisions such as Mymensingh.</w:t>
       </w:r>
     </w:p>
     <w:p>
@@ -39257,64 +37234,7 @@
           <w:rFonts w:ascii="Times New Roman" w:hAnsi="Times New Roman" w:cs="Times New Roman"/>
           <w:color w:val="002060"/>
         </w:rPr>
-        <w:t xml:space="preserve">AIC: </w:t>
-      </w:r>
-      <w:proofErr w:type="spellStart"/>
-      <w:r>
-        <w:rPr>
-          <w:rFonts w:ascii="Times New Roman" w:hAnsi="Times New Roman" w:cs="Times New Roman"/>
-          <w:color w:val="002060"/>
-        </w:rPr>
-        <w:t>Akaike</w:t>
-      </w:r>
-      <w:proofErr w:type="spellEnd"/>
-      <w:r>
-        <w:rPr>
-          <w:rFonts w:ascii="Times New Roman" w:hAnsi="Times New Roman" w:cs="Times New Roman"/>
-          <w:color w:val="002060"/>
-        </w:rPr>
-        <w:t xml:space="preserve"> Information Criterion; AOR: Adjusted Odds Ratio; BDHS: Bangladesh Demographic and Health Survey; BIC: Bayesian Information Criterion; CI: Confidence Interval; </w:t>
-      </w:r>
-      <w:proofErr w:type="spellStart"/>
-      <w:r>
-        <w:rPr>
-          <w:rFonts w:ascii="Times New Roman" w:hAnsi="Times New Roman" w:cs="Times New Roman"/>
-          <w:color w:val="002060"/>
-        </w:rPr>
-        <w:t>df</w:t>
-      </w:r>
-      <w:proofErr w:type="spellEnd"/>
-      <w:r>
-        <w:rPr>
-          <w:rFonts w:ascii="Times New Roman" w:hAnsi="Times New Roman" w:cs="Times New Roman"/>
-          <w:color w:val="002060"/>
-        </w:rPr>
-        <w:t xml:space="preserve">: Degrees of Freedom; EA: Enumeration Area; GVIF: Generalized Variance Inflation Factor; HAZ: Height-for-Age Z-Score; ICC: </w:t>
-      </w:r>
-      <w:proofErr w:type="spellStart"/>
-      <w:r>
-        <w:rPr>
-          <w:rFonts w:ascii="Times New Roman" w:hAnsi="Times New Roman" w:cs="Times New Roman"/>
-          <w:color w:val="002060"/>
-        </w:rPr>
-        <w:t>Intraclass</w:t>
-      </w:r>
-      <w:proofErr w:type="spellEnd"/>
-      <w:r>
-        <w:rPr>
-          <w:rFonts w:ascii="Times New Roman" w:hAnsi="Times New Roman" w:cs="Times New Roman"/>
-          <w:color w:val="002060"/>
-        </w:rPr>
-        <w:t xml:space="preserve"> Correlation Coefficient; LMICs: Low- and Middle-Income Countries; LRT: Likelihood Ratio Test; MOR: Median Odds Ratio; NIPORT: National Institute of Population Research and Training; SAGER: Sex and Gender Equity in Research; SDG: Sustainable Development Goal; UNICEF: United Nations Children's Fund; WAZ: Weight-for-Age Z-Score; WHO: World Health Organization; WH</w:t>
-      </w:r>
-      <w:bookmarkStart w:id="1" w:name="_GoBack"/>
-      <w:bookmarkEnd w:id="1"/>
-      <w:r>
-        <w:rPr>
-          <w:rFonts w:ascii="Times New Roman" w:hAnsi="Times New Roman" w:cs="Times New Roman"/>
-          <w:color w:val="002060"/>
-        </w:rPr>
-        <w:t>Z: Weight-for-Height Z-Score.</w:t>
+        <w:t>AIC: Akaike Information Criterion; AOR: Adjusted Odds Ratio; BDHS: Bangladesh Demographic and Health Survey; BIC: Bayesian Information Criterion; CI: Confidence Interval; df: Degrees of Freedom; EA: Enumeration Area; GVIF: Generalized Variance Inflation Factor; HAZ: Height-for-Age Z-Score; ICC: Intraclass Correlation Coefficient; LMICs: Low- and Middle-Income Countries; LRT: Likelihood Ratio Test; MOR: Median Odds Ratio; NIPORT: National Institute of Population Research and Training; SAGER: Sex and Gender Equity in Research; SDG: Sustainable Development Goal; UNICEF: United Nations Children's Fund; WAZ: Weight-for-Age Z-Score; WHO: World Health Organization; WHZ: Weight-for-Height Z-Score.</w:t>
       </w:r>
     </w:p>
     <w:p>
@@ -39420,37 +37340,12 @@
         </w:rPr>
         <w:t xml:space="preserve">Mst. </w:t>
       </w:r>
-      <w:proofErr w:type="spellStart"/>
       <w:r>
         <w:rPr>
           <w:rFonts w:ascii="Times New Roman" w:hAnsi="Times New Roman" w:cs="Times New Roman"/>
           <w:color w:val="000000"/>
         </w:rPr>
-        <w:t>Jakia</w:t>
-      </w:r>
-      <w:proofErr w:type="spellEnd"/>
-      <w:r>
-        <w:rPr>
-          <w:rFonts w:ascii="Times New Roman" w:hAnsi="Times New Roman" w:cs="Times New Roman"/>
-          <w:color w:val="000000"/>
-        </w:rPr>
-        <w:t xml:space="preserve"> Afrin: Conceptualization, Data Curation, Methodology, Software, Formal Analyses, Writing- Draft. Omar </w:t>
-      </w:r>
-      <w:proofErr w:type="spellStart"/>
-      <w:r>
-        <w:rPr>
-          <w:rFonts w:ascii="Times New Roman" w:hAnsi="Times New Roman" w:cs="Times New Roman"/>
-          <w:color w:val="000000"/>
-        </w:rPr>
-        <w:t>Faroque</w:t>
-      </w:r>
-      <w:proofErr w:type="spellEnd"/>
-      <w:r>
-        <w:rPr>
-          <w:rFonts w:ascii="Times New Roman" w:hAnsi="Times New Roman" w:cs="Times New Roman"/>
-          <w:color w:val="000000"/>
-        </w:rPr>
-        <w:t xml:space="preserve">: Data Curation, </w:t>
+        <w:t xml:space="preserve">Jakia Afrin: Conceptualization, Data Curation, Methodology, Software, Formal Analyses, Writing- Draft. Omar Faroque: Data Curation, </w:t>
       </w:r>
       <w:r>
         <w:rPr>
@@ -39458,7 +37353,21 @@
           <w:color w:val="000000"/>
         </w:rPr>
         <w:lastRenderedPageBreak/>
-        <w:t xml:space="preserve">Methodology, Software, Formal Analyses, Writing- Draft. </w:t>
+        <w:t>Methodology, Software, Formal Analyses,</w:t>
+      </w:r>
+      <w:r>
+        <w:rPr>
+          <w:rFonts w:ascii="Times New Roman" w:hAnsi="Times New Roman" w:cs="Times New Roman"/>
+          <w:color w:val="000000"/>
+        </w:rPr>
+        <w:t xml:space="preserve"> Visualization,</w:t>
+      </w:r>
+      <w:r>
+        <w:rPr>
+          <w:rFonts w:ascii="Times New Roman" w:hAnsi="Times New Roman" w:cs="Times New Roman"/>
+          <w:color w:val="000000"/>
+        </w:rPr>
+        <w:t xml:space="preserve"> Writing- Draft. </w:t>
       </w:r>
       <w:r>
         <w:rPr>
@@ -39467,37 +37376,12 @@
         </w:rPr>
         <w:t xml:space="preserve">Md. </w:t>
       </w:r>
-      <w:proofErr w:type="spellStart"/>
       <w:r>
         <w:rPr>
           <w:rFonts w:ascii="Times New Roman" w:hAnsi="Times New Roman" w:cs="Times New Roman"/>
           <w:color w:val="000000"/>
         </w:rPr>
-        <w:t>Lotifur</w:t>
-      </w:r>
-      <w:proofErr w:type="spellEnd"/>
-      <w:r>
-        <w:rPr>
-          <w:rFonts w:ascii="Times New Roman" w:hAnsi="Times New Roman" w:cs="Times New Roman"/>
-          <w:color w:val="000000"/>
-        </w:rPr>
-        <w:t xml:space="preserve"> </w:t>
-      </w:r>
-      <w:proofErr w:type="spellStart"/>
-      <w:r>
-        <w:rPr>
-          <w:rFonts w:ascii="Times New Roman" w:hAnsi="Times New Roman" w:cs="Times New Roman"/>
-          <w:color w:val="000000"/>
-        </w:rPr>
-        <w:t>Rohman</w:t>
-      </w:r>
-      <w:proofErr w:type="spellEnd"/>
-      <w:r>
-        <w:rPr>
-          <w:rFonts w:ascii="Times New Roman" w:hAnsi="Times New Roman" w:cs="Times New Roman"/>
-          <w:color w:val="000000"/>
-        </w:rPr>
-        <w:t xml:space="preserve">: Methodology, Software, Formal Analyses, Visualization, Writing- Draft. </w:t>
+        <w:t xml:space="preserve">Lotifur Rohman: Methodology, Software, Formal Analyses, Visualization, Writing- Draft. </w:t>
       </w:r>
       <w:r>
         <w:rPr>
@@ -39506,53 +37390,20 @@
         </w:rPr>
         <w:t xml:space="preserve">Md. </w:t>
       </w:r>
-      <w:proofErr w:type="spellStart"/>
       <w:r>
         <w:rPr>
           <w:rFonts w:ascii="Times New Roman" w:hAnsi="Times New Roman" w:cs="Times New Roman"/>
           <w:color w:val="000000"/>
         </w:rPr>
-        <w:t>Mahamudul</w:t>
+        <w:t>Mahamudul Islam: Methodology, Software, Formal Analyses, Visualization, Writing- Draft. Sheli Shikdar: Conceptualization, Formal Analyses, Writing-Review &amp; Editing.</w:t>
       </w:r>
-      <w:proofErr w:type="spellEnd"/>
       <w:r>
         <w:rPr>
-          <w:rFonts w:ascii="Times New Roman" w:hAnsi="Times New Roman" w:cs="Times New Roman"/>
-          <w:color w:val="000000"/>
+          <w:rFonts w:ascii="Times New Roman" w:hAnsi="Times New Roman"/>
+          <w:b/>
+          <w:color w:val="002060"/>
         </w:rPr>
-        <w:t xml:space="preserve"> Islam: Methodology, Software, Formal Analyses, Visualization, Writing- Draft. </w:t>
-      </w:r>
-      <w:proofErr w:type="spellStart"/>
-      <w:r>
-        <w:rPr>
-          <w:rFonts w:ascii="Times New Roman" w:hAnsi="Times New Roman" w:cs="Times New Roman"/>
-          <w:color w:val="000000"/>
-        </w:rPr>
-        <w:t>Sheli</w:t>
-      </w:r>
-      <w:proofErr w:type="spellEnd"/>
-      <w:r>
-        <w:rPr>
-          <w:rFonts w:ascii="Times New Roman" w:hAnsi="Times New Roman" w:cs="Times New Roman"/>
-          <w:color w:val="000000"/>
-        </w:rPr>
-        <w:t xml:space="preserve"> </w:t>
-      </w:r>
-      <w:proofErr w:type="spellStart"/>
-      <w:r>
-        <w:rPr>
-          <w:rFonts w:ascii="Times New Roman" w:hAnsi="Times New Roman" w:cs="Times New Roman"/>
-          <w:color w:val="000000"/>
-        </w:rPr>
-        <w:t>Shikdar</w:t>
-      </w:r>
-      <w:proofErr w:type="spellEnd"/>
-      <w:r>
-        <w:rPr>
-          <w:rFonts w:ascii="Times New Roman" w:hAnsi="Times New Roman" w:cs="Times New Roman"/>
-          <w:color w:val="000000"/>
-        </w:rPr>
-        <w:t>: Conceptualization, Formal Analyses, Writing-Review &amp; Editing.</w:t>
+        <w:t xml:space="preserve"> Suman Biswas acts as guarantor for the paper, accepts full responsibility for the finished work and conduct of the study, had full access to the data, and controlled the decision to publish.</w:t>
       </w:r>
     </w:p>
     <w:p>
@@ -39669,23 +37520,7 @@
           <w:rFonts w:ascii="Times New Roman" w:hAnsi="Times New Roman" w:cs="Times New Roman"/>
           <w:color w:val="000000"/>
         </w:rPr>
-        <w:t xml:space="preserve">This study </w:t>
-      </w:r>
-      <w:proofErr w:type="gramStart"/>
-      <w:r>
-        <w:rPr>
-          <w:rFonts w:ascii="Times New Roman" w:hAnsi="Times New Roman" w:cs="Times New Roman"/>
-          <w:color w:val="000000"/>
-        </w:rPr>
-        <w:t>was based</w:t>
-      </w:r>
-      <w:proofErr w:type="gramEnd"/>
-      <w:r>
-        <w:rPr>
-          <w:rFonts w:ascii="Times New Roman" w:hAnsi="Times New Roman" w:cs="Times New Roman"/>
-          <w:color w:val="000000"/>
-        </w:rPr>
-        <w:t xml:space="preserve"> on a secondary analysis of publicly available, anonymized data from the Bangladesh Demographic and Health Survey (BDHS) 2022; therefore, direct patient or public involvement was not appropriate or feasible.</w:t>
+        <w:t>This study was based on a secondary analysis of publicly available, anonymized data from the Bangladesh Demographic and Health Survey (BDHS) 2022; therefore, direct patient or public involvement was not appropriate or feasible.</w:t>
       </w:r>
     </w:p>
     <w:p>
@@ -39722,23 +37557,7 @@
           <w:rFonts w:ascii="Times New Roman" w:hAnsi="Times New Roman" w:cs="Times New Roman"/>
           <w:color w:val="000000"/>
         </w:rPr>
-        <w:t xml:space="preserve">Ethical approval for BDHS 2022 </w:t>
-      </w:r>
-      <w:proofErr w:type="gramStart"/>
-      <w:r>
-        <w:rPr>
-          <w:rFonts w:ascii="Times New Roman" w:hAnsi="Times New Roman" w:cs="Times New Roman"/>
-          <w:color w:val="000000"/>
-        </w:rPr>
-        <w:t>was obtained</w:t>
-      </w:r>
-      <w:proofErr w:type="gramEnd"/>
-      <w:r>
-        <w:rPr>
-          <w:rFonts w:ascii="Times New Roman" w:hAnsi="Times New Roman" w:cs="Times New Roman"/>
-          <w:color w:val="000000"/>
-        </w:rPr>
-        <w:t xml:space="preserve"> from the ICF Institutional Review Board and the Bangladesh Medical Research Council. The present study used anonymized publicly available secondary data and therefore did not require additional ethical approval.</w:t>
+        <w:t>Ethical approval for BDHS 2022 was obtained from the ICF Institutional Review Board and the Bangladesh Medical Research Council. The present study used anonymized publicly available secondary data and therefore did not require additional ethical approval.</w:t>
       </w:r>
     </w:p>
     <w:p>
@@ -39815,23 +37634,7 @@
           <w:rFonts w:ascii="Times New Roman" w:hAnsi="Times New Roman" w:cs="Times New Roman"/>
           <w:color w:val="000000"/>
         </w:rPr>
-        <w:t xml:space="preserve">The dataset </w:t>
-      </w:r>
-      <w:proofErr w:type="gramStart"/>
-      <w:r>
-        <w:rPr>
-          <w:rFonts w:ascii="Times New Roman" w:hAnsi="Times New Roman" w:cs="Times New Roman"/>
-          <w:color w:val="000000"/>
-        </w:rPr>
-        <w:t>was obtained</w:t>
-      </w:r>
-      <w:proofErr w:type="gramEnd"/>
-      <w:r>
-        <w:rPr>
-          <w:rFonts w:ascii="Times New Roman" w:hAnsi="Times New Roman" w:cs="Times New Roman"/>
-          <w:color w:val="000000"/>
-        </w:rPr>
-        <w:t xml:space="preserve"> from the DHS Program website (https://dhsprogram.com/data/available-datasets.cfm) in response to a formal request outlining the study objectives.</w:t>
+        <w:t>The dataset was obtained from the DHS Program website (https://dhsprogram.com/data/available-datasets.cfm) in response to a formal request outlining the study objectives.</w:t>
       </w:r>
     </w:p>
     <w:p>
@@ -40038,57 +37841,7 @@
           <w:color w:val="002060"/>
         </w:rPr>
         <w:tab/>
-        <w:t xml:space="preserve">Black RE, </w:t>
-      </w:r>
-      <w:proofErr w:type="spellStart"/>
-      <w:r>
-        <w:rPr>
-          <w:rFonts w:ascii="Times New Roman" w:hAnsi="Times New Roman" w:cs="Times New Roman"/>
-          <w:color w:val="002060"/>
-        </w:rPr>
-        <w:t>Victora</w:t>
-      </w:r>
-      <w:proofErr w:type="spellEnd"/>
-      <w:r>
-        <w:rPr>
-          <w:rFonts w:ascii="Times New Roman" w:hAnsi="Times New Roman" w:cs="Times New Roman"/>
-          <w:color w:val="002060"/>
-        </w:rPr>
-        <w:t xml:space="preserve"> CG, Walker SP, et al. Maternal and child undernutrition and overweight in low-income and middle-income countries. The Lancet. 2013</w:t>
-      </w:r>
-      <w:proofErr w:type="gramStart"/>
-      <w:r>
-        <w:rPr>
-          <w:rFonts w:ascii="Times New Roman" w:hAnsi="Times New Roman" w:cs="Times New Roman"/>
-          <w:color w:val="002060"/>
-        </w:rPr>
-        <w:t>;382:427</w:t>
-      </w:r>
-      <w:proofErr w:type="gramEnd"/>
-      <w:r>
-        <w:rPr>
-          <w:rFonts w:ascii="Times New Roman" w:hAnsi="Times New Roman" w:cs="Times New Roman"/>
-          <w:color w:val="002060"/>
-        </w:rPr>
-        <w:t xml:space="preserve">–51. </w:t>
-      </w:r>
-      <w:proofErr w:type="spellStart"/>
-      <w:proofErr w:type="gramStart"/>
-      <w:r>
-        <w:rPr>
-          <w:rFonts w:ascii="Times New Roman" w:hAnsi="Times New Roman" w:cs="Times New Roman"/>
-          <w:color w:val="002060"/>
-        </w:rPr>
-        <w:t>doi</w:t>
-      </w:r>
-      <w:proofErr w:type="spellEnd"/>
-      <w:proofErr w:type="gramEnd"/>
-      <w:r>
-        <w:rPr>
-          <w:rFonts w:ascii="Times New Roman" w:hAnsi="Times New Roman" w:cs="Times New Roman"/>
-          <w:color w:val="002060"/>
-        </w:rPr>
-        <w:t>: 10.1016/S0140-6736(13)60937-X</w:t>
+        <w:t>Black RE, Victora CG, Walker SP, et al. Maternal and child undernutrition and overweight in low-income and middle-income countries. The Lancet. 2013;382:427–51. doi: 10.1016/S0140-6736(13)60937-X</w:t>
       </w:r>
     </w:p>
     <w:p>
@@ -40180,89 +37933,7 @@
           <w:color w:val="002060"/>
         </w:rPr>
         <w:tab/>
-        <w:t xml:space="preserve">De </w:t>
-      </w:r>
-      <w:proofErr w:type="spellStart"/>
-      <w:r>
-        <w:rPr>
-          <w:rFonts w:ascii="Times New Roman" w:hAnsi="Times New Roman" w:cs="Times New Roman"/>
-          <w:color w:val="002060"/>
-        </w:rPr>
-        <w:t>Onis</w:t>
-      </w:r>
-      <w:proofErr w:type="spellEnd"/>
-      <w:r>
-        <w:rPr>
-          <w:rFonts w:ascii="Times New Roman" w:hAnsi="Times New Roman" w:cs="Times New Roman"/>
-          <w:color w:val="002060"/>
-        </w:rPr>
-        <w:t xml:space="preserve"> M, </w:t>
-      </w:r>
-      <w:proofErr w:type="spellStart"/>
-      <w:r>
-        <w:rPr>
-          <w:rFonts w:ascii="Times New Roman" w:hAnsi="Times New Roman" w:cs="Times New Roman"/>
-          <w:color w:val="002060"/>
-        </w:rPr>
-        <w:t>Branca</w:t>
-      </w:r>
-      <w:proofErr w:type="spellEnd"/>
-      <w:r>
-        <w:rPr>
-          <w:rFonts w:ascii="Times New Roman" w:hAnsi="Times New Roman" w:cs="Times New Roman"/>
-          <w:color w:val="002060"/>
-        </w:rPr>
-        <w:t xml:space="preserve"> F. Childhood </w:t>
-      </w:r>
-      <w:proofErr w:type="gramStart"/>
-      <w:r>
-        <w:rPr>
-          <w:rFonts w:ascii="Times New Roman" w:hAnsi="Times New Roman" w:cs="Times New Roman"/>
-          <w:color w:val="002060"/>
-        </w:rPr>
-        <w:t>stunting:</w:t>
-      </w:r>
-      <w:proofErr w:type="gramEnd"/>
-      <w:r>
-        <w:rPr>
-          <w:rFonts w:ascii="Times New Roman" w:hAnsi="Times New Roman" w:cs="Times New Roman"/>
-          <w:color w:val="002060"/>
-        </w:rPr>
-        <w:t xml:space="preserve"> a global perspective. Maternal &amp; Child Nutrition. 2016</w:t>
-      </w:r>
-      <w:proofErr w:type="gramStart"/>
-      <w:r>
-        <w:rPr>
-          <w:rFonts w:ascii="Times New Roman" w:hAnsi="Times New Roman" w:cs="Times New Roman"/>
-          <w:color w:val="002060"/>
-        </w:rPr>
-        <w:t>;12:12</w:t>
-      </w:r>
-      <w:proofErr w:type="gramEnd"/>
-      <w:r>
-        <w:rPr>
-          <w:rFonts w:ascii="Times New Roman" w:hAnsi="Times New Roman" w:cs="Times New Roman"/>
-          <w:color w:val="002060"/>
-        </w:rPr>
-        <w:t xml:space="preserve">–26. </w:t>
-      </w:r>
-      <w:proofErr w:type="spellStart"/>
-      <w:proofErr w:type="gramStart"/>
-      <w:r>
-        <w:rPr>
-          <w:rFonts w:ascii="Times New Roman" w:hAnsi="Times New Roman" w:cs="Times New Roman"/>
-          <w:color w:val="002060"/>
-        </w:rPr>
-        <w:t>doi</w:t>
-      </w:r>
-      <w:proofErr w:type="spellEnd"/>
-      <w:proofErr w:type="gramEnd"/>
-      <w:r>
-        <w:rPr>
-          <w:rFonts w:ascii="Times New Roman" w:hAnsi="Times New Roman" w:cs="Times New Roman"/>
-          <w:color w:val="002060"/>
-        </w:rPr>
-        <w:t>: 10.1111/mcn.12231</w:t>
+        <w:t>De Onis M, Branca F. Childhood stunting: a global perspective. Maternal &amp; Child Nutrition. 2016;12:12–26. doi: 10.1111/mcn.12231</w:t>
       </w:r>
     </w:p>
     <w:p>
@@ -40321,9 +37992,10 @@
       <w:r>
         <w:rPr>
           <w:rFonts w:ascii="Times New Roman" w:hAnsi="Times New Roman" w:cs="Times New Roman"/>
+          <w:b/>
           <w:color w:val="002060"/>
         </w:rPr>
-        <w:t xml:space="preserve">9 </w:t>
+        <w:t xml:space="preserve">[dataset] 9 </w:t>
       </w:r>
       <w:r>
         <w:rPr>
@@ -40331,23 +38003,7 @@
           <w:color w:val="002060"/>
         </w:rPr>
         <w:tab/>
-        <w:t xml:space="preserve">National Institute of Population Research and Training (NIPORT), </w:t>
-      </w:r>
-      <w:proofErr w:type="spellStart"/>
-      <w:r>
-        <w:rPr>
-          <w:rFonts w:ascii="Times New Roman" w:hAnsi="Times New Roman" w:cs="Times New Roman"/>
-          <w:color w:val="002060"/>
-        </w:rPr>
-        <w:t>Mitra</w:t>
-      </w:r>
-      <w:proofErr w:type="spellEnd"/>
-      <w:r>
-        <w:rPr>
-          <w:rFonts w:ascii="Times New Roman" w:hAnsi="Times New Roman" w:cs="Times New Roman"/>
-          <w:color w:val="002060"/>
-        </w:rPr>
-        <w:t xml:space="preserve"> and Associates, ICF. Bangladesh Demographic and Health Survey 2022: Final Report. Dhaka, Bangladesh, and Rockville, Maryland, USA: NIPORT and ICF 2024.</w:t>
+        <w:t>National Institute of Population Research and Training (NIPORT), Mitra and Associates, ICF. Bangladesh Demographic and Health Survey 2022: Final Report. Dhaka, Bangladesh, and Rockville, Maryland, USA: NIPORT and ICF 2024.</w:t>
       </w:r>
     </w:p>
     <w:p>
@@ -40370,73 +38026,7 @@
           <w:color w:val="002060"/>
         </w:rPr>
         <w:tab/>
-        <w:t xml:space="preserve">Das S, </w:t>
-      </w:r>
-      <w:proofErr w:type="spellStart"/>
-      <w:r>
-        <w:rPr>
-          <w:rFonts w:ascii="Times New Roman" w:hAnsi="Times New Roman" w:cs="Times New Roman"/>
-          <w:color w:val="002060"/>
-        </w:rPr>
-        <w:t>Gulshan</w:t>
-      </w:r>
-      <w:proofErr w:type="spellEnd"/>
-      <w:r>
-        <w:rPr>
-          <w:rFonts w:ascii="Times New Roman" w:hAnsi="Times New Roman" w:cs="Times New Roman"/>
-          <w:color w:val="002060"/>
-        </w:rPr>
-        <w:t xml:space="preserve"> J. Different forms of malnutrition among under five children in Bangladesh: a cross sectional study on prevalence and determinants. BMC </w:t>
-      </w:r>
-      <w:proofErr w:type="spellStart"/>
-      <w:r>
-        <w:rPr>
-          <w:rFonts w:ascii="Times New Roman" w:hAnsi="Times New Roman" w:cs="Times New Roman"/>
-          <w:color w:val="002060"/>
-        </w:rPr>
-        <w:t>Nutr</w:t>
-      </w:r>
-      <w:proofErr w:type="spellEnd"/>
-      <w:r>
-        <w:rPr>
-          <w:rFonts w:ascii="Times New Roman" w:hAnsi="Times New Roman" w:cs="Times New Roman"/>
-          <w:color w:val="002060"/>
-        </w:rPr>
-        <w:t>. 2017</w:t>
-      </w:r>
-      <w:proofErr w:type="gramStart"/>
-      <w:r>
-        <w:rPr>
-          <w:rFonts w:ascii="Times New Roman" w:hAnsi="Times New Roman" w:cs="Times New Roman"/>
-          <w:color w:val="002060"/>
-        </w:rPr>
-        <w:t>;3:1</w:t>
-      </w:r>
-      <w:proofErr w:type="gramEnd"/>
-      <w:r>
-        <w:rPr>
-          <w:rFonts w:ascii="Times New Roman" w:hAnsi="Times New Roman" w:cs="Times New Roman"/>
-          <w:color w:val="002060"/>
-        </w:rPr>
-        <w:t xml:space="preserve">. </w:t>
-      </w:r>
-      <w:proofErr w:type="spellStart"/>
-      <w:proofErr w:type="gramStart"/>
-      <w:r>
-        <w:rPr>
-          <w:rFonts w:ascii="Times New Roman" w:hAnsi="Times New Roman" w:cs="Times New Roman"/>
-          <w:color w:val="002060"/>
-        </w:rPr>
-        <w:t>doi</w:t>
-      </w:r>
-      <w:proofErr w:type="spellEnd"/>
-      <w:proofErr w:type="gramEnd"/>
-      <w:r>
-        <w:rPr>
-          <w:rFonts w:ascii="Times New Roman" w:hAnsi="Times New Roman" w:cs="Times New Roman"/>
-          <w:color w:val="002060"/>
-        </w:rPr>
-        <w:t>: 10.1186/s40795-016-0122-2</w:t>
+        <w:t>Das S, Gulshan J. Different forms of malnutrition among under five children in Bangladesh: a cross sectional study on prevalence and determinants. BMC Nutr. 2017;3:1. doi: 10.1186/s40795-016-0122-2</w:t>
       </w:r>
     </w:p>
     <w:p>
@@ -40459,73 +38049,7 @@
           <w:color w:val="002060"/>
         </w:rPr>
         <w:tab/>
-        <w:t xml:space="preserve">Khan MMA, </w:t>
-      </w:r>
-      <w:proofErr w:type="spellStart"/>
-      <w:r>
-        <w:rPr>
-          <w:rFonts w:ascii="Times New Roman" w:hAnsi="Times New Roman" w:cs="Times New Roman"/>
-          <w:color w:val="002060"/>
-        </w:rPr>
-        <w:t>Billah</w:t>
-      </w:r>
-      <w:proofErr w:type="spellEnd"/>
-      <w:r>
-        <w:rPr>
-          <w:rFonts w:ascii="Times New Roman" w:hAnsi="Times New Roman" w:cs="Times New Roman"/>
-          <w:color w:val="002060"/>
-        </w:rPr>
-        <w:t xml:space="preserve"> MA, Fatima K, et al. Child undernutrition and its association with household environmental conditions in Bangladesh. Public Health </w:t>
-      </w:r>
-      <w:proofErr w:type="spellStart"/>
-      <w:r>
-        <w:rPr>
-          <w:rFonts w:ascii="Times New Roman" w:hAnsi="Times New Roman" w:cs="Times New Roman"/>
-          <w:color w:val="002060"/>
-        </w:rPr>
-        <w:t>Nutr</w:t>
-      </w:r>
-      <w:proofErr w:type="spellEnd"/>
-      <w:r>
-        <w:rPr>
-          <w:rFonts w:ascii="Times New Roman" w:hAnsi="Times New Roman" w:cs="Times New Roman"/>
-          <w:color w:val="002060"/>
-        </w:rPr>
-        <w:t>. 2025</w:t>
-      </w:r>
-      <w:proofErr w:type="gramStart"/>
-      <w:r>
-        <w:rPr>
-          <w:rFonts w:ascii="Times New Roman" w:hAnsi="Times New Roman" w:cs="Times New Roman"/>
-          <w:color w:val="002060"/>
-        </w:rPr>
-        <w:t>;28:e3</w:t>
-      </w:r>
-      <w:proofErr w:type="gramEnd"/>
-      <w:r>
-        <w:rPr>
-          <w:rFonts w:ascii="Times New Roman" w:hAnsi="Times New Roman" w:cs="Times New Roman"/>
-          <w:color w:val="002060"/>
-        </w:rPr>
-        <w:t xml:space="preserve">. </w:t>
-      </w:r>
-      <w:proofErr w:type="spellStart"/>
-      <w:proofErr w:type="gramStart"/>
-      <w:r>
-        <w:rPr>
-          <w:rFonts w:ascii="Times New Roman" w:hAnsi="Times New Roman" w:cs="Times New Roman"/>
-          <w:color w:val="002060"/>
-        </w:rPr>
-        <w:t>doi</w:t>
-      </w:r>
-      <w:proofErr w:type="spellEnd"/>
-      <w:proofErr w:type="gramEnd"/>
-      <w:r>
-        <w:rPr>
-          <w:rFonts w:ascii="Times New Roman" w:hAnsi="Times New Roman" w:cs="Times New Roman"/>
-          <w:color w:val="002060"/>
-        </w:rPr>
-        <w:t>: 10.1017/S1368980024002325</w:t>
+        <w:t>Khan MMA, Billah MA, Fatima K, et al. Child undernutrition and its association with household environmental conditions in Bangladesh. Public Health Nutr. 2025;28:e3. doi: 10.1017/S1368980024002325</w:t>
       </w:r>
     </w:p>
     <w:p>
@@ -40548,89 +38072,7 @@
           <w:color w:val="002060"/>
         </w:rPr>
         <w:tab/>
-        <w:t xml:space="preserve">Sultana P, Rahman </w:t>
-      </w:r>
-      <w:proofErr w:type="spellStart"/>
-      <w:r>
-        <w:rPr>
-          <w:rFonts w:ascii="Times New Roman" w:hAnsi="Times New Roman" w:cs="Times New Roman"/>
-          <w:color w:val="002060"/>
-        </w:rPr>
-        <w:t>MdM</w:t>
-      </w:r>
-      <w:proofErr w:type="spellEnd"/>
-      <w:r>
-        <w:rPr>
-          <w:rFonts w:ascii="Times New Roman" w:hAnsi="Times New Roman" w:cs="Times New Roman"/>
-          <w:color w:val="002060"/>
-        </w:rPr>
-        <w:t xml:space="preserve">, </w:t>
-      </w:r>
-      <w:proofErr w:type="spellStart"/>
-      <w:r>
-        <w:rPr>
-          <w:rFonts w:ascii="Times New Roman" w:hAnsi="Times New Roman" w:cs="Times New Roman"/>
-          <w:color w:val="002060"/>
-        </w:rPr>
-        <w:t>Akter</w:t>
-      </w:r>
-      <w:proofErr w:type="spellEnd"/>
-      <w:r>
-        <w:rPr>
-          <w:rFonts w:ascii="Times New Roman" w:hAnsi="Times New Roman" w:cs="Times New Roman"/>
-          <w:color w:val="002060"/>
-        </w:rPr>
-        <w:t xml:space="preserve"> J. Correlates of stunting among under-five children in Bangladesh: a multilevel approach. BMC </w:t>
-      </w:r>
-      <w:proofErr w:type="spellStart"/>
-      <w:r>
-        <w:rPr>
-          <w:rFonts w:ascii="Times New Roman" w:hAnsi="Times New Roman" w:cs="Times New Roman"/>
-          <w:color w:val="002060"/>
-        </w:rPr>
-        <w:t>Nutr</w:t>
-      </w:r>
-      <w:proofErr w:type="spellEnd"/>
-      <w:r>
-        <w:rPr>
-          <w:rFonts w:ascii="Times New Roman" w:hAnsi="Times New Roman" w:cs="Times New Roman"/>
-          <w:color w:val="002060"/>
-        </w:rPr>
-        <w:t>. 2019</w:t>
-      </w:r>
-      <w:proofErr w:type="gramStart"/>
-      <w:r>
-        <w:rPr>
-          <w:rFonts w:ascii="Times New Roman" w:hAnsi="Times New Roman" w:cs="Times New Roman"/>
-          <w:color w:val="002060"/>
-        </w:rPr>
-        <w:t>;5:41</w:t>
-      </w:r>
-      <w:proofErr w:type="gramEnd"/>
-      <w:r>
-        <w:rPr>
-          <w:rFonts w:ascii="Times New Roman" w:hAnsi="Times New Roman" w:cs="Times New Roman"/>
-          <w:color w:val="002060"/>
-        </w:rPr>
-        <w:t xml:space="preserve">. </w:t>
-      </w:r>
-      <w:proofErr w:type="spellStart"/>
-      <w:proofErr w:type="gramStart"/>
-      <w:r>
-        <w:rPr>
-          <w:rFonts w:ascii="Times New Roman" w:hAnsi="Times New Roman" w:cs="Times New Roman"/>
-          <w:color w:val="002060"/>
-        </w:rPr>
-        <w:t>doi</w:t>
-      </w:r>
-      <w:proofErr w:type="spellEnd"/>
-      <w:proofErr w:type="gramEnd"/>
-      <w:r>
-        <w:rPr>
-          <w:rFonts w:ascii="Times New Roman" w:hAnsi="Times New Roman" w:cs="Times New Roman"/>
-          <w:color w:val="002060"/>
-        </w:rPr>
-        <w:t>: 10.1186/s40795-019-0304-9</w:t>
+        <w:t>Sultana P, Rahman MdM, Akter J. Correlates of stunting among under-five children in Bangladesh: a multilevel approach. BMC Nutr. 2019;5:41. doi: 10.1186/s40795-019-0304-9</w:t>
       </w:r>
     </w:p>
     <w:p>
@@ -40653,72 +38095,7 @@
           <w:color w:val="002060"/>
         </w:rPr>
         <w:tab/>
-      </w:r>
-      <w:proofErr w:type="spellStart"/>
-      <w:r>
-        <w:rPr>
-          <w:rFonts w:ascii="Times New Roman" w:hAnsi="Times New Roman" w:cs="Times New Roman"/>
-          <w:color w:val="002060"/>
-        </w:rPr>
-        <w:t>Zaber</w:t>
-      </w:r>
-      <w:proofErr w:type="spellEnd"/>
-      <w:r>
-        <w:rPr>
-          <w:rFonts w:ascii="Times New Roman" w:hAnsi="Times New Roman" w:cs="Times New Roman"/>
-          <w:color w:val="002060"/>
-        </w:rPr>
-        <w:t xml:space="preserve"> AA, Islam US, Mahmud MA, et al. Childhood obesity in Bangladesh: an emerging public health crisis. Asian J Med </w:t>
-      </w:r>
-      <w:proofErr w:type="spellStart"/>
-      <w:r>
-        <w:rPr>
-          <w:rFonts w:ascii="Times New Roman" w:hAnsi="Times New Roman" w:cs="Times New Roman"/>
-          <w:color w:val="002060"/>
-        </w:rPr>
-        <w:t>Biol</w:t>
-      </w:r>
-      <w:proofErr w:type="spellEnd"/>
-      <w:r>
-        <w:rPr>
-          <w:rFonts w:ascii="Times New Roman" w:hAnsi="Times New Roman" w:cs="Times New Roman"/>
-          <w:color w:val="002060"/>
-        </w:rPr>
-        <w:t xml:space="preserve"> Res. 2026</w:t>
-      </w:r>
-      <w:proofErr w:type="gramStart"/>
-      <w:r>
-        <w:rPr>
-          <w:rFonts w:ascii="Times New Roman" w:hAnsi="Times New Roman" w:cs="Times New Roman"/>
-          <w:color w:val="002060"/>
-        </w:rPr>
-        <w:t>;12:5</w:t>
-      </w:r>
-      <w:proofErr w:type="gramEnd"/>
-      <w:r>
-        <w:rPr>
-          <w:rFonts w:ascii="Times New Roman" w:hAnsi="Times New Roman" w:cs="Times New Roman"/>
-          <w:color w:val="002060"/>
-        </w:rPr>
-        <w:t xml:space="preserve">–15. </w:t>
-      </w:r>
-      <w:proofErr w:type="spellStart"/>
-      <w:proofErr w:type="gramStart"/>
-      <w:r>
-        <w:rPr>
-          <w:rFonts w:ascii="Times New Roman" w:hAnsi="Times New Roman" w:cs="Times New Roman"/>
-          <w:color w:val="002060"/>
-        </w:rPr>
-        <w:t>doi</w:t>
-      </w:r>
-      <w:proofErr w:type="spellEnd"/>
-      <w:proofErr w:type="gramEnd"/>
-      <w:r>
-        <w:rPr>
-          <w:rFonts w:ascii="Times New Roman" w:hAnsi="Times New Roman" w:cs="Times New Roman"/>
-          <w:color w:val="002060"/>
-        </w:rPr>
-        <w:t>: 10.3329/ajmbr.v12i1.84144</w:t>
+        <w:t>Zaber AA, Islam US, Mahmud MA, et al. Childhood obesity in Bangladesh: an emerging public health crisis. Asian J Med Biol Res. 2026;12:5–15. doi: 10.3329/ajmbr.v12i1.84144</w:t>
       </w:r>
     </w:p>
     <w:p>
@@ -40741,57 +38118,7 @@
           <w:color w:val="002060"/>
         </w:rPr>
         <w:tab/>
-        <w:t xml:space="preserve">Kumar P, </w:t>
-      </w:r>
-      <w:proofErr w:type="spellStart"/>
-      <w:r>
-        <w:rPr>
-          <w:rFonts w:ascii="Times New Roman" w:hAnsi="Times New Roman" w:cs="Times New Roman"/>
-          <w:color w:val="002060"/>
-        </w:rPr>
-        <w:t>Rashmi</w:t>
-      </w:r>
-      <w:proofErr w:type="spellEnd"/>
-      <w:r>
-        <w:rPr>
-          <w:rFonts w:ascii="Times New Roman" w:hAnsi="Times New Roman" w:cs="Times New Roman"/>
-          <w:color w:val="002060"/>
-        </w:rPr>
-        <w:t xml:space="preserve"> R, Muhammad T, et al. Factors contributing to the reduction in childhood stunting in Bangladesh: a pooled data analysis from the Bangladesh demographic and health surveys of 2004 and 2017–18. BMC Public Health. 2021</w:t>
-      </w:r>
-      <w:proofErr w:type="gramStart"/>
-      <w:r>
-        <w:rPr>
-          <w:rFonts w:ascii="Times New Roman" w:hAnsi="Times New Roman" w:cs="Times New Roman"/>
-          <w:color w:val="002060"/>
-        </w:rPr>
-        <w:t>;21:2101</w:t>
-      </w:r>
-      <w:proofErr w:type="gramEnd"/>
-      <w:r>
-        <w:rPr>
-          <w:rFonts w:ascii="Times New Roman" w:hAnsi="Times New Roman" w:cs="Times New Roman"/>
-          <w:color w:val="002060"/>
-        </w:rPr>
-        <w:t xml:space="preserve">. </w:t>
-      </w:r>
-      <w:proofErr w:type="spellStart"/>
-      <w:proofErr w:type="gramStart"/>
-      <w:r>
-        <w:rPr>
-          <w:rFonts w:ascii="Times New Roman" w:hAnsi="Times New Roman" w:cs="Times New Roman"/>
-          <w:color w:val="002060"/>
-        </w:rPr>
-        <w:t>doi</w:t>
-      </w:r>
-      <w:proofErr w:type="spellEnd"/>
-      <w:proofErr w:type="gramEnd"/>
-      <w:r>
-        <w:rPr>
-          <w:rFonts w:ascii="Times New Roman" w:hAnsi="Times New Roman" w:cs="Times New Roman"/>
-          <w:color w:val="002060"/>
-        </w:rPr>
-        <w:t>: 10.1186/s12889-021-12178-6</w:t>
+        <w:t>Kumar P, Rashmi R, Muhammad T, et al. Factors contributing to the reduction in childhood stunting in Bangladesh: a pooled data analysis from the Bangladesh demographic and health surveys of 2004 and 2017–18. BMC Public Health. 2021;21:2101. doi: 10.1186/s12889-021-12178-6</w:t>
       </w:r>
     </w:p>
     <w:p>
@@ -40814,39 +38141,7 @@
           <w:color w:val="002060"/>
         </w:rPr>
         <w:tab/>
-        <w:t xml:space="preserve">Uddin MI, </w:t>
-      </w:r>
-      <w:proofErr w:type="spellStart"/>
-      <w:r>
-        <w:rPr>
-          <w:rFonts w:ascii="Times New Roman" w:hAnsi="Times New Roman" w:cs="Times New Roman"/>
-          <w:color w:val="002060"/>
-        </w:rPr>
-        <w:t>Bhuyan</w:t>
-      </w:r>
-      <w:proofErr w:type="spellEnd"/>
-      <w:r>
-        <w:rPr>
-          <w:rFonts w:ascii="Times New Roman" w:hAnsi="Times New Roman" w:cs="Times New Roman"/>
-          <w:color w:val="002060"/>
-        </w:rPr>
-        <w:t xml:space="preserve"> KC, Islam SS. Determinants of desired family size and children ever born in Bangladesh. The Journal of Family Welfare. 2011</w:t>
-      </w:r>
-      <w:proofErr w:type="gramStart"/>
-      <w:r>
-        <w:rPr>
-          <w:rFonts w:ascii="Times New Roman" w:hAnsi="Times New Roman" w:cs="Times New Roman"/>
-          <w:color w:val="002060"/>
-        </w:rPr>
-        <w:t>;57:39</w:t>
-      </w:r>
-      <w:proofErr w:type="gramEnd"/>
-      <w:r>
-        <w:rPr>
-          <w:rFonts w:ascii="Times New Roman" w:hAnsi="Times New Roman" w:cs="Times New Roman"/>
-          <w:color w:val="002060"/>
-        </w:rPr>
-        <w:t>–47.</w:t>
+        <w:t>Uddin MI, Bhuyan KC, Islam SS. Determinants of desired family size and children ever born in Bangladesh. The Journal of Family Welfare. 2011;57:39–47.</w:t>
       </w:r>
     </w:p>
     <w:p>
@@ -40870,89 +38165,7 @@
           <w:color w:val="002060"/>
         </w:rPr>
         <w:tab/>
-        <w:t xml:space="preserve">Hossain </w:t>
-      </w:r>
-      <w:proofErr w:type="spellStart"/>
-      <w:r>
-        <w:rPr>
-          <w:rFonts w:ascii="Times New Roman" w:hAnsi="Times New Roman" w:cs="Times New Roman"/>
-          <w:color w:val="002060"/>
-        </w:rPr>
-        <w:t>MdA</w:t>
-      </w:r>
-      <w:proofErr w:type="spellEnd"/>
-      <w:r>
-        <w:rPr>
-          <w:rFonts w:ascii="Times New Roman" w:hAnsi="Times New Roman" w:cs="Times New Roman"/>
-          <w:color w:val="002060"/>
-        </w:rPr>
-        <w:t xml:space="preserve">, Das NC, </w:t>
-      </w:r>
-      <w:proofErr w:type="spellStart"/>
-      <w:r>
-        <w:rPr>
-          <w:rFonts w:ascii="Times New Roman" w:hAnsi="Times New Roman" w:cs="Times New Roman"/>
-          <w:color w:val="002060"/>
-        </w:rPr>
-        <w:t>Tariqujjaman</w:t>
-      </w:r>
-      <w:proofErr w:type="spellEnd"/>
-      <w:r>
-        <w:rPr>
-          <w:rFonts w:ascii="Times New Roman" w:hAnsi="Times New Roman" w:cs="Times New Roman"/>
-          <w:color w:val="002060"/>
-        </w:rPr>
-        <w:t xml:space="preserve"> </w:t>
-      </w:r>
-      <w:proofErr w:type="spellStart"/>
-      <w:r>
-        <w:rPr>
-          <w:rFonts w:ascii="Times New Roman" w:hAnsi="Times New Roman" w:cs="Times New Roman"/>
-          <w:color w:val="002060"/>
-        </w:rPr>
-        <w:t>Md</w:t>
-      </w:r>
-      <w:proofErr w:type="spellEnd"/>
-      <w:r>
-        <w:rPr>
-          <w:rFonts w:ascii="Times New Roman" w:hAnsi="Times New Roman" w:cs="Times New Roman"/>
-          <w:color w:val="002060"/>
-        </w:rPr>
-        <w:t>, et al. Understanding the socio-demographic and programmatic factors associated with adolescent motherhood and its association with child undernutrition in Bangladesh. BMC Public Health. 2024</w:t>
-      </w:r>
-      <w:proofErr w:type="gramStart"/>
-      <w:r>
-        <w:rPr>
-          <w:rFonts w:ascii="Times New Roman" w:hAnsi="Times New Roman" w:cs="Times New Roman"/>
-          <w:color w:val="002060"/>
-        </w:rPr>
-        <w:t>;24:2200</w:t>
-      </w:r>
-      <w:proofErr w:type="gramEnd"/>
-      <w:r>
-        <w:rPr>
-          <w:rFonts w:ascii="Times New Roman" w:hAnsi="Times New Roman" w:cs="Times New Roman"/>
-          <w:color w:val="002060"/>
-        </w:rPr>
-        <w:t xml:space="preserve">. </w:t>
-      </w:r>
-      <w:proofErr w:type="spellStart"/>
-      <w:proofErr w:type="gramStart"/>
-      <w:r>
-        <w:rPr>
-          <w:rFonts w:ascii="Times New Roman" w:hAnsi="Times New Roman" w:cs="Times New Roman"/>
-          <w:color w:val="002060"/>
-        </w:rPr>
-        <w:t>doi</w:t>
-      </w:r>
-      <w:proofErr w:type="spellEnd"/>
-      <w:proofErr w:type="gramEnd"/>
-      <w:r>
-        <w:rPr>
-          <w:rFonts w:ascii="Times New Roman" w:hAnsi="Times New Roman" w:cs="Times New Roman"/>
-          <w:color w:val="002060"/>
-        </w:rPr>
-        <w:t>: 10.1186/s12889-024-19355-3</w:t>
+        <w:t>Hossain MdA, Das NC, Tariqujjaman Md, et al. Understanding the socio-demographic and programmatic factors associated with adolescent motherhood and its association with child undernutrition in Bangladesh. BMC Public Health. 2024;24:2200. doi: 10.1186/s12889-024-19355-3</w:t>
       </w:r>
     </w:p>
     <w:p>
@@ -40975,23 +38188,7 @@
           <w:color w:val="002060"/>
         </w:rPr>
         <w:tab/>
-        <w:t xml:space="preserve">World Bank, UNICEF, Scaling Up Nutrition (SUN). Undernutrition in Bangladesh: A Common Narrative. Dhaka and Washington, DC: Scaling Up Nutrition and </w:t>
-      </w:r>
-      <w:proofErr w:type="gramStart"/>
-      <w:r>
-        <w:rPr>
-          <w:rFonts w:ascii="Times New Roman" w:hAnsi="Times New Roman" w:cs="Times New Roman"/>
-          <w:color w:val="002060"/>
-        </w:rPr>
-        <w:t>The</w:t>
-      </w:r>
-      <w:proofErr w:type="gramEnd"/>
-      <w:r>
-        <w:rPr>
-          <w:rFonts w:ascii="Times New Roman" w:hAnsi="Times New Roman" w:cs="Times New Roman"/>
-          <w:color w:val="002060"/>
-        </w:rPr>
-        <w:t xml:space="preserve"> World Bank 2014.</w:t>
+        <w:t>World Bank, UNICEF, Scaling Up Nutrition (SUN). Undernutrition in Bangladesh: A Common Narrative. Dhaka and Washington, DC: Scaling Up Nutrition and The World Bank 2014.</w:t>
       </w:r>
     </w:p>
     <w:p>
@@ -41014,39 +38211,7 @@
           <w:color w:val="002060"/>
         </w:rPr>
         <w:tab/>
-        <w:t xml:space="preserve">Merlo J, </w:t>
-      </w:r>
-      <w:proofErr w:type="spellStart"/>
-      <w:r>
-        <w:rPr>
-          <w:rFonts w:ascii="Times New Roman" w:hAnsi="Times New Roman" w:cs="Times New Roman"/>
-          <w:color w:val="002060"/>
-        </w:rPr>
-        <w:t>Chaix</w:t>
-      </w:r>
-      <w:proofErr w:type="spellEnd"/>
-      <w:r>
-        <w:rPr>
-          <w:rFonts w:ascii="Times New Roman" w:hAnsi="Times New Roman" w:cs="Times New Roman"/>
-          <w:color w:val="002060"/>
-        </w:rPr>
-        <w:t xml:space="preserve"> B, Yang M, et al. A brief conceptual tutorial of multilevel analysis in social epidemiology: linking the statistical concept of clustering to the idea of contextual phenomenon. Journal of epidemiology and community health. 2005</w:t>
-      </w:r>
-      <w:proofErr w:type="gramStart"/>
-      <w:r>
-        <w:rPr>
-          <w:rFonts w:ascii="Times New Roman" w:hAnsi="Times New Roman" w:cs="Times New Roman"/>
-          <w:color w:val="002060"/>
-        </w:rPr>
-        <w:t>;59:443</w:t>
-      </w:r>
-      <w:proofErr w:type="gramEnd"/>
-      <w:r>
-        <w:rPr>
-          <w:rFonts w:ascii="Times New Roman" w:hAnsi="Times New Roman" w:cs="Times New Roman"/>
-          <w:color w:val="002060"/>
-        </w:rPr>
-        <w:t>–9.</w:t>
+        <w:t>Merlo J, Chaix B, Yang M, et al. A brief conceptual tutorial of multilevel analysis in social epidemiology: linking the statistical concept of clustering to the idea of contextual phenomenon. Journal of epidemiology and community health. 2005;59:443–9.</w:t>
       </w:r>
     </w:p>
     <w:p>
@@ -41069,57 +38234,7 @@
           <w:color w:val="002060"/>
         </w:rPr>
         <w:tab/>
-        <w:t xml:space="preserve">Chikako TU, </w:t>
-      </w:r>
-      <w:proofErr w:type="spellStart"/>
-      <w:r>
-        <w:rPr>
-          <w:rFonts w:ascii="Times New Roman" w:hAnsi="Times New Roman" w:cs="Times New Roman"/>
-          <w:color w:val="002060"/>
-        </w:rPr>
-        <w:t>Seidu</w:t>
-      </w:r>
-      <w:proofErr w:type="spellEnd"/>
-      <w:r>
-        <w:rPr>
-          <w:rFonts w:ascii="Times New Roman" w:hAnsi="Times New Roman" w:cs="Times New Roman"/>
-          <w:color w:val="002060"/>
-        </w:rPr>
-        <w:t xml:space="preserve"> A-A, Hagan JE, et al. Complex Multilevel Modelling of the Individual, Household and Regional Level Variability in Predictors of Undernutrition among Children Aged 6–59 Months in Ethiopia. Nutrients. 2021</w:t>
-      </w:r>
-      <w:proofErr w:type="gramStart"/>
-      <w:r>
-        <w:rPr>
-          <w:rFonts w:ascii="Times New Roman" w:hAnsi="Times New Roman" w:cs="Times New Roman"/>
-          <w:color w:val="002060"/>
-        </w:rPr>
-        <w:t>;13:3018</w:t>
-      </w:r>
-      <w:proofErr w:type="gramEnd"/>
-      <w:r>
-        <w:rPr>
-          <w:rFonts w:ascii="Times New Roman" w:hAnsi="Times New Roman" w:cs="Times New Roman"/>
-          <w:color w:val="002060"/>
-        </w:rPr>
-        <w:t xml:space="preserve">. </w:t>
-      </w:r>
-      <w:proofErr w:type="spellStart"/>
-      <w:proofErr w:type="gramStart"/>
-      <w:r>
-        <w:rPr>
-          <w:rFonts w:ascii="Times New Roman" w:hAnsi="Times New Roman" w:cs="Times New Roman"/>
-          <w:color w:val="002060"/>
-        </w:rPr>
-        <w:t>doi</w:t>
-      </w:r>
-      <w:proofErr w:type="spellEnd"/>
-      <w:proofErr w:type="gramEnd"/>
-      <w:r>
-        <w:rPr>
-          <w:rFonts w:ascii="Times New Roman" w:hAnsi="Times New Roman" w:cs="Times New Roman"/>
-          <w:color w:val="002060"/>
-        </w:rPr>
-        <w:t>: 10.3390/nu13093018</w:t>
+        <w:t>Chikako TU, Seidu A-A, Hagan JE, et al. Complex Multilevel Modelling of the Individual, Household and Regional Level Variability in Predictors of Undernutrition among Children Aged 6–59 Months in Ethiopia. Nutrients. 2021;13:3018. doi: 10.3390/nu13093018</w:t>
       </w:r>
     </w:p>
     <w:p>
@@ -41142,73 +38257,7 @@
           <w:color w:val="002060"/>
         </w:rPr>
         <w:tab/>
-        <w:t xml:space="preserve">Das S, </w:t>
-      </w:r>
-      <w:proofErr w:type="spellStart"/>
-      <w:r>
-        <w:rPr>
-          <w:rFonts w:ascii="Times New Roman" w:hAnsi="Times New Roman" w:cs="Times New Roman"/>
-          <w:color w:val="002060"/>
-        </w:rPr>
-        <w:t>Baffour</w:t>
-      </w:r>
-      <w:proofErr w:type="spellEnd"/>
-      <w:r>
-        <w:rPr>
-          <w:rFonts w:ascii="Times New Roman" w:hAnsi="Times New Roman" w:cs="Times New Roman"/>
-          <w:color w:val="002060"/>
-        </w:rPr>
-        <w:t xml:space="preserve"> B, Richardson A. Prevalence of child undernutrition measures and their </w:t>
-      </w:r>
-      <w:proofErr w:type="spellStart"/>
-      <w:r>
-        <w:rPr>
-          <w:rFonts w:ascii="Times New Roman" w:hAnsi="Times New Roman" w:cs="Times New Roman"/>
-          <w:color w:val="002060"/>
-        </w:rPr>
-        <w:t>spatio</w:t>
-      </w:r>
-      <w:proofErr w:type="spellEnd"/>
-      <w:r>
-        <w:rPr>
-          <w:rFonts w:ascii="Times New Roman" w:hAnsi="Times New Roman" w:cs="Times New Roman"/>
-          <w:color w:val="002060"/>
-        </w:rPr>
-        <w:t>-demographic inequalities in Bangladesh: an application of multilevel Bayesian modelling. BMC Public Health. 2022</w:t>
-      </w:r>
-      <w:proofErr w:type="gramStart"/>
-      <w:r>
-        <w:rPr>
-          <w:rFonts w:ascii="Times New Roman" w:hAnsi="Times New Roman" w:cs="Times New Roman"/>
-          <w:color w:val="002060"/>
-        </w:rPr>
-        <w:t>;22:1008</w:t>
-      </w:r>
-      <w:proofErr w:type="gramEnd"/>
-      <w:r>
-        <w:rPr>
-          <w:rFonts w:ascii="Times New Roman" w:hAnsi="Times New Roman" w:cs="Times New Roman"/>
-          <w:color w:val="002060"/>
-        </w:rPr>
-        <w:t xml:space="preserve">. </w:t>
-      </w:r>
-      <w:proofErr w:type="spellStart"/>
-      <w:proofErr w:type="gramStart"/>
-      <w:r>
-        <w:rPr>
-          <w:rFonts w:ascii="Times New Roman" w:hAnsi="Times New Roman" w:cs="Times New Roman"/>
-          <w:color w:val="002060"/>
-        </w:rPr>
-        <w:t>doi</w:t>
-      </w:r>
-      <w:proofErr w:type="spellEnd"/>
-      <w:proofErr w:type="gramEnd"/>
-      <w:r>
-        <w:rPr>
-          <w:rFonts w:ascii="Times New Roman" w:hAnsi="Times New Roman" w:cs="Times New Roman"/>
-          <w:color w:val="002060"/>
-        </w:rPr>
-        <w:t>: 10.1186/s12889-022-13170-4</w:t>
+        <w:t>Das S, Baffour B, Richardson A. Prevalence of child undernutrition measures and their spatio-demographic inequalities in Bangladesh: an application of multilevel Bayesian modelling. BMC Public Health. 2022;22:1008. doi: 10.1186/s12889-022-13170-4</w:t>
       </w:r>
     </w:p>
     <w:p>
@@ -41231,57 +38280,7 @@
           <w:color w:val="002060"/>
         </w:rPr>
         <w:tab/>
-        <w:t xml:space="preserve">Carle AC. Fitting multilevel models in complex survey data with design weights: Recommendations. BMC Med Res </w:t>
-      </w:r>
-      <w:proofErr w:type="spellStart"/>
-      <w:r>
-        <w:rPr>
-          <w:rFonts w:ascii="Times New Roman" w:hAnsi="Times New Roman" w:cs="Times New Roman"/>
-          <w:color w:val="002060"/>
-        </w:rPr>
-        <w:t>Methodol</w:t>
-      </w:r>
-      <w:proofErr w:type="spellEnd"/>
-      <w:r>
-        <w:rPr>
-          <w:rFonts w:ascii="Times New Roman" w:hAnsi="Times New Roman" w:cs="Times New Roman"/>
-          <w:color w:val="002060"/>
-        </w:rPr>
-        <w:t>. 2009</w:t>
-      </w:r>
-      <w:proofErr w:type="gramStart"/>
-      <w:r>
-        <w:rPr>
-          <w:rFonts w:ascii="Times New Roman" w:hAnsi="Times New Roman" w:cs="Times New Roman"/>
-          <w:color w:val="002060"/>
-        </w:rPr>
-        <w:t>;9:49</w:t>
-      </w:r>
-      <w:proofErr w:type="gramEnd"/>
-      <w:r>
-        <w:rPr>
-          <w:rFonts w:ascii="Times New Roman" w:hAnsi="Times New Roman" w:cs="Times New Roman"/>
-          <w:color w:val="002060"/>
-        </w:rPr>
-        <w:t xml:space="preserve">. </w:t>
-      </w:r>
-      <w:proofErr w:type="spellStart"/>
-      <w:proofErr w:type="gramStart"/>
-      <w:r>
-        <w:rPr>
-          <w:rFonts w:ascii="Times New Roman" w:hAnsi="Times New Roman" w:cs="Times New Roman"/>
-          <w:color w:val="002060"/>
-        </w:rPr>
-        <w:t>doi</w:t>
-      </w:r>
-      <w:proofErr w:type="spellEnd"/>
-      <w:proofErr w:type="gramEnd"/>
-      <w:r>
-        <w:rPr>
-          <w:rFonts w:ascii="Times New Roman" w:hAnsi="Times New Roman" w:cs="Times New Roman"/>
-          <w:color w:val="002060"/>
-        </w:rPr>
-        <w:t>: 10.1186/1471-2288-9-49</w:t>
+        <w:t>Carle AC. Fitting multilevel models in complex survey data with design weights: Recommendations. BMC Med Res Methodol. 2009;9:49. doi: 10.1186/1471-2288-9-49</w:t>
       </w:r>
     </w:p>
     <w:p>
@@ -41291,21 +38290,12 @@
           <w:rFonts w:ascii="Times New Roman" w:hAnsi="Times New Roman" w:cs="Times New Roman"/>
         </w:rPr>
       </w:pPr>
-      <w:proofErr w:type="gramStart"/>
       <w:r>
         <w:rPr>
           <w:rFonts w:ascii="Times New Roman" w:hAnsi="Times New Roman" w:cs="Times New Roman"/>
           <w:color w:val="002060"/>
         </w:rPr>
-        <w:t>22</w:t>
-      </w:r>
-      <w:proofErr w:type="gramEnd"/>
-      <w:r>
-        <w:rPr>
-          <w:rFonts w:ascii="Times New Roman" w:hAnsi="Times New Roman" w:cs="Times New Roman"/>
-          <w:color w:val="002060"/>
-        </w:rPr>
-        <w:t xml:space="preserve"> </w:t>
+        <w:t xml:space="preserve">22 </w:t>
       </w:r>
       <w:r>
         <w:rPr>
@@ -41359,104 +38349,7 @@
           <w:color w:val="002060"/>
         </w:rPr>
         <w:tab/>
-      </w:r>
-      <w:proofErr w:type="spellStart"/>
-      <w:r>
-        <w:rPr>
-          <w:rFonts w:ascii="Times New Roman" w:hAnsi="Times New Roman" w:cs="Times New Roman"/>
-          <w:color w:val="002060"/>
-        </w:rPr>
-        <w:t>Saha</w:t>
-      </w:r>
-      <w:proofErr w:type="spellEnd"/>
-      <w:r>
-        <w:rPr>
-          <w:rFonts w:ascii="Times New Roman" w:hAnsi="Times New Roman" w:cs="Times New Roman"/>
-          <w:color w:val="002060"/>
-        </w:rPr>
-        <w:t xml:space="preserve"> UR, Van </w:t>
-      </w:r>
-      <w:proofErr w:type="spellStart"/>
-      <w:r>
-        <w:rPr>
-          <w:rFonts w:ascii="Times New Roman" w:hAnsi="Times New Roman" w:cs="Times New Roman"/>
-          <w:color w:val="002060"/>
-        </w:rPr>
-        <w:t>Wesenbeeck</w:t>
-      </w:r>
-      <w:proofErr w:type="spellEnd"/>
-      <w:r>
-        <w:rPr>
-          <w:rFonts w:ascii="Times New Roman" w:hAnsi="Times New Roman" w:cs="Times New Roman"/>
-          <w:color w:val="002060"/>
-        </w:rPr>
-        <w:t xml:space="preserve"> CFA. Changes in the determinants and spatial distribution of under-five stunting in Bangladesh: Evidence from Bangladesh Demographic Health Surveys (BDHS) 1996–97, 2014 and 2017/18. </w:t>
-      </w:r>
-      <w:proofErr w:type="spellStart"/>
-      <w:r>
-        <w:rPr>
-          <w:rFonts w:ascii="Times New Roman" w:hAnsi="Times New Roman" w:cs="Times New Roman"/>
-          <w:color w:val="002060"/>
-        </w:rPr>
-        <w:t>PLoS</w:t>
-      </w:r>
-      <w:proofErr w:type="spellEnd"/>
-      <w:r>
-        <w:rPr>
-          <w:rFonts w:ascii="Times New Roman" w:hAnsi="Times New Roman" w:cs="Times New Roman"/>
-          <w:color w:val="002060"/>
-        </w:rPr>
-        <w:t xml:space="preserve"> </w:t>
-      </w:r>
-      <w:proofErr w:type="gramStart"/>
-      <w:r>
-        <w:rPr>
-          <w:rFonts w:ascii="Times New Roman" w:hAnsi="Times New Roman" w:cs="Times New Roman"/>
-          <w:color w:val="002060"/>
-        </w:rPr>
-        <w:t>ONE</w:t>
-      </w:r>
-      <w:proofErr w:type="gramEnd"/>
-      <w:r>
-        <w:rPr>
-          <w:rFonts w:ascii="Times New Roman" w:hAnsi="Times New Roman" w:cs="Times New Roman"/>
-          <w:color w:val="002060"/>
-        </w:rPr>
-        <w:t>. 2022</w:t>
-      </w:r>
-      <w:proofErr w:type="gramStart"/>
-      <w:r>
-        <w:rPr>
-          <w:rFonts w:ascii="Times New Roman" w:hAnsi="Times New Roman" w:cs="Times New Roman"/>
-          <w:color w:val="002060"/>
-        </w:rPr>
-        <w:t>;17:e0278094</w:t>
-      </w:r>
-      <w:proofErr w:type="gramEnd"/>
-      <w:r>
-        <w:rPr>
-          <w:rFonts w:ascii="Times New Roman" w:hAnsi="Times New Roman" w:cs="Times New Roman"/>
-          <w:color w:val="002060"/>
-        </w:rPr>
-        <w:t xml:space="preserve">. </w:t>
-      </w:r>
-      <w:proofErr w:type="spellStart"/>
-      <w:proofErr w:type="gramStart"/>
-      <w:r>
-        <w:rPr>
-          <w:rFonts w:ascii="Times New Roman" w:hAnsi="Times New Roman" w:cs="Times New Roman"/>
-          <w:color w:val="002060"/>
-        </w:rPr>
-        <w:t>doi</w:t>
-      </w:r>
-      <w:proofErr w:type="spellEnd"/>
-      <w:proofErr w:type="gramEnd"/>
-      <w:r>
-        <w:rPr>
-          <w:rFonts w:ascii="Times New Roman" w:hAnsi="Times New Roman" w:cs="Times New Roman"/>
-          <w:color w:val="002060"/>
-        </w:rPr>
-        <w:t>: 10.1371/journal.pone.0278094</w:t>
+        <w:t>Saha UR, Van Wesenbeeck CFA. Changes in the determinants and spatial distribution of under-five stunting in Bangladesh: Evidence from Bangladesh Demographic Health Surveys (BDHS) 1996–97, 2014 and 2017/18. PLoS ONE. 2022;17:e0278094. doi: 10.1371/journal.pone.0278094</w:t>
       </w:r>
     </w:p>
     <w:p>
@@ -41479,72 +38372,7 @@
           <w:color w:val="002060"/>
         </w:rPr>
         <w:tab/>
-      </w:r>
-      <w:proofErr w:type="spellStart"/>
-      <w:r>
-        <w:rPr>
-          <w:rFonts w:ascii="Times New Roman" w:hAnsi="Times New Roman" w:cs="Times New Roman"/>
-          <w:color w:val="002060"/>
-        </w:rPr>
-        <w:t>Tamanna</w:t>
-      </w:r>
-      <w:proofErr w:type="spellEnd"/>
-      <w:r>
-        <w:rPr>
-          <w:rFonts w:ascii="Times New Roman" w:hAnsi="Times New Roman" w:cs="Times New Roman"/>
-          <w:color w:val="002060"/>
-        </w:rPr>
-        <w:t xml:space="preserve"> T, Mahmud S, Salma N, et al. Identifying determinants of malnutrition in under-five children in Bangladesh: insights from the BDHS-2022 cross-sectional study. </w:t>
-      </w:r>
-      <w:proofErr w:type="spellStart"/>
-      <w:r>
-        <w:rPr>
-          <w:rFonts w:ascii="Times New Roman" w:hAnsi="Times New Roman" w:cs="Times New Roman"/>
-          <w:color w:val="002060"/>
-        </w:rPr>
-        <w:t>Sci</w:t>
-      </w:r>
-      <w:proofErr w:type="spellEnd"/>
-      <w:r>
-        <w:rPr>
-          <w:rFonts w:ascii="Times New Roman" w:hAnsi="Times New Roman" w:cs="Times New Roman"/>
-          <w:color w:val="002060"/>
-        </w:rPr>
-        <w:t xml:space="preserve"> Rep. 2025</w:t>
-      </w:r>
-      <w:proofErr w:type="gramStart"/>
-      <w:r>
-        <w:rPr>
-          <w:rFonts w:ascii="Times New Roman" w:hAnsi="Times New Roman" w:cs="Times New Roman"/>
-          <w:color w:val="002060"/>
-        </w:rPr>
-        <w:t>;15:14336</w:t>
-      </w:r>
-      <w:proofErr w:type="gramEnd"/>
-      <w:r>
-        <w:rPr>
-          <w:rFonts w:ascii="Times New Roman" w:hAnsi="Times New Roman" w:cs="Times New Roman"/>
-          <w:color w:val="002060"/>
-        </w:rPr>
-        <w:t xml:space="preserve">. </w:t>
-      </w:r>
-      <w:proofErr w:type="spellStart"/>
-      <w:proofErr w:type="gramStart"/>
-      <w:r>
-        <w:rPr>
-          <w:rFonts w:ascii="Times New Roman" w:hAnsi="Times New Roman" w:cs="Times New Roman"/>
-          <w:color w:val="002060"/>
-        </w:rPr>
-        <w:t>doi</w:t>
-      </w:r>
-      <w:proofErr w:type="spellEnd"/>
-      <w:proofErr w:type="gramEnd"/>
-      <w:r>
-        <w:rPr>
-          <w:rFonts w:ascii="Times New Roman" w:hAnsi="Times New Roman" w:cs="Times New Roman"/>
-          <w:color w:val="002060"/>
-        </w:rPr>
-        <w:t>: 10.1038/s41598-025-99288-y</w:t>
+        <w:t>Tamanna T, Mahmud S, Salma N, et al. Identifying determinants of malnutrition in under-five children in Bangladesh: insights from the BDHS-2022 cross-sectional study. Sci Rep. 2025;15:14336. doi: 10.1038/s41598-025-99288-y</w:t>
       </w:r>
     </w:p>
     <w:p>
@@ -41567,41 +38395,7 @@
           <w:color w:val="002060"/>
         </w:rPr>
         <w:tab/>
-        <w:t>Rashid M, Rahman M, Siddiqi NA, et al. Spatial distribution and predictors of stunting, wasting, and underweight among under-five children in Bangladesh. BMC Public Health. 2026</w:t>
-      </w:r>
-      <w:proofErr w:type="gramStart"/>
-      <w:r>
-        <w:rPr>
-          <w:rFonts w:ascii="Times New Roman" w:hAnsi="Times New Roman" w:cs="Times New Roman"/>
-          <w:color w:val="002060"/>
-        </w:rPr>
-        <w:t>;26:1504</w:t>
-      </w:r>
-      <w:proofErr w:type="gramEnd"/>
-      <w:r>
-        <w:rPr>
-          <w:rFonts w:ascii="Times New Roman" w:hAnsi="Times New Roman" w:cs="Times New Roman"/>
-          <w:color w:val="002060"/>
-        </w:rPr>
-        <w:t xml:space="preserve">. </w:t>
-      </w:r>
-      <w:proofErr w:type="spellStart"/>
-      <w:proofErr w:type="gramStart"/>
-      <w:r>
-        <w:rPr>
-          <w:rFonts w:ascii="Times New Roman" w:hAnsi="Times New Roman" w:cs="Times New Roman"/>
-          <w:color w:val="002060"/>
-        </w:rPr>
-        <w:t>doi</w:t>
-      </w:r>
-      <w:proofErr w:type="spellEnd"/>
-      <w:proofErr w:type="gramEnd"/>
-      <w:r>
-        <w:rPr>
-          <w:rFonts w:ascii="Times New Roman" w:hAnsi="Times New Roman" w:cs="Times New Roman"/>
-          <w:color w:val="002060"/>
-        </w:rPr>
-        <w:t>: 10.1186/s12889-026-26793-8</w:t>
+        <w:t>Rashid M, Rahman M, Siddiqi NA, et al. Spatial distribution and predictors of stunting, wasting, and underweight among under-five children in Bangladesh. BMC Public Health. 2026;26:1504. doi: 10.1186/s12889-026-26793-8</w:t>
       </w:r>
     </w:p>
     <w:p>
@@ -41647,41 +38441,7 @@
           <w:color w:val="002060"/>
         </w:rPr>
         <w:tab/>
-        <w:t>Von Elm E, Altman DG, Egger M, et al. The Strengthening the Reporting of Observational Studies in Epidemiology (STROBE) statement: guidelines for reporting observational studies. The Lancet. 2007</w:t>
-      </w:r>
-      <w:proofErr w:type="gramStart"/>
-      <w:r>
-        <w:rPr>
-          <w:rFonts w:ascii="Times New Roman" w:hAnsi="Times New Roman" w:cs="Times New Roman"/>
-          <w:color w:val="002060"/>
-        </w:rPr>
-        <w:t>;370:1453</w:t>
-      </w:r>
-      <w:proofErr w:type="gramEnd"/>
-      <w:r>
-        <w:rPr>
-          <w:rFonts w:ascii="Times New Roman" w:hAnsi="Times New Roman" w:cs="Times New Roman"/>
-          <w:color w:val="002060"/>
-        </w:rPr>
-        <w:t xml:space="preserve">–7. </w:t>
-      </w:r>
-      <w:proofErr w:type="spellStart"/>
-      <w:proofErr w:type="gramStart"/>
-      <w:r>
-        <w:rPr>
-          <w:rFonts w:ascii="Times New Roman" w:hAnsi="Times New Roman" w:cs="Times New Roman"/>
-          <w:color w:val="002060"/>
-        </w:rPr>
-        <w:t>doi</w:t>
-      </w:r>
-      <w:proofErr w:type="spellEnd"/>
-      <w:proofErr w:type="gramEnd"/>
-      <w:r>
-        <w:rPr>
-          <w:rFonts w:ascii="Times New Roman" w:hAnsi="Times New Roman" w:cs="Times New Roman"/>
-          <w:color w:val="002060"/>
-        </w:rPr>
-        <w:t>: 10.1016/S0140-6736(07)61602-X</w:t>
+        <w:t>Von Elm E, Altman DG, Egger M, et al. The Strengthening the Reporting of Observational Studies in Epidemiology (STROBE) statement: guidelines for reporting observational studies. The Lancet. 2007;370:1453–7. doi: 10.1016/S0140-6736(07)61602-X</w:t>
       </w:r>
     </w:p>
     <w:p>
@@ -41704,57 +38464,7 @@
           <w:color w:val="002060"/>
         </w:rPr>
         <w:tab/>
-        <w:t xml:space="preserve">Zhang Z. Univariate description and bivariate statistical inference: the first step delving into data. Ann </w:t>
-      </w:r>
-      <w:proofErr w:type="spellStart"/>
-      <w:r>
-        <w:rPr>
-          <w:rFonts w:ascii="Times New Roman" w:hAnsi="Times New Roman" w:cs="Times New Roman"/>
-          <w:color w:val="002060"/>
-        </w:rPr>
-        <w:t>Transl</w:t>
-      </w:r>
-      <w:proofErr w:type="spellEnd"/>
-      <w:r>
-        <w:rPr>
-          <w:rFonts w:ascii="Times New Roman" w:hAnsi="Times New Roman" w:cs="Times New Roman"/>
-          <w:color w:val="002060"/>
-        </w:rPr>
-        <w:t xml:space="preserve"> Med. 2016</w:t>
-      </w:r>
-      <w:proofErr w:type="gramStart"/>
-      <w:r>
-        <w:rPr>
-          <w:rFonts w:ascii="Times New Roman" w:hAnsi="Times New Roman" w:cs="Times New Roman"/>
-          <w:color w:val="002060"/>
-        </w:rPr>
-        <w:t>;4:91</w:t>
-      </w:r>
-      <w:proofErr w:type="gramEnd"/>
-      <w:r>
-        <w:rPr>
-          <w:rFonts w:ascii="Times New Roman" w:hAnsi="Times New Roman" w:cs="Times New Roman"/>
-          <w:color w:val="002060"/>
-        </w:rPr>
-        <w:t xml:space="preserve">–91. </w:t>
-      </w:r>
-      <w:proofErr w:type="spellStart"/>
-      <w:proofErr w:type="gramStart"/>
-      <w:r>
-        <w:rPr>
-          <w:rFonts w:ascii="Times New Roman" w:hAnsi="Times New Roman" w:cs="Times New Roman"/>
-          <w:color w:val="002060"/>
-        </w:rPr>
-        <w:t>doi</w:t>
-      </w:r>
-      <w:proofErr w:type="spellEnd"/>
-      <w:proofErr w:type="gramEnd"/>
-      <w:r>
-        <w:rPr>
-          <w:rFonts w:ascii="Times New Roman" w:hAnsi="Times New Roman" w:cs="Times New Roman"/>
-          <w:color w:val="002060"/>
-        </w:rPr>
-        <w:t>: 10.21037/atm.2016.02.11</w:t>
+        <w:t>Zhang Z. Univariate description and bivariate statistical inference: the first step delving into data. Ann Transl Med. 2016;4:91–91. doi: 10.21037/atm.2016.02.11</w:t>
       </w:r>
     </w:p>
     <w:p>
@@ -41777,57 +38487,7 @@
           <w:color w:val="002060"/>
         </w:rPr>
         <w:tab/>
-        <w:t xml:space="preserve">McHugh ML. The Chi-square test of independence. </w:t>
-      </w:r>
-      <w:proofErr w:type="spellStart"/>
-      <w:r>
-        <w:rPr>
-          <w:rFonts w:ascii="Times New Roman" w:hAnsi="Times New Roman" w:cs="Times New Roman"/>
-          <w:color w:val="002060"/>
-        </w:rPr>
-        <w:t>Biochem</w:t>
-      </w:r>
-      <w:proofErr w:type="spellEnd"/>
-      <w:r>
-        <w:rPr>
-          <w:rFonts w:ascii="Times New Roman" w:hAnsi="Times New Roman" w:cs="Times New Roman"/>
-          <w:color w:val="002060"/>
-        </w:rPr>
-        <w:t xml:space="preserve"> Med. 2013</w:t>
-      </w:r>
-      <w:proofErr w:type="gramStart"/>
-      <w:r>
-        <w:rPr>
-          <w:rFonts w:ascii="Times New Roman" w:hAnsi="Times New Roman" w:cs="Times New Roman"/>
-          <w:color w:val="002060"/>
-        </w:rPr>
-        <w:t>;143</w:t>
-      </w:r>
-      <w:proofErr w:type="gramEnd"/>
-      <w:r>
-        <w:rPr>
-          <w:rFonts w:ascii="Times New Roman" w:hAnsi="Times New Roman" w:cs="Times New Roman"/>
-          <w:color w:val="002060"/>
-        </w:rPr>
-        <w:t xml:space="preserve">–9. </w:t>
-      </w:r>
-      <w:proofErr w:type="spellStart"/>
-      <w:proofErr w:type="gramStart"/>
-      <w:r>
-        <w:rPr>
-          <w:rFonts w:ascii="Times New Roman" w:hAnsi="Times New Roman" w:cs="Times New Roman"/>
-          <w:color w:val="002060"/>
-        </w:rPr>
-        <w:t>doi</w:t>
-      </w:r>
-      <w:proofErr w:type="spellEnd"/>
-      <w:proofErr w:type="gramEnd"/>
-      <w:r>
-        <w:rPr>
-          <w:rFonts w:ascii="Times New Roman" w:hAnsi="Times New Roman" w:cs="Times New Roman"/>
-          <w:color w:val="002060"/>
-        </w:rPr>
-        <w:t>: 10.11613/BM.2013.018</w:t>
+        <w:t>McHugh ML. The Chi-square test of independence. Biochem Med. 2013;143–9. doi: 10.11613/BM.2013.018</w:t>
       </w:r>
     </w:p>
     <w:p>
@@ -41851,55 +38511,7 @@
           <w:color w:val="002060"/>
         </w:rPr>
         <w:tab/>
-        <w:t xml:space="preserve">George D, </w:t>
-      </w:r>
-      <w:proofErr w:type="spellStart"/>
-      <w:r>
-        <w:rPr>
-          <w:rFonts w:ascii="Times New Roman" w:hAnsi="Times New Roman" w:cs="Times New Roman"/>
-          <w:color w:val="002060"/>
-        </w:rPr>
-        <w:t>Mallery</w:t>
-      </w:r>
-      <w:proofErr w:type="spellEnd"/>
-      <w:r>
-        <w:rPr>
-          <w:rFonts w:ascii="Times New Roman" w:hAnsi="Times New Roman" w:cs="Times New Roman"/>
-          <w:color w:val="002060"/>
-        </w:rPr>
-        <w:t xml:space="preserve"> P. IBM SPSS Statistics 29 Step by Step: A Simple Guide and Reference. </w:t>
-      </w:r>
-      <w:proofErr w:type="gramStart"/>
-      <w:r>
-        <w:rPr>
-          <w:rFonts w:ascii="Times New Roman" w:hAnsi="Times New Roman" w:cs="Times New Roman"/>
-          <w:color w:val="002060"/>
-        </w:rPr>
-        <w:t>18th</w:t>
-      </w:r>
-      <w:proofErr w:type="gramEnd"/>
-      <w:r>
-        <w:rPr>
-          <w:rFonts w:ascii="Times New Roman" w:hAnsi="Times New Roman" w:cs="Times New Roman"/>
-          <w:color w:val="002060"/>
-        </w:rPr>
-        <w:t xml:space="preserve"> </w:t>
-      </w:r>
-      <w:proofErr w:type="spellStart"/>
-      <w:r>
-        <w:rPr>
-          <w:rFonts w:ascii="Times New Roman" w:hAnsi="Times New Roman" w:cs="Times New Roman"/>
-          <w:color w:val="002060"/>
-        </w:rPr>
-        <w:t>edn</w:t>
-      </w:r>
-      <w:proofErr w:type="spellEnd"/>
-      <w:r>
-        <w:rPr>
-          <w:rFonts w:ascii="Times New Roman" w:hAnsi="Times New Roman" w:cs="Times New Roman"/>
-          <w:color w:val="002060"/>
-        </w:rPr>
-        <w:t>. New York: Routledge 2024.</w:t>
+        <w:t>George D, Mallery P. IBM SPSS Statistics 29 Step by Step: A Simple Guide and Reference. 18th edn. New York: Routledge 2024.</w:t>
       </w:r>
     </w:p>
     <w:p>
@@ -41945,73 +38557,7 @@
           <w:color w:val="002060"/>
         </w:rPr>
         <w:tab/>
-        <w:t xml:space="preserve">Bates D, </w:t>
-      </w:r>
-      <w:proofErr w:type="spellStart"/>
-      <w:r>
-        <w:rPr>
-          <w:rFonts w:ascii="Times New Roman" w:hAnsi="Times New Roman" w:cs="Times New Roman"/>
-          <w:color w:val="002060"/>
-        </w:rPr>
-        <w:t>Mächler</w:t>
-      </w:r>
-      <w:proofErr w:type="spellEnd"/>
-      <w:r>
-        <w:rPr>
-          <w:rFonts w:ascii="Times New Roman" w:hAnsi="Times New Roman" w:cs="Times New Roman"/>
-          <w:color w:val="002060"/>
-        </w:rPr>
-        <w:t xml:space="preserve"> M, </w:t>
-      </w:r>
-      <w:proofErr w:type="spellStart"/>
-      <w:r>
-        <w:rPr>
-          <w:rFonts w:ascii="Times New Roman" w:hAnsi="Times New Roman" w:cs="Times New Roman"/>
-          <w:color w:val="002060"/>
-        </w:rPr>
-        <w:t>Bolker</w:t>
-      </w:r>
-      <w:proofErr w:type="spellEnd"/>
-      <w:r>
-        <w:rPr>
-          <w:rFonts w:ascii="Times New Roman" w:hAnsi="Times New Roman" w:cs="Times New Roman"/>
-          <w:color w:val="002060"/>
-        </w:rPr>
-        <w:t xml:space="preserve"> B, et al. Fitting Linear Mixed-Effects Models Using lme4. Journal of Statistical Software. 2015</w:t>
-      </w:r>
-      <w:proofErr w:type="gramStart"/>
-      <w:r>
-        <w:rPr>
-          <w:rFonts w:ascii="Times New Roman" w:hAnsi="Times New Roman" w:cs="Times New Roman"/>
-          <w:color w:val="002060"/>
-        </w:rPr>
-        <w:t>;67:1</w:t>
-      </w:r>
-      <w:proofErr w:type="gramEnd"/>
-      <w:r>
-        <w:rPr>
-          <w:rFonts w:ascii="Times New Roman" w:hAnsi="Times New Roman" w:cs="Times New Roman"/>
-          <w:color w:val="002060"/>
-        </w:rPr>
-        <w:t xml:space="preserve">–48. </w:t>
-      </w:r>
-      <w:proofErr w:type="spellStart"/>
-      <w:proofErr w:type="gramStart"/>
-      <w:r>
-        <w:rPr>
-          <w:rFonts w:ascii="Times New Roman" w:hAnsi="Times New Roman" w:cs="Times New Roman"/>
-          <w:color w:val="002060"/>
-        </w:rPr>
-        <w:t>doi</w:t>
-      </w:r>
-      <w:proofErr w:type="spellEnd"/>
-      <w:proofErr w:type="gramEnd"/>
-      <w:r>
-        <w:rPr>
-          <w:rFonts w:ascii="Times New Roman" w:hAnsi="Times New Roman" w:cs="Times New Roman"/>
-          <w:color w:val="002060"/>
-        </w:rPr>
-        <w:t>: 10.18637/jss.v067.i01</w:t>
+        <w:t>Bates D, Mächler M, Bolker B, et al. Fitting Linear Mixed-Effects Models Using lme4. Journal of Statistical Software. 2015;67:1–48. doi: 10.18637/jss.v067.i01</w:t>
       </w:r>
     </w:p>
     <w:p>
@@ -42034,23 +38580,7 @@
           <w:color w:val="002060"/>
         </w:rPr>
         <w:tab/>
-        <w:t xml:space="preserve">Levine Z, Young R, Child R, et al. Multilevel </w:t>
-      </w:r>
-      <w:proofErr w:type="spellStart"/>
-      <w:r>
-        <w:rPr>
-          <w:rFonts w:ascii="Times New Roman" w:hAnsi="Times New Roman" w:cs="Times New Roman"/>
-          <w:color w:val="002060"/>
-        </w:rPr>
-        <w:t>Modeling</w:t>
-      </w:r>
-      <w:proofErr w:type="spellEnd"/>
-      <w:r>
-        <w:rPr>
-          <w:rFonts w:ascii="Times New Roman" w:hAnsi="Times New Roman" w:cs="Times New Roman"/>
-          <w:color w:val="002060"/>
-        </w:rPr>
-        <w:t>. In: Ewing R, Park K, eds. Advanced Quantitative Research Methods for Urban Planners. Routledge 2020:154–84.</w:t>
+        <w:t>Levine Z, Young R, Child R, et al. Multilevel Modeling. In: Ewing R, Park K, eds. Advanced Quantitative Research Methods for Urban Planners. Routledge 2020:154–84.</w:t>
       </w:r>
     </w:p>
     <w:p>
@@ -42073,73 +38603,7 @@
           <w:color w:val="002060"/>
         </w:rPr>
         <w:tab/>
-        <w:t xml:space="preserve">Kassie GA, </w:t>
-      </w:r>
-      <w:proofErr w:type="spellStart"/>
-      <w:r>
-        <w:rPr>
-          <w:rFonts w:ascii="Times New Roman" w:hAnsi="Times New Roman" w:cs="Times New Roman"/>
-          <w:color w:val="002060"/>
-        </w:rPr>
-        <w:t>Asgedom</w:t>
-      </w:r>
-      <w:proofErr w:type="spellEnd"/>
-      <w:r>
-        <w:rPr>
-          <w:rFonts w:ascii="Times New Roman" w:hAnsi="Times New Roman" w:cs="Times New Roman"/>
-          <w:color w:val="002060"/>
-        </w:rPr>
-        <w:t xml:space="preserve"> YS. Childhood stunting severity level and associated factors among under-five children in Tanzania: a multi-level ordinal logistic regression analysis using 2022 Tanzanian demographic and health survey. BMC </w:t>
-      </w:r>
-      <w:proofErr w:type="spellStart"/>
-      <w:r>
-        <w:rPr>
-          <w:rFonts w:ascii="Times New Roman" w:hAnsi="Times New Roman" w:cs="Times New Roman"/>
-          <w:color w:val="002060"/>
-        </w:rPr>
-        <w:t>Pediatr</w:t>
-      </w:r>
-      <w:proofErr w:type="spellEnd"/>
-      <w:r>
-        <w:rPr>
-          <w:rFonts w:ascii="Times New Roman" w:hAnsi="Times New Roman" w:cs="Times New Roman"/>
-          <w:color w:val="002060"/>
-        </w:rPr>
-        <w:t>. 2025</w:t>
-      </w:r>
-      <w:proofErr w:type="gramStart"/>
-      <w:r>
-        <w:rPr>
-          <w:rFonts w:ascii="Times New Roman" w:hAnsi="Times New Roman" w:cs="Times New Roman"/>
-          <w:color w:val="002060"/>
-        </w:rPr>
-        <w:t>;25:129</w:t>
-      </w:r>
-      <w:proofErr w:type="gramEnd"/>
-      <w:r>
-        <w:rPr>
-          <w:rFonts w:ascii="Times New Roman" w:hAnsi="Times New Roman" w:cs="Times New Roman"/>
-          <w:color w:val="002060"/>
-        </w:rPr>
-        <w:t xml:space="preserve">. </w:t>
-      </w:r>
-      <w:proofErr w:type="spellStart"/>
-      <w:proofErr w:type="gramStart"/>
-      <w:r>
-        <w:rPr>
-          <w:rFonts w:ascii="Times New Roman" w:hAnsi="Times New Roman" w:cs="Times New Roman"/>
-          <w:color w:val="002060"/>
-        </w:rPr>
-        <w:t>doi</w:t>
-      </w:r>
-      <w:proofErr w:type="spellEnd"/>
-      <w:proofErr w:type="gramEnd"/>
-      <w:r>
-        <w:rPr>
-          <w:rFonts w:ascii="Times New Roman" w:hAnsi="Times New Roman" w:cs="Times New Roman"/>
-          <w:color w:val="002060"/>
-        </w:rPr>
-        <w:t>: 10.1186/s12887-025-05490-2</w:t>
+        <w:t>Kassie GA, Asgedom YS. Childhood stunting severity level and associated factors among under-five children in Tanzania: a multi-level ordinal logistic regression analysis using 2022 Tanzanian demographic and health survey. BMC Pediatr. 2025;25:129. doi: 10.1186/s12887-025-05490-2</w:t>
       </w:r>
     </w:p>
     <w:p>
@@ -42162,73 +38626,7 @@
           <w:color w:val="002060"/>
         </w:rPr>
         <w:tab/>
-        <w:t xml:space="preserve">Amin R, </w:t>
-      </w:r>
-      <w:proofErr w:type="spellStart"/>
-      <w:r>
-        <w:rPr>
-          <w:rFonts w:ascii="Times New Roman" w:hAnsi="Times New Roman" w:cs="Times New Roman"/>
-          <w:color w:val="002060"/>
-        </w:rPr>
-        <w:t>Akter</w:t>
-      </w:r>
-      <w:proofErr w:type="spellEnd"/>
-      <w:r>
-        <w:rPr>
-          <w:rFonts w:ascii="Times New Roman" w:hAnsi="Times New Roman" w:cs="Times New Roman"/>
-          <w:color w:val="002060"/>
-        </w:rPr>
-        <w:t xml:space="preserve"> T, </w:t>
-      </w:r>
-      <w:proofErr w:type="spellStart"/>
-      <w:r>
-        <w:rPr>
-          <w:rFonts w:ascii="Times New Roman" w:hAnsi="Times New Roman" w:cs="Times New Roman"/>
-          <w:color w:val="002060"/>
-        </w:rPr>
-        <w:t>Ferdous</w:t>
-      </w:r>
-      <w:proofErr w:type="spellEnd"/>
-      <w:r>
-        <w:rPr>
-          <w:rFonts w:ascii="Times New Roman" w:hAnsi="Times New Roman" w:cs="Times New Roman"/>
-          <w:color w:val="002060"/>
-        </w:rPr>
-        <w:t xml:space="preserve"> R, et al. Joint modelling of anthropometric child undernutrition indicators to identify their risk factors in Bangladesh: evidence from the Multiple Indicator Cluster Survey (MICS) 2019. BMJ Open. 2025</w:t>
-      </w:r>
-      <w:proofErr w:type="gramStart"/>
-      <w:r>
-        <w:rPr>
-          <w:rFonts w:ascii="Times New Roman" w:hAnsi="Times New Roman" w:cs="Times New Roman"/>
-          <w:color w:val="002060"/>
-        </w:rPr>
-        <w:t>;15:e092536</w:t>
-      </w:r>
-      <w:proofErr w:type="gramEnd"/>
-      <w:r>
-        <w:rPr>
-          <w:rFonts w:ascii="Times New Roman" w:hAnsi="Times New Roman" w:cs="Times New Roman"/>
-          <w:color w:val="002060"/>
-        </w:rPr>
-        <w:t xml:space="preserve">. </w:t>
-      </w:r>
-      <w:proofErr w:type="spellStart"/>
-      <w:proofErr w:type="gramStart"/>
-      <w:r>
-        <w:rPr>
-          <w:rFonts w:ascii="Times New Roman" w:hAnsi="Times New Roman" w:cs="Times New Roman"/>
-          <w:color w:val="002060"/>
-        </w:rPr>
-        <w:t>doi</w:t>
-      </w:r>
-      <w:proofErr w:type="spellEnd"/>
-      <w:proofErr w:type="gramEnd"/>
-      <w:r>
-        <w:rPr>
-          <w:rFonts w:ascii="Times New Roman" w:hAnsi="Times New Roman" w:cs="Times New Roman"/>
-          <w:color w:val="002060"/>
-        </w:rPr>
-        <w:t>: 10.1136/bmjopen-2024-092536</w:t>
+        <w:t>Amin R, Akter T, Ferdous R, et al. Joint modelling of anthropometric child undernutrition indicators to identify their risk factors in Bangladesh: evidence from the Multiple Indicator Cluster Survey (MICS) 2019. BMJ Open. 2025;15:e092536. doi: 10.1136/bmjopen-2024-092536</w:t>
       </w:r>
     </w:p>
     <w:p>
@@ -42251,89 +38649,7 @@
           <w:color w:val="002060"/>
         </w:rPr>
         <w:tab/>
-        <w:t xml:space="preserve">Hossain </w:t>
-      </w:r>
-      <w:proofErr w:type="spellStart"/>
-      <w:r>
-        <w:rPr>
-          <w:rFonts w:ascii="Times New Roman" w:hAnsi="Times New Roman" w:cs="Times New Roman"/>
-          <w:color w:val="002060"/>
-        </w:rPr>
-        <w:t>MdM</w:t>
-      </w:r>
-      <w:proofErr w:type="spellEnd"/>
-      <w:r>
-        <w:rPr>
-          <w:rFonts w:ascii="Times New Roman" w:hAnsi="Times New Roman" w:cs="Times New Roman"/>
-          <w:color w:val="002060"/>
-        </w:rPr>
-        <w:t xml:space="preserve">, Abdulla F, Rahman A. Prevalence and determinants of wasting of under-5 children in Bangladesh: Quantile regression approach. </w:t>
-      </w:r>
-      <w:proofErr w:type="spellStart"/>
-      <w:r>
-        <w:rPr>
-          <w:rFonts w:ascii="Times New Roman" w:hAnsi="Times New Roman" w:cs="Times New Roman"/>
-          <w:color w:val="002060"/>
-        </w:rPr>
-        <w:t>PLoS</w:t>
-      </w:r>
-      <w:proofErr w:type="spellEnd"/>
-      <w:r>
-        <w:rPr>
-          <w:rFonts w:ascii="Times New Roman" w:hAnsi="Times New Roman" w:cs="Times New Roman"/>
-          <w:color w:val="002060"/>
-        </w:rPr>
-        <w:t xml:space="preserve"> </w:t>
-      </w:r>
-      <w:proofErr w:type="gramStart"/>
-      <w:r>
-        <w:rPr>
-          <w:rFonts w:ascii="Times New Roman" w:hAnsi="Times New Roman" w:cs="Times New Roman"/>
-          <w:color w:val="002060"/>
-        </w:rPr>
-        <w:t>ONE</w:t>
-      </w:r>
-      <w:proofErr w:type="gramEnd"/>
-      <w:r>
-        <w:rPr>
-          <w:rFonts w:ascii="Times New Roman" w:hAnsi="Times New Roman" w:cs="Times New Roman"/>
-          <w:color w:val="002060"/>
-        </w:rPr>
-        <w:t>. 2022</w:t>
-      </w:r>
-      <w:proofErr w:type="gramStart"/>
-      <w:r>
-        <w:rPr>
-          <w:rFonts w:ascii="Times New Roman" w:hAnsi="Times New Roman" w:cs="Times New Roman"/>
-          <w:color w:val="002060"/>
-        </w:rPr>
-        <w:t>;17:e0278097</w:t>
-      </w:r>
-      <w:proofErr w:type="gramEnd"/>
-      <w:r>
-        <w:rPr>
-          <w:rFonts w:ascii="Times New Roman" w:hAnsi="Times New Roman" w:cs="Times New Roman"/>
-          <w:color w:val="002060"/>
-        </w:rPr>
-        <w:t xml:space="preserve">. </w:t>
-      </w:r>
-      <w:proofErr w:type="spellStart"/>
-      <w:proofErr w:type="gramStart"/>
-      <w:r>
-        <w:rPr>
-          <w:rFonts w:ascii="Times New Roman" w:hAnsi="Times New Roman" w:cs="Times New Roman"/>
-          <w:color w:val="002060"/>
-        </w:rPr>
-        <w:t>doi</w:t>
-      </w:r>
-      <w:proofErr w:type="spellEnd"/>
-      <w:proofErr w:type="gramEnd"/>
-      <w:r>
-        <w:rPr>
-          <w:rFonts w:ascii="Times New Roman" w:hAnsi="Times New Roman" w:cs="Times New Roman"/>
-          <w:color w:val="002060"/>
-        </w:rPr>
-        <w:t>: 10.1371/journal.pone.0278097</w:t>
+        <w:t>Hossain MdM, Abdulla F, Rahman A. Prevalence and determinants of wasting of under-5 children in Bangladesh: Quantile regression approach. PLoS ONE. 2022;17:e0278097. doi: 10.1371/journal.pone.0278097</w:t>
       </w:r>
     </w:p>
     <w:p>
@@ -44082,6 +40398,7 @@
   <w:style w:type="character" w:default="1" w:styleId="DefaultParagraphFont">
     <w:name w:val="Default Paragraph Font"/>
     <w:uiPriority w:val="1"/>
+    <w:semiHidden/>
     <w:unhideWhenUsed/>
   </w:style>
   <w:style w:type="table" w:default="1" w:styleId="TableNormal">
@@ -44794,7 +41111,7 @@
 </file>
 
 <file path=customXml/itemProps1.xml><?xml version="1.0" encoding="utf-8"?>
-<ds:datastoreItem xmlns:ds="http://schemas.openxmlformats.org/officeDocument/2006/customXml" ds:itemID="{9A43BFB9-4BAB-472E-B3D6-11BF9BC85B52}">
+<ds:datastoreItem xmlns:ds="http://schemas.openxmlformats.org/officeDocument/2006/customXml" ds:itemID="{6CA4398C-1996-48E5-974D-90B1DD18F9CF}">
   <ds:schemaRefs>
     <ds:schemaRef ds:uri="http://schemas.openxmlformats.org/officeDocument/2006/bibliography"/>
   </ds:schemaRefs>

</xml_diff>